<commit_message>
add chapter 4 notes
</commit_message>
<xml_diff>
--- a/Book notes.docx
+++ b/Book notes.docx
@@ -161,27 +161,9 @@
       </w:r>
     </w:p>
     <w:p>
-      <w:proofErr w:type="spellStart"/>
-      <w:r>
-        <w:t>order_id</w:t>
-      </w:r>
-      <w:proofErr w:type="spellEnd"/>
-      <w:r>
-        <w:t xml:space="preserve"> | </w:t>
-      </w:r>
-      <w:proofErr w:type="spellStart"/>
-      <w:r>
-        <w:t>product_id</w:t>
-      </w:r>
-      <w:proofErr w:type="spellEnd"/>
-      <w:r>
-        <w:t xml:space="preserve"> | </w:t>
-      </w:r>
-      <w:proofErr w:type="spellStart"/>
-      <w:r>
-        <w:t>product_name</w:t>
-      </w:r>
-      <w:proofErr w:type="spellEnd"/>
+      <w:r>
+        <w:t>order_id | product_id | product_name</w:t>
+      </w:r>
     </w:p>
     <w:p>
       <w:pPr>
@@ -191,23 +173,7 @@
         </w:numPr>
       </w:pPr>
       <w:r>
-        <w:t>Primary key: (</w:t>
-      </w:r>
-      <w:proofErr w:type="spellStart"/>
-      <w:r>
-        <w:t>order_id</w:t>
-      </w:r>
-      <w:proofErr w:type="spellEnd"/>
-      <w:r>
-        <w:t xml:space="preserve">, </w:t>
-      </w:r>
-      <w:proofErr w:type="spellStart"/>
-      <w:r>
-        <w:t>product_id</w:t>
-      </w:r>
-      <w:proofErr w:type="spellEnd"/>
-      <w:r>
-        <w:t xml:space="preserve">) </w:t>
+        <w:t xml:space="preserve">Primary key: (order_id, product_id) </w:t>
       </w:r>
     </w:p>
     <w:p>
@@ -218,23 +184,7 @@
         </w:numPr>
       </w:pPr>
       <w:r>
-        <w:t xml:space="preserve">Problem: </w:t>
-      </w:r>
-      <w:proofErr w:type="spellStart"/>
-      <w:r>
-        <w:t>product_name</w:t>
-      </w:r>
-      <w:proofErr w:type="spellEnd"/>
-      <w:r>
-        <w:t xml:space="preserve"> depends only on </w:t>
-      </w:r>
-      <w:proofErr w:type="spellStart"/>
-      <w:r>
-        <w:t>product_id</w:t>
-      </w:r>
-      <w:proofErr w:type="spellEnd"/>
-      <w:r>
-        <w:t xml:space="preserve"> </w:t>
+        <w:t xml:space="preserve">Problem: product_name depends only on product_id </w:t>
       </w:r>
     </w:p>
     <w:p>
@@ -249,43 +199,11 @@
     </w:p>
     <w:p>
       <w:r>
-        <w:t>orders(</w:t>
-      </w:r>
-      <w:proofErr w:type="spellStart"/>
-      <w:r>
-        <w:t>order_id</w:t>
-      </w:r>
-      <w:proofErr w:type="spellEnd"/>
-      <w:r>
-        <w:t xml:space="preserve">, </w:t>
-      </w:r>
-      <w:proofErr w:type="spellStart"/>
-      <w:r>
-        <w:t>product_id</w:t>
-      </w:r>
-      <w:proofErr w:type="spellEnd"/>
-      <w:r>
-        <w:t>)</w:t>
+        <w:t>orders(order_id, product_id)</w:t>
       </w:r>
       <w:r>
         <w:br/>
-        <w:t>products(</w:t>
-      </w:r>
-      <w:proofErr w:type="spellStart"/>
-      <w:r>
-        <w:t>product_id</w:t>
-      </w:r>
-      <w:proofErr w:type="spellEnd"/>
-      <w:r>
-        <w:t xml:space="preserve">, </w:t>
-      </w:r>
-      <w:proofErr w:type="spellStart"/>
-      <w:r>
-        <w:t>product_name</w:t>
-      </w:r>
-      <w:proofErr w:type="spellEnd"/>
-      <w:r>
-        <w:t>)</w:t>
+        <w:t>products(product_id, product_name)</w:t>
       </w:r>
     </w:p>
     <w:p/>
@@ -352,27 +270,9 @@
       </w:r>
     </w:p>
     <w:p>
-      <w:proofErr w:type="spellStart"/>
-      <w:r>
-        <w:t>employee_id</w:t>
-      </w:r>
-      <w:proofErr w:type="spellEnd"/>
-      <w:r>
-        <w:t xml:space="preserve"> | </w:t>
-      </w:r>
-      <w:proofErr w:type="spellStart"/>
-      <w:r>
-        <w:t>department_id</w:t>
-      </w:r>
-      <w:proofErr w:type="spellEnd"/>
-      <w:r>
-        <w:t xml:space="preserve"> | </w:t>
-      </w:r>
-      <w:proofErr w:type="spellStart"/>
-      <w:r>
-        <w:t>department_name</w:t>
-      </w:r>
-      <w:proofErr w:type="spellEnd"/>
+      <w:r>
+        <w:t>employee_id | department_id | department_name</w:t>
+      </w:r>
     </w:p>
     <w:p>
       <w:pPr>
@@ -381,29 +281,8 @@
           <w:numId w:val="5"/>
         </w:numPr>
       </w:pPr>
-      <w:proofErr w:type="spellStart"/>
-      <w:r>
-        <w:t>department_name</w:t>
-      </w:r>
-      <w:proofErr w:type="spellEnd"/>
-      <w:r>
-        <w:t xml:space="preserve"> depends on </w:t>
-      </w:r>
-      <w:proofErr w:type="spellStart"/>
-      <w:r>
-        <w:t>department_id</w:t>
-      </w:r>
-      <w:proofErr w:type="spellEnd"/>
-      <w:r>
-        <w:t xml:space="preserve">, not </w:t>
-      </w:r>
-      <w:proofErr w:type="spellStart"/>
-      <w:r>
-        <w:t>employee_id</w:t>
-      </w:r>
-      <w:proofErr w:type="spellEnd"/>
-      <w:r>
-        <w:t xml:space="preserve"> </w:t>
+      <w:r>
+        <w:t xml:space="preserve">department_name depends on department_id, not employee_id </w:t>
       </w:r>
     </w:p>
     <w:p>
@@ -413,43 +292,11 @@
     </w:p>
     <w:p>
       <w:r>
-        <w:t>employees(</w:t>
-      </w:r>
-      <w:proofErr w:type="spellStart"/>
-      <w:r>
-        <w:t>employee_id</w:t>
-      </w:r>
-      <w:proofErr w:type="spellEnd"/>
-      <w:r>
-        <w:t xml:space="preserve">, </w:t>
-      </w:r>
-      <w:proofErr w:type="spellStart"/>
-      <w:r>
-        <w:t>department_id</w:t>
-      </w:r>
-      <w:proofErr w:type="spellEnd"/>
-      <w:r>
-        <w:t>)</w:t>
+        <w:t>employees(employee_id, department_id)</w:t>
       </w:r>
       <w:r>
         <w:br/>
-        <w:t>departments(</w:t>
-      </w:r>
-      <w:proofErr w:type="spellStart"/>
-      <w:r>
-        <w:t>department_id</w:t>
-      </w:r>
-      <w:proofErr w:type="spellEnd"/>
-      <w:r>
-        <w:t xml:space="preserve">, </w:t>
-      </w:r>
-      <w:proofErr w:type="spellStart"/>
-      <w:r>
-        <w:t>department_name</w:t>
-      </w:r>
-      <w:proofErr w:type="spellEnd"/>
-      <w:r>
-        <w:t>)</w:t>
+        <w:t>departments(department_id, department_name)</w:t>
       </w:r>
     </w:p>
     <w:p/>
@@ -468,63 +315,7 @@
         <w:rPr>
           <w:color w:val="4472C4" w:themeColor="accent1"/>
         </w:rPr>
-        <w:t>orders(</w:t>
-      </w:r>
-      <w:proofErr w:type="spellStart"/>
-      <w:r>
-        <w:rPr>
-          <w:color w:val="4472C4" w:themeColor="accent1"/>
-        </w:rPr>
-        <w:t>order_id</w:t>
-      </w:r>
-      <w:proofErr w:type="spellEnd"/>
-      <w:r>
-        <w:rPr>
-          <w:color w:val="4472C4" w:themeColor="accent1"/>
-        </w:rPr>
-        <w:t xml:space="preserve">, </w:t>
-      </w:r>
-      <w:proofErr w:type="spellStart"/>
-      <w:r>
-        <w:rPr>
-          <w:color w:val="4472C4" w:themeColor="accent1"/>
-        </w:rPr>
-        <w:t>customer_name</w:t>
-      </w:r>
-      <w:proofErr w:type="spellEnd"/>
-      <w:r>
-        <w:rPr>
-          <w:color w:val="4472C4" w:themeColor="accent1"/>
-        </w:rPr>
-        <w:t xml:space="preserve">, </w:t>
-      </w:r>
-      <w:proofErr w:type="spellStart"/>
-      <w:r>
-        <w:rPr>
-          <w:color w:val="4472C4" w:themeColor="accent1"/>
-        </w:rPr>
-        <w:t>customer_address</w:t>
-      </w:r>
-      <w:proofErr w:type="spellEnd"/>
-      <w:r>
-        <w:rPr>
-          <w:color w:val="4472C4" w:themeColor="accent1"/>
-        </w:rPr>
-        <w:t xml:space="preserve">, </w:t>
-      </w:r>
-      <w:proofErr w:type="spellStart"/>
-      <w:r>
-        <w:rPr>
-          <w:color w:val="4472C4" w:themeColor="accent1"/>
-        </w:rPr>
-        <w:t>product_name</w:t>
-      </w:r>
-      <w:proofErr w:type="spellEnd"/>
-      <w:r>
-        <w:rPr>
-          <w:color w:val="4472C4" w:themeColor="accent1"/>
-        </w:rPr>
-        <w:t>)</w:t>
+        <w:t>orders(order_id, customer_name, customer_address, product_name)</w:t>
       </w:r>
     </w:p>
     <w:p>
@@ -542,77 +333,21 @@
         <w:rPr>
           <w:color w:val="4472C4" w:themeColor="accent1"/>
         </w:rPr>
-        <w:t>orders(</w:t>
-      </w:r>
-      <w:proofErr w:type="spellStart"/>
-      <w:r>
-        <w:rPr>
-          <w:color w:val="4472C4" w:themeColor="accent1"/>
-        </w:rPr>
-        <w:t>order_id</w:t>
-      </w:r>
-      <w:proofErr w:type="spellEnd"/>
-      <w:r>
-        <w:rPr>
-          <w:color w:val="4472C4" w:themeColor="accent1"/>
-        </w:rPr>
-        <w:t xml:space="preserve">, </w:t>
-      </w:r>
-      <w:proofErr w:type="spellStart"/>
-      <w:r>
-        <w:rPr>
-          <w:color w:val="4472C4" w:themeColor="accent1"/>
-        </w:rPr>
-        <w:t>customer_id</w:t>
-      </w:r>
-      <w:proofErr w:type="spellEnd"/>
-      <w:r>
-        <w:rPr>
-          <w:color w:val="4472C4" w:themeColor="accent1"/>
-        </w:rPr>
-        <w:t>)</w:t>
+        <w:t>orders(order_id, customer_id)</w:t>
       </w:r>
       <w:r>
         <w:rPr>
           <w:color w:val="4472C4" w:themeColor="accent1"/>
         </w:rPr>
         <w:br/>
-        <w:t>customers(</w:t>
-      </w:r>
-      <w:proofErr w:type="spellStart"/>
-      <w:r>
-        <w:rPr>
-          <w:color w:val="4472C4" w:themeColor="accent1"/>
-        </w:rPr>
-        <w:t>customer_id</w:t>
-      </w:r>
-      <w:proofErr w:type="spellEnd"/>
-      <w:r>
-        <w:rPr>
-          <w:color w:val="4472C4" w:themeColor="accent1"/>
-        </w:rPr>
-        <w:t>, name, address)</w:t>
+        <w:t>customers(customer_id, name, address)</w:t>
       </w:r>
       <w:r>
         <w:rPr>
           <w:color w:val="4472C4" w:themeColor="accent1"/>
         </w:rPr>
         <w:br/>
-        <w:t>products(</w:t>
-      </w:r>
-      <w:proofErr w:type="spellStart"/>
-      <w:r>
-        <w:rPr>
-          <w:color w:val="4472C4" w:themeColor="accent1"/>
-        </w:rPr>
-        <w:t>product_id</w:t>
-      </w:r>
-      <w:proofErr w:type="spellEnd"/>
-      <w:r>
-        <w:rPr>
-          <w:color w:val="4472C4" w:themeColor="accent1"/>
-        </w:rPr>
-        <w:t>, name)</w:t>
+        <w:t>products(product_id, name)</w:t>
       </w:r>
     </w:p>
     <w:p>
@@ -879,28 +614,7 @@
           <w:szCs w:val="22"/>
         </w:rPr>
         <w:tab/>
-      </w:r>
-      <w:proofErr w:type="spellStart"/>
-      <w:r>
-        <w:rPr>
-          <w:b/>
-          <w:bCs/>
-          <w:color w:val="000000" w:themeColor="text1"/>
-          <w:sz w:val="22"/>
-          <w:szCs w:val="22"/>
-        </w:rPr>
-        <w:t>Varchate</w:t>
-      </w:r>
-      <w:proofErr w:type="spellEnd"/>
-      <w:r>
-        <w:rPr>
-          <w:b/>
-          <w:bCs/>
-          <w:color w:val="000000" w:themeColor="text1"/>
-          <w:sz w:val="22"/>
-          <w:szCs w:val="22"/>
-        </w:rPr>
-        <w:t>(20) variable but maximum of 20</w:t>
+        <w:t>Varchate(20) variable but maximum of 20</w:t>
       </w:r>
     </w:p>
     <w:p>
@@ -1109,25 +823,7 @@
           <w:color w:val="EE0000"/>
         </w:rPr>
         <w:lastRenderedPageBreak/>
-        <w:t xml:space="preserve">In case we need to store text data that is more than 65,535 </w:t>
-      </w:r>
-      <w:proofErr w:type="spellStart"/>
-      <w:r>
-        <w:rPr>
-          <w:b/>
-          <w:bCs/>
-          <w:color w:val="EE0000"/>
-        </w:rPr>
-        <w:t>databytes</w:t>
-      </w:r>
-      <w:proofErr w:type="spellEnd"/>
-      <w:r>
-        <w:rPr>
-          <w:b/>
-          <w:bCs/>
-          <w:color w:val="EE0000"/>
-        </w:rPr>
-        <w:t xml:space="preserve"> then we need to use a new data type called text</w:t>
+        <w:t>In case we need to store text data that is more than 65,535 databytes then we need to use a new data type called text</w:t>
       </w:r>
     </w:p>
     <w:p>
@@ -1189,23 +885,13 @@
           <w:szCs w:val="22"/>
         </w:rPr>
       </w:pPr>
-      <w:proofErr w:type="spellStart"/>
-      <w:r>
-        <w:rPr>
-          <w:color w:val="000000" w:themeColor="text1"/>
-          <w:sz w:val="22"/>
-          <w:szCs w:val="22"/>
-        </w:rPr>
-        <w:t>tinytext</w:t>
-      </w:r>
-      <w:proofErr w:type="spellEnd"/>
-      <w:r>
-        <w:rPr>
-          <w:color w:val="000000" w:themeColor="text1"/>
-          <w:sz w:val="22"/>
-          <w:szCs w:val="22"/>
-        </w:rPr>
-        <w:t xml:space="preserve"> 255 </w:t>
+      <w:r>
+        <w:rPr>
+          <w:color w:val="000000" w:themeColor="text1"/>
+          <w:sz w:val="22"/>
+          <w:szCs w:val="22"/>
+        </w:rPr>
+        <w:t xml:space="preserve">tinytext 255 </w:t>
       </w:r>
     </w:p>
     <w:p>
@@ -1235,23 +921,13 @@
           <w:szCs w:val="22"/>
         </w:rPr>
       </w:pPr>
-      <w:proofErr w:type="spellStart"/>
-      <w:r>
-        <w:rPr>
-          <w:color w:val="000000" w:themeColor="text1"/>
-          <w:sz w:val="22"/>
-          <w:szCs w:val="22"/>
-        </w:rPr>
-        <w:t>mediumtext</w:t>
-      </w:r>
-      <w:proofErr w:type="spellEnd"/>
-      <w:r>
-        <w:rPr>
-          <w:color w:val="000000" w:themeColor="text1"/>
-          <w:sz w:val="22"/>
-          <w:szCs w:val="22"/>
-        </w:rPr>
-        <w:t xml:space="preserve"> 4,294,967,295</w:t>
+      <w:r>
+        <w:rPr>
+          <w:color w:val="000000" w:themeColor="text1"/>
+          <w:sz w:val="22"/>
+          <w:szCs w:val="22"/>
+        </w:rPr>
+        <w:t>mediumtext 4,294,967,295</w:t>
       </w:r>
     </w:p>
     <w:p>
@@ -1263,23 +939,13 @@
           <w:szCs w:val="22"/>
         </w:rPr>
       </w:pPr>
-      <w:proofErr w:type="spellStart"/>
-      <w:r>
-        <w:rPr>
-          <w:color w:val="000000" w:themeColor="text1"/>
-          <w:sz w:val="22"/>
-          <w:szCs w:val="22"/>
-        </w:rPr>
-        <w:t>longtext</w:t>
-      </w:r>
-      <w:proofErr w:type="spellEnd"/>
-      <w:r>
-        <w:rPr>
-          <w:color w:val="000000" w:themeColor="text1"/>
-          <w:sz w:val="22"/>
-          <w:szCs w:val="22"/>
-        </w:rPr>
-        <w:t xml:space="preserve"> 16,777,215 </w:t>
+      <w:r>
+        <w:rPr>
+          <w:color w:val="000000" w:themeColor="text1"/>
+          <w:sz w:val="22"/>
+          <w:szCs w:val="22"/>
+        </w:rPr>
+        <w:t xml:space="preserve">longtext 16,777,215 </w:t>
       </w:r>
     </w:p>
     <w:p>
@@ -1323,10 +989,12 @@
           <w:sz w:val="22"/>
           <w:szCs w:val="22"/>
         </w:rPr>
-        <w:t xml:space="preserve">If you are storing documents, however, you should choose either the </w:t>
-      </w:r>
-      <w:proofErr w:type="spellStart"/>
-      <w:r>
+        <w:t>If you are storing documents, however, you should choose either the mediumtext or longtext type</w:t>
+      </w:r>
+    </w:p>
+    <w:p>
+      <w:pPr>
+        <w:ind w:left="1440"/>
         <w:rPr>
           <w:b/>
           <w:bCs/>
@@ -1334,40 +1002,26 @@
           <w:sz w:val="22"/>
           <w:szCs w:val="22"/>
         </w:rPr>
-        <w:t>mediumtext</w:t>
-      </w:r>
-      <w:proofErr w:type="spellEnd"/>
-      <w:r>
-        <w:rPr>
-          <w:b/>
-          <w:bCs/>
-          <w:color w:val="EE0000"/>
-          <w:sz w:val="22"/>
-          <w:szCs w:val="22"/>
-        </w:rPr>
-        <w:t xml:space="preserve"> or </w:t>
-      </w:r>
-      <w:proofErr w:type="spellStart"/>
-      <w:r>
-        <w:rPr>
-          <w:b/>
-          <w:bCs/>
-          <w:color w:val="EE0000"/>
-          <w:sz w:val="22"/>
-          <w:szCs w:val="22"/>
-        </w:rPr>
-        <w:t>longtext</w:t>
-      </w:r>
-      <w:proofErr w:type="spellEnd"/>
-      <w:r>
-        <w:rPr>
-          <w:b/>
-          <w:bCs/>
-          <w:color w:val="EE0000"/>
-          <w:sz w:val="22"/>
-          <w:szCs w:val="22"/>
-        </w:rPr>
-        <w:t xml:space="preserve"> type</w:t>
+      </w:pPr>
+    </w:p>
+    <w:p>
+      <w:pPr>
+        <w:ind w:firstLine="720"/>
+        <w:rPr>
+          <w:b/>
+          <w:bCs/>
+          <w:color w:val="000000" w:themeColor="text1"/>
+          <w:u w:val="single"/>
+        </w:rPr>
+      </w:pPr>
+      <w:r>
+        <w:rPr>
+          <w:b/>
+          <w:bCs/>
+          <w:color w:val="000000" w:themeColor="text1"/>
+          <w:u w:val="single"/>
+        </w:rPr>
+        <w:t>Numeric data:</w:t>
       </w:r>
     </w:p>
     <w:p>
@@ -1376,80 +1030,48 @@
         <w:rPr>
           <w:b/>
           <w:bCs/>
-          <w:color w:val="EE0000"/>
-          <w:sz w:val="22"/>
-          <w:szCs w:val="22"/>
-        </w:rPr>
-      </w:pPr>
-    </w:p>
-    <w:p>
-      <w:pPr>
-        <w:ind w:firstLine="720"/>
-        <w:rPr>
-          <w:b/>
-          <w:bCs/>
-          <w:color w:val="000000" w:themeColor="text1"/>
-          <w:u w:val="single"/>
-        </w:rPr>
-      </w:pPr>
-      <w:r>
-        <w:rPr>
-          <w:b/>
-          <w:bCs/>
-          <w:color w:val="000000" w:themeColor="text1"/>
-          <w:u w:val="single"/>
-        </w:rPr>
-        <w:t>Numeric data:</w:t>
+          <w:color w:val="000000" w:themeColor="text1"/>
+          <w:sz w:val="22"/>
+          <w:szCs w:val="22"/>
+        </w:rPr>
+      </w:pPr>
+      <w:r>
+        <w:rPr>
+          <w:b/>
+          <w:bCs/>
+          <w:color w:val="000000" w:themeColor="text1"/>
+          <w:sz w:val="22"/>
+          <w:szCs w:val="22"/>
+        </w:rPr>
+        <w:t xml:space="preserve">Keep in mind that unsigned data types or variables can store twice as the signed, as per value. but we have to declare this when we declare a column name </w:t>
+      </w:r>
+    </w:p>
+    <w:p>
+      <w:pPr>
+        <w:ind w:left="720" w:firstLine="720"/>
+        <w:rPr>
+          <w:b/>
+          <w:bCs/>
+          <w:color w:val="4472C4" w:themeColor="accent1"/>
+          <w:sz w:val="22"/>
+          <w:szCs w:val="22"/>
+        </w:rPr>
+      </w:pPr>
+      <w:r>
+        <w:rPr>
+          <w:b/>
+          <w:bCs/>
+          <w:color w:val="4472C4" w:themeColor="accent1"/>
+          <w:sz w:val="22"/>
+          <w:szCs w:val="22"/>
+        </w:rPr>
+        <w:t>INT UNSIGNED age;</w:t>
       </w:r>
     </w:p>
     <w:p>
       <w:pPr>
         <w:ind w:left="1440"/>
         <w:rPr>
-          <w:b/>
-          <w:bCs/>
-          <w:color w:val="000000" w:themeColor="text1"/>
-          <w:sz w:val="22"/>
-          <w:szCs w:val="22"/>
-        </w:rPr>
-      </w:pPr>
-      <w:r>
-        <w:rPr>
-          <w:b/>
-          <w:bCs/>
-          <w:color w:val="000000" w:themeColor="text1"/>
-          <w:sz w:val="22"/>
-          <w:szCs w:val="22"/>
-        </w:rPr>
-        <w:t xml:space="preserve">Keep in mind that unsigned data types or variables can store twice as the signed, as per value. but we have to declare this when we declare a column name </w:t>
-      </w:r>
-    </w:p>
-    <w:p>
-      <w:pPr>
-        <w:ind w:left="720" w:firstLine="720"/>
-        <w:rPr>
-          <w:b/>
-          <w:bCs/>
-          <w:color w:val="4472C4" w:themeColor="accent1"/>
-          <w:sz w:val="22"/>
-          <w:szCs w:val="22"/>
-        </w:rPr>
-      </w:pPr>
-      <w:r>
-        <w:rPr>
-          <w:b/>
-          <w:bCs/>
-          <w:color w:val="4472C4" w:themeColor="accent1"/>
-          <w:sz w:val="22"/>
-          <w:szCs w:val="22"/>
-        </w:rPr>
-        <w:t>INT UNSIGNED age;</w:t>
-      </w:r>
-    </w:p>
-    <w:p>
-      <w:pPr>
-        <w:ind w:left="1440"/>
-        <w:rPr>
           <w:color w:val="000000" w:themeColor="text1"/>
           <w:sz w:val="22"/>
           <w:szCs w:val="22"/>
@@ -1471,25 +1093,7 @@
           <w:sz w:val="22"/>
           <w:szCs w:val="22"/>
         </w:rPr>
-        <w:t>float(</w:t>
-      </w:r>
-      <w:proofErr w:type="spellStart"/>
-      <w:r>
-        <w:rPr>
-          <w:color w:val="000000" w:themeColor="text1"/>
-          <w:sz w:val="22"/>
-          <w:szCs w:val="22"/>
-        </w:rPr>
-        <w:t>p,n</w:t>
-      </w:r>
-      <w:proofErr w:type="spellEnd"/>
-      <w:r>
-        <w:rPr>
-          <w:color w:val="000000" w:themeColor="text1"/>
-          <w:sz w:val="22"/>
-          <w:szCs w:val="22"/>
-        </w:rPr>
-        <w:t>) p is how many numbers are allowed to both the left and the right of the decimal point, n is how many of those is allocated for the right.</w:t>
+        <w:t>float(p,n) p is how many numbers are allowed to both the left and the right of the decimal point, n is how many of those is allocated for the right.</w:t>
       </w:r>
     </w:p>
     <w:p>
@@ -1716,25 +1320,7 @@
           <w:sz w:val="22"/>
           <w:szCs w:val="22"/>
         </w:rPr>
-        <w:t xml:space="preserve"> temporal datatype since its not important to know to the second when the shipment will arrive and unrealistic to </w:t>
-      </w:r>
-      <w:proofErr w:type="spellStart"/>
-      <w:r>
-        <w:rPr>
-          <w:color w:val="000000" w:themeColor="text1"/>
-          <w:sz w:val="22"/>
-          <w:szCs w:val="22"/>
-        </w:rPr>
-        <w:t>stored</w:t>
-      </w:r>
-      <w:proofErr w:type="spellEnd"/>
-      <w:r>
-        <w:rPr>
-          <w:color w:val="000000" w:themeColor="text1"/>
-          <w:sz w:val="22"/>
-          <w:szCs w:val="22"/>
-        </w:rPr>
-        <w:t xml:space="preserve"> the birth second of someone.</w:t>
+        <w:t xml:space="preserve"> temporal datatype since its not important to know to the second when the shipment will arrive and unrealistic to stored the birth second of someone.</w:t>
       </w:r>
     </w:p>
     <w:p>
@@ -1941,23 +1527,13 @@
           <w:szCs w:val="22"/>
         </w:rPr>
       </w:pPr>
-      <w:proofErr w:type="spellStart"/>
-      <w:r>
-        <w:rPr>
-          <w:b/>
-          <w:bCs/>
-          <w:color w:val="4472C4" w:themeColor="accent1"/>
-        </w:rPr>
-        <w:t>eye_color</w:t>
-      </w:r>
-      <w:proofErr w:type="spellEnd"/>
-      <w:r>
-        <w:rPr>
-          <w:b/>
-          <w:bCs/>
-          <w:color w:val="4472C4" w:themeColor="accent1"/>
-        </w:rPr>
-        <w:t xml:space="preserve"> ENUM('BR','BL','GR')</w:t>
+      <w:r>
+        <w:rPr>
+          <w:b/>
+          <w:bCs/>
+          <w:color w:val="4472C4" w:themeColor="accent1"/>
+        </w:rPr>
+        <w:t>eye_color ENUM('BR','BL','GR')</w:t>
       </w:r>
       <w:r>
         <w:rPr>
@@ -1989,43 +1565,7 @@
           <w:sz w:val="22"/>
           <w:szCs w:val="22"/>
         </w:rPr>
-        <w:t xml:space="preserve">the idea of </w:t>
-      </w:r>
-      <w:proofErr w:type="spellStart"/>
-      <w:r>
-        <w:rPr>
-          <w:color w:val="000000" w:themeColor="text1"/>
-          <w:sz w:val="22"/>
-          <w:szCs w:val="22"/>
-        </w:rPr>
-        <w:t>enums</w:t>
-      </w:r>
-      <w:proofErr w:type="spellEnd"/>
-      <w:r>
-        <w:rPr>
-          <w:color w:val="000000" w:themeColor="text1"/>
-          <w:sz w:val="22"/>
-          <w:szCs w:val="22"/>
-        </w:rPr>
-        <w:t xml:space="preserve"> works the same as in java. The user cannot input a value into the </w:t>
-      </w:r>
-      <w:proofErr w:type="spellStart"/>
-      <w:r>
-        <w:rPr>
-          <w:color w:val="000000" w:themeColor="text1"/>
-          <w:sz w:val="22"/>
-          <w:szCs w:val="22"/>
-        </w:rPr>
-        <w:t>eye_color</w:t>
-      </w:r>
-      <w:proofErr w:type="spellEnd"/>
-      <w:r>
-        <w:rPr>
-          <w:color w:val="000000" w:themeColor="text1"/>
-          <w:sz w:val="22"/>
-          <w:szCs w:val="22"/>
-        </w:rPr>
-        <w:t xml:space="preserve"> that we did not define in our ENUM</w:t>
+        <w:t>the idea of enums works the same as in java. The user cannot input a value into the eye_color that we did not define in our ENUM</w:t>
       </w:r>
     </w:p>
     <w:p>
@@ -2053,99 +1593,45 @@
           <w:color w:val="4472C4" w:themeColor="accent1"/>
         </w:rPr>
       </w:pPr>
-      <w:proofErr w:type="spellStart"/>
-      <w:r>
-        <w:rPr>
-          <w:b/>
-          <w:bCs/>
-          <w:color w:val="4472C4" w:themeColor="accent1"/>
-        </w:rPr>
-        <w:t>eye_color</w:t>
-      </w:r>
-      <w:proofErr w:type="spellEnd"/>
-      <w:r>
-        <w:rPr>
-          <w:b/>
-          <w:bCs/>
-          <w:color w:val="4472C4" w:themeColor="accent1"/>
-        </w:rPr>
-        <w:t xml:space="preserve"> varchar(3) NOT NULL;</w:t>
-      </w:r>
-    </w:p>
-    <w:p>
-      <w:pPr>
-        <w:rPr>
-          <w:b/>
-          <w:bCs/>
-          <w:color w:val="000000" w:themeColor="text1"/>
-          <w:sz w:val="22"/>
-          <w:szCs w:val="22"/>
-        </w:rPr>
-      </w:pPr>
-    </w:p>
-    <w:p>
-      <w:pPr>
-        <w:rPr>
-          <w:b/>
-          <w:bCs/>
-          <w:color w:val="000000" w:themeColor="text1"/>
-          <w:sz w:val="22"/>
-          <w:szCs w:val="22"/>
-        </w:rPr>
-      </w:pPr>
-      <w:r>
-        <w:rPr>
-          <w:b/>
-          <w:bCs/>
-          <w:color w:val="000000" w:themeColor="text1"/>
-          <w:sz w:val="22"/>
-          <w:szCs w:val="22"/>
-        </w:rPr>
-        <w:t xml:space="preserve">a composite primary (primary key that is a combination of 2 or more primary keys) key allows the identification of a row using 2 column values for instance </w:t>
-      </w:r>
-      <w:proofErr w:type="spellStart"/>
-      <w:r>
-        <w:rPr>
-          <w:b/>
-          <w:bCs/>
-          <w:color w:val="000000" w:themeColor="text1"/>
-          <w:sz w:val="22"/>
-          <w:szCs w:val="22"/>
-        </w:rPr>
-        <w:t>person_id</w:t>
-      </w:r>
-      <w:proofErr w:type="spellEnd"/>
-      <w:r>
-        <w:rPr>
-          <w:b/>
-          <w:bCs/>
-          <w:color w:val="000000" w:themeColor="text1"/>
-          <w:sz w:val="22"/>
-          <w:szCs w:val="22"/>
-        </w:rPr>
-        <w:t xml:space="preserve"> and </w:t>
-      </w:r>
-      <w:proofErr w:type="spellStart"/>
-      <w:r>
-        <w:rPr>
-          <w:b/>
-          <w:bCs/>
-          <w:color w:val="000000" w:themeColor="text1"/>
-          <w:sz w:val="22"/>
-          <w:szCs w:val="22"/>
-        </w:rPr>
-        <w:t>fav_food</w:t>
-      </w:r>
-      <w:proofErr w:type="spellEnd"/>
-      <w:r>
-        <w:rPr>
-          <w:b/>
-          <w:bCs/>
-          <w:color w:val="000000" w:themeColor="text1"/>
-          <w:sz w:val="22"/>
-          <w:szCs w:val="22"/>
-        </w:rPr>
-        <w:t xml:space="preserve">. This </w:t>
+      <w:r>
+        <w:rPr>
+          <w:b/>
+          <w:bCs/>
+          <w:color w:val="4472C4" w:themeColor="accent1"/>
+        </w:rPr>
+        <w:t>eye_color varchar(3) NOT NULL;</w:t>
+      </w:r>
+    </w:p>
+    <w:p>
+      <w:pPr>
+        <w:rPr>
+          <w:b/>
+          <w:bCs/>
+          <w:color w:val="000000" w:themeColor="text1"/>
+          <w:sz w:val="22"/>
+          <w:szCs w:val="22"/>
+        </w:rPr>
+      </w:pPr>
+    </w:p>
+    <w:p>
+      <w:pPr>
+        <w:rPr>
+          <w:b/>
+          <w:bCs/>
+          <w:color w:val="000000" w:themeColor="text1"/>
+          <w:sz w:val="22"/>
+          <w:szCs w:val="22"/>
+        </w:rPr>
+      </w:pPr>
+      <w:r>
+        <w:rPr>
+          <w:b/>
+          <w:bCs/>
+          <w:color w:val="000000" w:themeColor="text1"/>
+          <w:sz w:val="22"/>
+          <w:szCs w:val="22"/>
+        </w:rPr>
+        <w:t xml:space="preserve">a composite primary (primary key that is a combination of 2 or more primary keys) key allows the identification of a row using 2 column values for instance person_id and fav_food. This </w:t>
       </w:r>
       <w:r>
         <w:rPr>
@@ -2156,29 +1642,7 @@
           <w:szCs w:val="22"/>
         </w:rPr>
         <w:lastRenderedPageBreak/>
-        <w:t xml:space="preserve">means that </w:t>
-      </w:r>
-      <w:proofErr w:type="spellStart"/>
-      <w:r>
-        <w:rPr>
-          <w:b/>
-          <w:bCs/>
-          <w:color w:val="000000" w:themeColor="text1"/>
-          <w:sz w:val="22"/>
-          <w:szCs w:val="22"/>
-        </w:rPr>
-        <w:t>person_id</w:t>
-      </w:r>
-      <w:proofErr w:type="spellEnd"/>
-      <w:r>
-        <w:rPr>
-          <w:b/>
-          <w:bCs/>
-          <w:color w:val="000000" w:themeColor="text1"/>
-          <w:sz w:val="22"/>
-          <w:szCs w:val="22"/>
-        </w:rPr>
-        <w:t xml:space="preserve"> of 1 can appear 2,3 times but only allowed when used with different food.</w:t>
+        <w:t>means that person_id of 1 can appear 2,3 times but only allowed when used with different food.</w:t>
       </w:r>
     </w:p>
     <w:p>
@@ -2412,95 +1876,41 @@
           <w:bCs/>
           <w:color w:val="4472C4" w:themeColor="accent1"/>
         </w:rPr>
-        <w:t>SET street = '</w:t>
-      </w:r>
-      <w:proofErr w:type="spellStart"/>
-      <w:r>
-        <w:rPr>
-          <w:b/>
-          <w:bCs/>
-          <w:color w:val="4472C4" w:themeColor="accent1"/>
-        </w:rPr>
-        <w:t>Lorscher</w:t>
-      </w:r>
-      <w:proofErr w:type="spellEnd"/>
-      <w:r>
-        <w:rPr>
-          <w:b/>
-          <w:bCs/>
-          <w:color w:val="4472C4" w:themeColor="accent1"/>
-        </w:rPr>
-        <w:t xml:space="preserve"> st',</w:t>
-      </w:r>
-    </w:p>
-    <w:p>
-      <w:pPr>
-        <w:rPr>
-          <w:b/>
-          <w:bCs/>
-          <w:color w:val="4472C4" w:themeColor="accent1"/>
-        </w:rPr>
-      </w:pPr>
-      <w:r>
-        <w:rPr>
-          <w:b/>
-          <w:bCs/>
-          <w:color w:val="4472C4" w:themeColor="accent1"/>
-        </w:rPr>
-        <w:t>    city = '</w:t>
-      </w:r>
-      <w:proofErr w:type="spellStart"/>
-      <w:r>
-        <w:rPr>
-          <w:b/>
-          <w:bCs/>
-          <w:color w:val="4472C4" w:themeColor="accent1"/>
-        </w:rPr>
-        <w:t>ffm</w:t>
-      </w:r>
-      <w:proofErr w:type="spellEnd"/>
-      <w:r>
-        <w:rPr>
-          <w:b/>
-          <w:bCs/>
-          <w:color w:val="4472C4" w:themeColor="accent1"/>
-        </w:rPr>
-        <w:t>',</w:t>
-      </w:r>
-    </w:p>
-    <w:p>
-      <w:pPr>
-        <w:rPr>
-          <w:b/>
-          <w:bCs/>
-          <w:color w:val="4472C4" w:themeColor="accent1"/>
-        </w:rPr>
-      </w:pPr>
-      <w:r>
-        <w:rPr>
-          <w:b/>
-          <w:bCs/>
-          <w:color w:val="4472C4" w:themeColor="accent1"/>
-        </w:rPr>
-        <w:t>    state = '</w:t>
-      </w:r>
-      <w:proofErr w:type="spellStart"/>
-      <w:r>
-        <w:rPr>
-          <w:b/>
-          <w:bCs/>
-          <w:color w:val="4472C4" w:themeColor="accent1"/>
-        </w:rPr>
-        <w:t>hesse</w:t>
-      </w:r>
-      <w:proofErr w:type="spellEnd"/>
-      <w:r>
-        <w:rPr>
-          <w:b/>
-          <w:bCs/>
-          <w:color w:val="4472C4" w:themeColor="accent1"/>
-        </w:rPr>
-        <w:t>',</w:t>
+        <w:t>SET street = 'Lorscher st',</w:t>
+      </w:r>
+    </w:p>
+    <w:p>
+      <w:pPr>
+        <w:rPr>
+          <w:b/>
+          <w:bCs/>
+          <w:color w:val="4472C4" w:themeColor="accent1"/>
+        </w:rPr>
+      </w:pPr>
+      <w:r>
+        <w:rPr>
+          <w:b/>
+          <w:bCs/>
+          <w:color w:val="4472C4" w:themeColor="accent1"/>
+        </w:rPr>
+        <w:t>    city = 'ffm',</w:t>
+      </w:r>
+    </w:p>
+    <w:p>
+      <w:pPr>
+        <w:rPr>
+          <w:b/>
+          <w:bCs/>
+          <w:color w:val="4472C4" w:themeColor="accent1"/>
+        </w:rPr>
+      </w:pPr>
+      <w:r>
+        <w:rPr>
+          <w:b/>
+          <w:bCs/>
+          <w:color w:val="4472C4" w:themeColor="accent1"/>
+        </w:rPr>
+        <w:t>    state = 'hesse',</w:t>
       </w:r>
     </w:p>
     <w:p>
@@ -2534,60 +1944,24 @@
           <w:bCs/>
           <w:color w:val="4472C4" w:themeColor="accent1"/>
         </w:rPr>
-        <w:t xml:space="preserve">    </w:t>
-      </w:r>
-      <w:proofErr w:type="spellStart"/>
-      <w:r>
-        <w:rPr>
-          <w:b/>
-          <w:bCs/>
-          <w:color w:val="4472C4" w:themeColor="accent1"/>
-        </w:rPr>
-        <w:t>postal_code</w:t>
-      </w:r>
-      <w:proofErr w:type="spellEnd"/>
-      <w:r>
-        <w:rPr>
-          <w:b/>
-          <w:bCs/>
-          <w:color w:val="4472C4" w:themeColor="accent1"/>
-        </w:rPr>
-        <w:t xml:space="preserve"> = 60489,</w:t>
-      </w:r>
-    </w:p>
-    <w:p>
-      <w:pPr>
-        <w:rPr>
-          <w:b/>
-          <w:bCs/>
-          <w:color w:val="4472C4" w:themeColor="accent1"/>
-        </w:rPr>
-      </w:pPr>
-      <w:r>
-        <w:rPr>
-          <w:b/>
-          <w:bCs/>
-          <w:color w:val="4472C4" w:themeColor="accent1"/>
-        </w:rPr>
-        <w:t xml:space="preserve">    </w:t>
-      </w:r>
-      <w:proofErr w:type="spellStart"/>
-      <w:r>
-        <w:rPr>
-          <w:b/>
-          <w:bCs/>
-          <w:color w:val="4472C4" w:themeColor="accent1"/>
-        </w:rPr>
-        <w:t>birth_date</w:t>
-      </w:r>
-      <w:proofErr w:type="spellEnd"/>
-      <w:r>
-        <w:rPr>
-          <w:b/>
-          <w:bCs/>
-          <w:color w:val="4472C4" w:themeColor="accent1"/>
-        </w:rPr>
-        <w:t xml:space="preserve"> = '2002-05-22'</w:t>
+        <w:t>    postal_code = 60489,</w:t>
+      </w:r>
+    </w:p>
+    <w:p>
+      <w:pPr>
+        <w:rPr>
+          <w:b/>
+          <w:bCs/>
+          <w:color w:val="4472C4" w:themeColor="accent1"/>
+        </w:rPr>
+      </w:pPr>
+      <w:r>
+        <w:rPr>
+          <w:b/>
+          <w:bCs/>
+          <w:color w:val="4472C4" w:themeColor="accent1"/>
+        </w:rPr>
+        <w:t>    birth_date = '2002-05-22'</w:t>
       </w:r>
     </w:p>
     <w:p>
@@ -2856,25 +2230,7 @@
           <w:sz w:val="22"/>
           <w:szCs w:val="22"/>
         </w:rPr>
-        <w:t xml:space="preserve">If we insert into the </w:t>
-      </w:r>
-      <w:proofErr w:type="spellStart"/>
-      <w:r>
-        <w:rPr>
-          <w:color w:val="000000" w:themeColor="text1"/>
-          <w:sz w:val="22"/>
-          <w:szCs w:val="22"/>
-        </w:rPr>
-        <w:t>person_id</w:t>
-      </w:r>
-      <w:proofErr w:type="spellEnd"/>
-      <w:r>
-        <w:rPr>
-          <w:color w:val="000000" w:themeColor="text1"/>
-          <w:sz w:val="22"/>
-          <w:szCs w:val="22"/>
-        </w:rPr>
-        <w:t xml:space="preserve"> the value 100, but int the person.id we don’t have 100 then we get a violation</w:t>
+        <w:t>If we insert into the person_id the value 100, but int the person.id we don’t have 100 then we get a violation</w:t>
       </w:r>
     </w:p>
     <w:p>
@@ -2941,10 +2297,11 @@
           <w:sz w:val="22"/>
           <w:szCs w:val="22"/>
         </w:rPr>
-        <w:t>SELECT DATE_FORMAT(</w:t>
-      </w:r>
-      <w:proofErr w:type="spellStart"/>
-      <w:r>
+        <w:t>SELECT DATE_FORMAT(event_time, '%W, %M %d %Y %h:%i:%s %p')</w:t>
+      </w:r>
+    </w:p>
+    <w:p>
+      <w:pPr>
         <w:rPr>
           <w:b/>
           <w:bCs/>
@@ -2954,9 +2311,7 @@
           <w:sz w:val="22"/>
           <w:szCs w:val="22"/>
         </w:rPr>
-        <w:t>event_time</w:t>
-      </w:r>
-      <w:proofErr w:type="spellEnd"/>
+      </w:pPr>
       <w:r>
         <w:rPr>
           <w:b/>
@@ -2967,57 +2322,6 @@
           <w:sz w:val="22"/>
           <w:szCs w:val="22"/>
         </w:rPr>
-        <w:t>, '%W, %M %d %Y %h:%</w:t>
-      </w:r>
-      <w:proofErr w:type="spellStart"/>
-      <w:r>
-        <w:rPr>
-          <w:b/>
-          <w:bCs/>
-          <w:i/>
-          <w:iCs/>
-          <w:color w:val="4472C4" w:themeColor="accent1"/>
-          <w:sz w:val="22"/>
-          <w:szCs w:val="22"/>
-        </w:rPr>
-        <w:t>i</w:t>
-      </w:r>
-      <w:proofErr w:type="spellEnd"/>
-      <w:r>
-        <w:rPr>
-          <w:b/>
-          <w:bCs/>
-          <w:i/>
-          <w:iCs/>
-          <w:color w:val="4472C4" w:themeColor="accent1"/>
-          <w:sz w:val="22"/>
-          <w:szCs w:val="22"/>
-        </w:rPr>
-        <w:t>:%s %p')</w:t>
-      </w:r>
-    </w:p>
-    <w:p>
-      <w:pPr>
-        <w:rPr>
-          <w:b/>
-          <w:bCs/>
-          <w:i/>
-          <w:iCs/>
-          <w:color w:val="4472C4" w:themeColor="accent1"/>
-          <w:sz w:val="22"/>
-          <w:szCs w:val="22"/>
-        </w:rPr>
-      </w:pPr>
-      <w:r>
-        <w:rPr>
-          <w:b/>
-          <w:bCs/>
-          <w:i/>
-          <w:iCs/>
-          <w:color w:val="4472C4" w:themeColor="accent1"/>
-          <w:sz w:val="22"/>
-          <w:szCs w:val="22"/>
-        </w:rPr>
         <w:t>FROM events;</w:t>
       </w:r>
     </w:p>
@@ -3035,25 +2339,7 @@
           <w:sz w:val="22"/>
           <w:szCs w:val="22"/>
         </w:rPr>
-        <w:t>%</w:t>
-      </w:r>
-      <w:proofErr w:type="spellStart"/>
-      <w:r>
-        <w:rPr>
-          <w:color w:val="000000" w:themeColor="text1"/>
-          <w:sz w:val="22"/>
-          <w:szCs w:val="22"/>
-        </w:rPr>
-        <w:t>a</w:t>
-      </w:r>
-      <w:proofErr w:type="spellEnd"/>
-      <w:r>
-        <w:rPr>
-          <w:color w:val="000000" w:themeColor="text1"/>
-          <w:sz w:val="22"/>
-          <w:szCs w:val="22"/>
-        </w:rPr>
-        <w:t xml:space="preserve"> The short weekday name, such as Sun, Mon, </w:t>
+        <w:t xml:space="preserve">%a The short weekday name, such as Sun, Mon, </w:t>
       </w:r>
     </w:p>
     <w:p>
@@ -3121,25 +2407,7 @@
           <w:sz w:val="22"/>
           <w:szCs w:val="22"/>
         </w:rPr>
-        <w:t>%</w:t>
-      </w:r>
-      <w:proofErr w:type="spellStart"/>
-      <w:r>
-        <w:rPr>
-          <w:color w:val="000000" w:themeColor="text1"/>
-          <w:sz w:val="22"/>
-          <w:szCs w:val="22"/>
-        </w:rPr>
-        <w:t>f</w:t>
-      </w:r>
-      <w:proofErr w:type="spellEnd"/>
-      <w:r>
-        <w:rPr>
-          <w:color w:val="000000" w:themeColor="text1"/>
-          <w:sz w:val="22"/>
-          <w:szCs w:val="22"/>
-        </w:rPr>
-        <w:t xml:space="preserve"> The number of microseconds (000000..999999) </w:t>
+        <w:t xml:space="preserve">%f The number of microseconds (000000..999999) </w:t>
       </w:r>
     </w:p>
     <w:p>
@@ -3190,25 +2458,7 @@
           <w:sz w:val="22"/>
           <w:szCs w:val="22"/>
         </w:rPr>
-        <w:t>%</w:t>
-      </w:r>
-      <w:proofErr w:type="spellStart"/>
-      <w:r>
-        <w:rPr>
-          <w:color w:val="000000" w:themeColor="text1"/>
-          <w:sz w:val="22"/>
-          <w:szCs w:val="22"/>
-        </w:rPr>
-        <w:t>i</w:t>
-      </w:r>
-      <w:proofErr w:type="spellEnd"/>
-      <w:r>
-        <w:rPr>
-          <w:color w:val="000000" w:themeColor="text1"/>
-          <w:sz w:val="22"/>
-          <w:szCs w:val="22"/>
-        </w:rPr>
-        <w:t xml:space="preserve"> The minutes within the hour (00..59) </w:t>
+        <w:t xml:space="preserve">%i The minutes within the hour (00..59) </w:t>
       </w:r>
     </w:p>
     <w:p>
@@ -3242,25 +2492,7 @@
           <w:sz w:val="22"/>
           <w:szCs w:val="22"/>
         </w:rPr>
-        <w:t>%M The full month name (</w:t>
-      </w:r>
-      <w:proofErr w:type="spellStart"/>
-      <w:r>
-        <w:rPr>
-          <w:color w:val="000000" w:themeColor="text1"/>
-          <w:sz w:val="22"/>
-          <w:szCs w:val="22"/>
-        </w:rPr>
-        <w:t>January..December</w:t>
-      </w:r>
-      <w:proofErr w:type="spellEnd"/>
-      <w:r>
-        <w:rPr>
-          <w:color w:val="000000" w:themeColor="text1"/>
-          <w:sz w:val="22"/>
-          <w:szCs w:val="22"/>
-        </w:rPr>
-        <w:t xml:space="preserve">) </w:t>
+        <w:t xml:space="preserve">%M The full month name (January..December) </w:t>
       </w:r>
     </w:p>
     <w:p>
@@ -3329,25 +2561,7 @@
           <w:sz w:val="22"/>
           <w:szCs w:val="22"/>
         </w:rPr>
-        <w:t>%W The full weekday name (</w:t>
-      </w:r>
-      <w:proofErr w:type="spellStart"/>
-      <w:r>
-        <w:rPr>
-          <w:color w:val="000000" w:themeColor="text1"/>
-          <w:sz w:val="22"/>
-          <w:szCs w:val="22"/>
-        </w:rPr>
-        <w:t>Sunday..Saturday</w:t>
-      </w:r>
-      <w:proofErr w:type="spellEnd"/>
-      <w:r>
-        <w:rPr>
-          <w:color w:val="000000" w:themeColor="text1"/>
-          <w:sz w:val="22"/>
-          <w:szCs w:val="22"/>
-        </w:rPr>
-        <w:t xml:space="preserve">) </w:t>
+        <w:t xml:space="preserve">%W The full weekday name (Sunday..Saturday) </w:t>
       </w:r>
     </w:p>
     <w:p>
@@ -3881,18 +3095,8 @@
           <w:bCs/>
           <w:color w:val="4472C4" w:themeColor="accent1"/>
         </w:rPr>
-        <w:t xml:space="preserve">SELECT </w:t>
-      </w:r>
-      <w:proofErr w:type="spellStart"/>
-      <w:r>
-        <w:rPr>
-          <w:b/>
-          <w:bCs/>
-          <w:color w:val="4472C4" w:themeColor="accent1"/>
-        </w:rPr>
-        <w:t>language_id</w:t>
-      </w:r>
-      <w:proofErr w:type="spellEnd"/>
+        <w:t>SELECT language_id</w:t>
+      </w:r>
       <w:r>
         <w:rPr>
           <w:b/>
@@ -3907,79 +3111,7 @@
           <w:bCs/>
           <w:color w:val="4472C4" w:themeColor="accent1"/>
         </w:rPr>
-        <w:t xml:space="preserve">'COMMON' </w:t>
-      </w:r>
-      <w:proofErr w:type="spellStart"/>
-      <w:r>
-        <w:rPr>
-          <w:b/>
-          <w:bCs/>
-          <w:color w:val="4472C4" w:themeColor="accent1"/>
-        </w:rPr>
-        <w:t>language_usage</w:t>
-      </w:r>
-      <w:proofErr w:type="spellEnd"/>
-      <w:r>
-        <w:rPr>
-          <w:b/>
-          <w:bCs/>
-          <w:color w:val="4472C4" w:themeColor="accent1"/>
-        </w:rPr>
-        <w:t xml:space="preserve">, </w:t>
-      </w:r>
-      <w:proofErr w:type="spellStart"/>
-      <w:r>
-        <w:rPr>
-          <w:b/>
-          <w:bCs/>
-          <w:color w:val="4472C4" w:themeColor="accent1"/>
-        </w:rPr>
-        <w:t>language_id</w:t>
-      </w:r>
-      <w:proofErr w:type="spellEnd"/>
-      <w:r>
-        <w:rPr>
-          <w:b/>
-          <w:bCs/>
-          <w:color w:val="4472C4" w:themeColor="accent1"/>
-        </w:rPr>
-        <w:t xml:space="preserve"> * 3.1415927 </w:t>
-      </w:r>
-      <w:proofErr w:type="spellStart"/>
-      <w:r>
-        <w:rPr>
-          <w:b/>
-          <w:bCs/>
-          <w:color w:val="4472C4" w:themeColor="accent1"/>
-        </w:rPr>
-        <w:t>lang_pi_value</w:t>
-      </w:r>
-      <w:proofErr w:type="spellEnd"/>
-      <w:r>
-        <w:rPr>
-          <w:b/>
-          <w:bCs/>
-          <w:color w:val="4472C4" w:themeColor="accent1"/>
-        </w:rPr>
-        <w:t xml:space="preserve">,    upper(name) </w:t>
-      </w:r>
-      <w:proofErr w:type="spellStart"/>
-      <w:r>
-        <w:rPr>
-          <w:b/>
-          <w:bCs/>
-          <w:color w:val="4472C4" w:themeColor="accent1"/>
-        </w:rPr>
-        <w:t>language_name</w:t>
-      </w:r>
-      <w:proofErr w:type="spellEnd"/>
-      <w:r>
-        <w:rPr>
-          <w:b/>
-          <w:bCs/>
-          <w:color w:val="4472C4" w:themeColor="accent1"/>
-        </w:rPr>
-        <w:t xml:space="preserve">     </w:t>
+        <w:t xml:space="preserve">'COMMON' language_usage, language_id * 3.1415927 lang_pi_value,    upper(name) language_name     </w:t>
       </w:r>
     </w:p>
     <w:p>
@@ -4021,105 +3153,41 @@
           <w:sz w:val="22"/>
           <w:szCs w:val="22"/>
         </w:rPr>
-        <w:t xml:space="preserve">we can manipulate </w:t>
-      </w:r>
-      <w:proofErr w:type="spellStart"/>
-      <w:r>
-        <w:rPr>
-          <w:color w:val="000000" w:themeColor="text1"/>
-          <w:sz w:val="22"/>
-          <w:szCs w:val="22"/>
-        </w:rPr>
-        <w:t>numerice</w:t>
-      </w:r>
-      <w:proofErr w:type="spellEnd"/>
-      <w:r>
-        <w:rPr>
-          <w:color w:val="000000" w:themeColor="text1"/>
-          <w:sz w:val="22"/>
-          <w:szCs w:val="22"/>
-        </w:rPr>
-        <w:t xml:space="preserve"> data, </w:t>
-      </w:r>
-    </w:p>
-    <w:p>
-      <w:pPr>
-        <w:rPr>
-          <w:color w:val="000000" w:themeColor="text1"/>
-          <w:sz w:val="22"/>
-          <w:szCs w:val="22"/>
-        </w:rPr>
-      </w:pPr>
-      <w:proofErr w:type="spellStart"/>
-      <w:r>
-        <w:rPr>
-          <w:color w:val="000000" w:themeColor="text1"/>
-          <w:sz w:val="22"/>
-          <w:szCs w:val="22"/>
-        </w:rPr>
-        <w:t>language_id</w:t>
-      </w:r>
-      <w:proofErr w:type="spellEnd"/>
-      <w:r>
-        <w:rPr>
-          <w:color w:val="000000" w:themeColor="text1"/>
-          <w:sz w:val="22"/>
-          <w:szCs w:val="22"/>
-        </w:rPr>
-        <w:t xml:space="preserve"> * 3.1415927 </w:t>
-      </w:r>
-      <w:proofErr w:type="spellStart"/>
-      <w:r>
-        <w:rPr>
-          <w:color w:val="000000" w:themeColor="text1"/>
-          <w:sz w:val="22"/>
-          <w:szCs w:val="22"/>
-        </w:rPr>
-        <w:t>lang_pi_value</w:t>
-      </w:r>
-      <w:proofErr w:type="spellEnd"/>
-      <w:r>
-        <w:rPr>
-          <w:color w:val="000000" w:themeColor="text1"/>
-          <w:sz w:val="22"/>
-          <w:szCs w:val="22"/>
-        </w:rPr>
-        <w:t>; selects the language id and multiplies it by a number then save it into a new column.</w:t>
-      </w:r>
-    </w:p>
-    <w:p>
-      <w:pPr>
-        <w:rPr>
-          <w:color w:val="000000" w:themeColor="text1"/>
-          <w:sz w:val="22"/>
-          <w:szCs w:val="22"/>
-        </w:rPr>
-      </w:pPr>
-      <w:r>
-        <w:rPr>
-          <w:color w:val="000000" w:themeColor="text1"/>
-          <w:sz w:val="22"/>
-          <w:szCs w:val="22"/>
-        </w:rPr>
-        <w:t xml:space="preserve">Upper (name) </w:t>
-      </w:r>
-      <w:proofErr w:type="spellStart"/>
-      <w:r>
-        <w:rPr>
-          <w:color w:val="000000" w:themeColor="text1"/>
-          <w:sz w:val="22"/>
-          <w:szCs w:val="22"/>
-        </w:rPr>
-        <w:t>language_name</w:t>
-      </w:r>
-      <w:proofErr w:type="spellEnd"/>
-      <w:r>
-        <w:rPr>
-          <w:color w:val="000000" w:themeColor="text1"/>
-          <w:sz w:val="22"/>
-          <w:szCs w:val="22"/>
-        </w:rPr>
-        <w:t xml:space="preserve"> does the same.</w:t>
+        <w:t xml:space="preserve">we can manipulate numerice data, </w:t>
+      </w:r>
+    </w:p>
+    <w:p>
+      <w:pPr>
+        <w:rPr>
+          <w:color w:val="000000" w:themeColor="text1"/>
+          <w:sz w:val="22"/>
+          <w:szCs w:val="22"/>
+        </w:rPr>
+      </w:pPr>
+      <w:r>
+        <w:rPr>
+          <w:color w:val="000000" w:themeColor="text1"/>
+          <w:sz w:val="22"/>
+          <w:szCs w:val="22"/>
+        </w:rPr>
+        <w:t>language_id * 3.1415927 lang_pi_value; selects the language id and multiplies it by a number then save it into a new column.</w:t>
+      </w:r>
+    </w:p>
+    <w:p>
+      <w:pPr>
+        <w:rPr>
+          <w:color w:val="000000" w:themeColor="text1"/>
+          <w:sz w:val="22"/>
+          <w:szCs w:val="22"/>
+        </w:rPr>
+      </w:pPr>
+      <w:r>
+        <w:rPr>
+          <w:color w:val="000000" w:themeColor="text1"/>
+          <w:sz w:val="22"/>
+          <w:szCs w:val="22"/>
+        </w:rPr>
+        <w:t>Upper (name) language_name does the same.</w:t>
       </w:r>
     </w:p>
     <w:p>
@@ -4476,79 +3544,7 @@
           <w:bCs/>
           <w:color w:val="4472C4" w:themeColor="accent1"/>
         </w:rPr>
-        <w:t xml:space="preserve">SELECT </w:t>
-      </w:r>
-      <w:proofErr w:type="spellStart"/>
-      <w:r>
-        <w:rPr>
-          <w:b/>
-          <w:bCs/>
-          <w:color w:val="4472C4" w:themeColor="accent1"/>
-        </w:rPr>
-        <w:t>c.first_name</w:t>
-      </w:r>
-      <w:proofErr w:type="spellEnd"/>
-      <w:r>
-        <w:rPr>
-          <w:b/>
-          <w:bCs/>
-          <w:color w:val="4472C4" w:themeColor="accent1"/>
-        </w:rPr>
-        <w:t xml:space="preserve">, </w:t>
-      </w:r>
-      <w:proofErr w:type="spellStart"/>
-      <w:r>
-        <w:rPr>
-          <w:b/>
-          <w:bCs/>
-          <w:color w:val="4472C4" w:themeColor="accent1"/>
-        </w:rPr>
-        <w:t>c.last_name</w:t>
-      </w:r>
-      <w:proofErr w:type="spellEnd"/>
-      <w:r>
-        <w:rPr>
-          <w:b/>
-          <w:bCs/>
-          <w:color w:val="4472C4" w:themeColor="accent1"/>
-        </w:rPr>
-        <w:t>,   time(</w:t>
-      </w:r>
-      <w:proofErr w:type="spellStart"/>
-      <w:r>
-        <w:rPr>
-          <w:b/>
-          <w:bCs/>
-          <w:color w:val="4472C4" w:themeColor="accent1"/>
-        </w:rPr>
-        <w:t>r.rental_date</w:t>
-      </w:r>
-      <w:proofErr w:type="spellEnd"/>
-      <w:r>
-        <w:rPr>
-          <w:b/>
-          <w:bCs/>
-          <w:color w:val="4472C4" w:themeColor="accent1"/>
-        </w:rPr>
-        <w:t xml:space="preserve">) </w:t>
-      </w:r>
-      <w:proofErr w:type="spellStart"/>
-      <w:r>
-        <w:rPr>
-          <w:b/>
-          <w:bCs/>
-          <w:color w:val="4472C4" w:themeColor="accent1"/>
-        </w:rPr>
-        <w:t>rental_time</w:t>
-      </w:r>
-      <w:proofErr w:type="spellEnd"/>
-      <w:r>
-        <w:rPr>
-          <w:b/>
-          <w:bCs/>
-          <w:color w:val="4472C4" w:themeColor="accent1"/>
-        </w:rPr>
-        <w:t xml:space="preserve"> </w:t>
+        <w:t xml:space="preserve">SELECT c.first_name, c.last_name,   time(r.rental_date) rental_time </w:t>
       </w:r>
     </w:p>
     <w:p>
@@ -4599,78 +3595,24 @@
           <w:bCs/>
           <w:color w:val="4472C4" w:themeColor="accent1"/>
         </w:rPr>
-        <w:t xml:space="preserve">ON </w:t>
-      </w:r>
-      <w:proofErr w:type="spellStart"/>
-      <w:r>
-        <w:rPr>
-          <w:b/>
-          <w:bCs/>
-          <w:color w:val="4472C4" w:themeColor="accent1"/>
-        </w:rPr>
-        <w:t>c.customer_id</w:t>
-      </w:r>
-      <w:proofErr w:type="spellEnd"/>
-      <w:r>
-        <w:rPr>
-          <w:b/>
-          <w:bCs/>
-          <w:color w:val="4472C4" w:themeColor="accent1"/>
-        </w:rPr>
-        <w:t xml:space="preserve"> = </w:t>
-      </w:r>
-      <w:proofErr w:type="spellStart"/>
-      <w:r>
-        <w:rPr>
-          <w:b/>
-          <w:bCs/>
-          <w:color w:val="4472C4" w:themeColor="accent1"/>
-        </w:rPr>
-        <w:t>r.customer_id</w:t>
-      </w:r>
-      <w:proofErr w:type="spellEnd"/>
-      <w:r>
-        <w:rPr>
-          <w:b/>
-          <w:bCs/>
-          <w:color w:val="4472C4" w:themeColor="accent1"/>
-        </w:rPr>
-        <w:t xml:space="preserve"> </w:t>
-      </w:r>
-    </w:p>
-    <w:p>
-      <w:pPr>
-        <w:rPr>
-          <w:color w:val="000000" w:themeColor="text1"/>
-          <w:sz w:val="22"/>
-          <w:szCs w:val="22"/>
-        </w:rPr>
-      </w:pPr>
-      <w:r>
-        <w:rPr>
-          <w:b/>
-          <w:bCs/>
-          <w:color w:val="4472C4" w:themeColor="accent1"/>
-        </w:rPr>
-        <w:t>WHERE date(</w:t>
-      </w:r>
-      <w:proofErr w:type="spellStart"/>
-      <w:r>
-        <w:rPr>
-          <w:b/>
-          <w:bCs/>
-          <w:color w:val="4472C4" w:themeColor="accent1"/>
-        </w:rPr>
-        <w:t>r.rental_date</w:t>
-      </w:r>
-      <w:proofErr w:type="spellEnd"/>
-      <w:r>
-        <w:rPr>
-          <w:b/>
-          <w:bCs/>
-          <w:color w:val="4472C4" w:themeColor="accent1"/>
-        </w:rPr>
-        <w:t>) = '2005-06-14'</w:t>
+        <w:t xml:space="preserve">ON c.customer_id = r.customer_id </w:t>
+      </w:r>
+    </w:p>
+    <w:p>
+      <w:pPr>
+        <w:rPr>
+          <w:color w:val="000000" w:themeColor="text1"/>
+          <w:sz w:val="22"/>
+          <w:szCs w:val="22"/>
+        </w:rPr>
+      </w:pPr>
+      <w:r>
+        <w:rPr>
+          <w:b/>
+          <w:bCs/>
+          <w:color w:val="4472C4" w:themeColor="accent1"/>
+        </w:rPr>
+        <w:t>WHERE date(r.rental_date) = '2005-06-14'</w:t>
       </w:r>
       <w:r>
         <w:rPr>
@@ -4785,18 +3727,8 @@
           <w:bCs/>
           <w:color w:val="4472C4" w:themeColor="accent1"/>
         </w:rPr>
-        <w:t xml:space="preserve">SELECT title, </w:t>
-      </w:r>
-      <w:proofErr w:type="spellStart"/>
-      <w:r>
-        <w:rPr>
-          <w:b/>
-          <w:bCs/>
-          <w:color w:val="4472C4" w:themeColor="accent1"/>
-        </w:rPr>
-        <w:t>rental_duration</w:t>
-      </w:r>
-      <w:proofErr w:type="spellEnd"/>
+        <w:t>SELECT title, rental_duration</w:t>
+      </w:r>
     </w:p>
     <w:p>
       <w:pPr>
@@ -4829,60 +3761,24 @@
           <w:bCs/>
           <w:color w:val="4472C4" w:themeColor="accent1"/>
         </w:rPr>
-        <w:t xml:space="preserve">WHERE rating = 'G' AND </w:t>
-      </w:r>
-      <w:proofErr w:type="spellStart"/>
-      <w:r>
-        <w:rPr>
-          <w:b/>
-          <w:bCs/>
-          <w:color w:val="4472C4" w:themeColor="accent1"/>
-        </w:rPr>
-        <w:t>rental_duration</w:t>
-      </w:r>
-      <w:proofErr w:type="spellEnd"/>
-      <w:r>
-        <w:rPr>
-          <w:b/>
-          <w:bCs/>
-          <w:color w:val="4472C4" w:themeColor="accent1"/>
-        </w:rPr>
-        <w:t xml:space="preserve"> &gt; 5</w:t>
-      </w:r>
-    </w:p>
-    <w:p>
-      <w:pPr>
-        <w:rPr>
-          <w:b/>
-          <w:bCs/>
-          <w:color w:val="4472C4" w:themeColor="accent1"/>
-        </w:rPr>
-      </w:pPr>
-      <w:r>
-        <w:rPr>
-          <w:b/>
-          <w:bCs/>
-          <w:color w:val="4472C4" w:themeColor="accent1"/>
-        </w:rPr>
-        <w:t xml:space="preserve">ORDER BY </w:t>
-      </w:r>
-      <w:proofErr w:type="spellStart"/>
-      <w:r>
-        <w:rPr>
-          <w:b/>
-          <w:bCs/>
-          <w:color w:val="4472C4" w:themeColor="accent1"/>
-        </w:rPr>
-        <w:t>rental_duration</w:t>
-      </w:r>
-      <w:proofErr w:type="spellEnd"/>
-      <w:r>
-        <w:rPr>
-          <w:b/>
-          <w:bCs/>
-          <w:color w:val="4472C4" w:themeColor="accent1"/>
-        </w:rPr>
-        <w:t xml:space="preserve"> DESC;</w:t>
+        <w:t>WHERE rating = 'G' AND rental_duration &gt; 5</w:t>
+      </w:r>
+    </w:p>
+    <w:p>
+      <w:pPr>
+        <w:rPr>
+          <w:b/>
+          <w:bCs/>
+          <w:color w:val="4472C4" w:themeColor="accent1"/>
+        </w:rPr>
+      </w:pPr>
+      <w:r>
+        <w:rPr>
+          <w:b/>
+          <w:bCs/>
+          <w:color w:val="4472C4" w:themeColor="accent1"/>
+        </w:rPr>
+        <w:t>ORDER BY rental_duration DESC;</w:t>
       </w:r>
     </w:p>
     <w:p>
@@ -5030,25 +3926,7 @@
           <w:sz w:val="22"/>
           <w:szCs w:val="22"/>
         </w:rPr>
-        <w:t xml:space="preserve">When sorting, you have the option of specifying ascending or descending order via the </w:t>
-      </w:r>
-      <w:proofErr w:type="spellStart"/>
-      <w:r>
-        <w:rPr>
-          <w:color w:val="000000" w:themeColor="text1"/>
-          <w:sz w:val="22"/>
-          <w:szCs w:val="22"/>
-        </w:rPr>
-        <w:t>asc</w:t>
-      </w:r>
-      <w:proofErr w:type="spellEnd"/>
-      <w:r>
-        <w:rPr>
-          <w:color w:val="000000" w:themeColor="text1"/>
-          <w:sz w:val="22"/>
-          <w:szCs w:val="22"/>
-        </w:rPr>
-        <w:t xml:space="preserve"> and desc keywords. </w:t>
+        <w:t xml:space="preserve">When sorting, you have the option of specifying ascending or descending order via the asc and desc keywords. </w:t>
       </w:r>
       <w:r>
         <w:rPr>
@@ -5102,107 +3980,25 @@
           <w:bCs/>
           <w:color w:val="4472C4" w:themeColor="accent1"/>
         </w:rPr>
-        <w:t xml:space="preserve">SELECT </w:t>
-      </w:r>
-      <w:proofErr w:type="spellStart"/>
-      <w:r>
-        <w:rPr>
-          <w:b/>
-          <w:bCs/>
-          <w:color w:val="4472C4" w:themeColor="accent1"/>
-        </w:rPr>
-        <w:t>actor_id</w:t>
-      </w:r>
-      <w:proofErr w:type="spellEnd"/>
-      <w:r>
-        <w:rPr>
-          <w:b/>
-          <w:bCs/>
-          <w:color w:val="4472C4" w:themeColor="accent1"/>
-        </w:rPr>
-        <w:t xml:space="preserve">, </w:t>
-      </w:r>
-      <w:proofErr w:type="spellStart"/>
-      <w:r>
-        <w:rPr>
-          <w:b/>
-          <w:bCs/>
-          <w:color w:val="4472C4" w:themeColor="accent1"/>
-        </w:rPr>
-        <w:t>film_id</w:t>
-      </w:r>
-      <w:proofErr w:type="spellEnd"/>
-      <w:r>
-        <w:rPr>
-          <w:b/>
-          <w:bCs/>
-          <w:color w:val="4472C4" w:themeColor="accent1"/>
-        </w:rPr>
-        <w:t>, (</w:t>
-      </w:r>
-      <w:proofErr w:type="spellStart"/>
-      <w:r>
-        <w:rPr>
-          <w:b/>
-          <w:bCs/>
-          <w:color w:val="4472C4" w:themeColor="accent1"/>
-        </w:rPr>
-        <w:t>actor_id</w:t>
-      </w:r>
-      <w:proofErr w:type="spellEnd"/>
-      <w:r>
-        <w:rPr>
-          <w:b/>
-          <w:bCs/>
-          <w:color w:val="4472C4" w:themeColor="accent1"/>
-        </w:rPr>
-        <w:t xml:space="preserve"> + </w:t>
-      </w:r>
-      <w:proofErr w:type="spellStart"/>
-      <w:r>
-        <w:rPr>
-          <w:b/>
-          <w:bCs/>
-          <w:color w:val="4472C4" w:themeColor="accent1"/>
-        </w:rPr>
-        <w:t>film_id</w:t>
-      </w:r>
-      <w:proofErr w:type="spellEnd"/>
-      <w:r>
-        <w:rPr>
-          <w:b/>
-          <w:bCs/>
-          <w:color w:val="4472C4" w:themeColor="accent1"/>
-        </w:rPr>
-        <w:t>) AS total</w:t>
-      </w:r>
-    </w:p>
-    <w:p>
-      <w:pPr>
-        <w:rPr>
-          <w:b/>
-          <w:bCs/>
-          <w:color w:val="4472C4" w:themeColor="accent1"/>
-        </w:rPr>
-      </w:pPr>
-      <w:r>
-        <w:rPr>
-          <w:b/>
-          <w:bCs/>
-          <w:color w:val="4472C4" w:themeColor="accent1"/>
-        </w:rPr>
-        <w:t xml:space="preserve">FROM </w:t>
-      </w:r>
-      <w:proofErr w:type="spellStart"/>
-      <w:r>
-        <w:rPr>
-          <w:b/>
-          <w:bCs/>
-          <w:color w:val="4472C4" w:themeColor="accent1"/>
-        </w:rPr>
-        <w:t>film_actor</w:t>
-      </w:r>
-      <w:proofErr w:type="spellEnd"/>
+        <w:t>SELECT actor_id, film_id, (actor_id + film_id) AS total</w:t>
+      </w:r>
+    </w:p>
+    <w:p>
+      <w:pPr>
+        <w:rPr>
+          <w:b/>
+          <w:bCs/>
+          <w:color w:val="4472C4" w:themeColor="accent1"/>
+        </w:rPr>
+      </w:pPr>
+      <w:r>
+        <w:rPr>
+          <w:b/>
+          <w:bCs/>
+          <w:color w:val="4472C4" w:themeColor="accent1"/>
+        </w:rPr>
+        <w:t>FROM film_actor</w:t>
+      </w:r>
     </w:p>
     <w:p>
       <w:pPr>
@@ -5235,53 +4031,1407 @@
           <w:sz w:val="22"/>
           <w:szCs w:val="22"/>
         </w:rPr>
-        <w:t>3 here refers to the column number 3 in our select statement which is (</w:t>
-      </w:r>
-      <w:proofErr w:type="spellStart"/>
-      <w:r>
-        <w:rPr>
-          <w:color w:val="000000" w:themeColor="text1"/>
-          <w:sz w:val="22"/>
-          <w:szCs w:val="22"/>
-        </w:rPr>
-        <w:t>actor_id</w:t>
-      </w:r>
-      <w:proofErr w:type="spellEnd"/>
-      <w:r>
-        <w:rPr>
-          <w:color w:val="000000" w:themeColor="text1"/>
-          <w:sz w:val="22"/>
-          <w:szCs w:val="22"/>
-        </w:rPr>
-        <w:t xml:space="preserve"> + </w:t>
-      </w:r>
-      <w:proofErr w:type="spellStart"/>
-      <w:r>
-        <w:rPr>
-          <w:color w:val="000000" w:themeColor="text1"/>
-          <w:sz w:val="22"/>
-          <w:szCs w:val="22"/>
-        </w:rPr>
-        <w:t>film_id</w:t>
-      </w:r>
-      <w:proofErr w:type="spellEnd"/>
-      <w:r>
-        <w:rPr>
-          <w:color w:val="000000" w:themeColor="text1"/>
-          <w:sz w:val="22"/>
-          <w:szCs w:val="22"/>
-        </w:rPr>
-        <w:t>)</w:t>
-      </w:r>
-    </w:p>
-    <w:p>
-      <w:pPr>
-        <w:rPr>
-          <w:b/>
-          <w:bCs/>
-          <w:color w:val="4472C4" w:themeColor="accent1"/>
-        </w:rPr>
-      </w:pPr>
+        <w:t>3 here refers to the column number 3 in our select statement which is (actor_id + film_id)</w:t>
+      </w:r>
+    </w:p>
+    <w:p>
+      <w:pPr>
+        <w:rPr>
+          <w:b/>
+          <w:bCs/>
+          <w:color w:val="000000" w:themeColor="text1"/>
+          <w:sz w:val="28"/>
+          <w:szCs w:val="28"/>
+          <w:u w:val="single"/>
+        </w:rPr>
+      </w:pPr>
+      <w:r>
+        <w:rPr>
+          <w:b/>
+          <w:bCs/>
+          <w:color w:val="000000" w:themeColor="text1"/>
+          <w:sz w:val="28"/>
+          <w:szCs w:val="28"/>
+          <w:u w:val="single"/>
+        </w:rPr>
+        <w:t>Exercise 3</w:t>
+      </w:r>
+      <w:r>
+        <w:rPr>
+          <w:b/>
+          <w:bCs/>
+          <w:color w:val="000000" w:themeColor="text1"/>
+          <w:sz w:val="28"/>
+          <w:szCs w:val="28"/>
+          <w:u w:val="single"/>
+        </w:rPr>
+        <w:t>:</w:t>
+      </w:r>
+    </w:p>
+    <w:p>
+      <w:pPr>
+        <w:rPr>
+          <w:color w:val="000000" w:themeColor="text1"/>
+          <w:sz w:val="22"/>
+          <w:szCs w:val="22"/>
+        </w:rPr>
+      </w:pPr>
+      <w:r>
+        <w:rPr>
+          <w:color w:val="000000" w:themeColor="text1"/>
+          <w:sz w:val="22"/>
+          <w:szCs w:val="22"/>
+        </w:rPr>
+        <w:t>We can also use functions to type cast a datatype</w:t>
+      </w:r>
+    </w:p>
+    <w:p>
+      <w:pPr>
+        <w:rPr>
+          <w:color w:val="000000" w:themeColor="text1"/>
+          <w:sz w:val="22"/>
+          <w:szCs w:val="22"/>
+        </w:rPr>
+      </w:pPr>
+    </w:p>
+    <w:p>
+      <w:pPr>
+        <w:jc w:val="center"/>
+        <w:rPr>
+          <w:b/>
+          <w:bCs/>
+          <w:color w:val="EE0000"/>
+          <w:sz w:val="32"/>
+          <w:szCs w:val="32"/>
+          <w:u w:val="single"/>
+        </w:rPr>
+      </w:pPr>
+      <w:r>
+        <w:rPr>
+          <w:b/>
+          <w:bCs/>
+          <w:color w:val="EE0000"/>
+          <w:sz w:val="32"/>
+          <w:szCs w:val="32"/>
+          <w:u w:val="single"/>
+        </w:rPr>
+        <w:lastRenderedPageBreak/>
+        <w:t>Chapter 4</w:t>
+      </w:r>
+      <w:r>
+        <w:rPr>
+          <w:b/>
+          <w:bCs/>
+          <w:color w:val="EE0000"/>
+          <w:sz w:val="32"/>
+          <w:szCs w:val="32"/>
+          <w:u w:val="single"/>
+        </w:rPr>
+        <w:t>-Filtering</w:t>
+      </w:r>
+    </w:p>
+    <w:p>
+      <w:pPr>
+        <w:rPr>
+          <w:color w:val="000000" w:themeColor="text1"/>
+          <w:sz w:val="22"/>
+          <w:szCs w:val="22"/>
+        </w:rPr>
+      </w:pPr>
+    </w:p>
+    <w:p>
+      <w:pPr>
+        <w:rPr>
+          <w:b/>
+          <w:bCs/>
+          <w:color w:val="EE0000"/>
+          <w:sz w:val="22"/>
+          <w:szCs w:val="22"/>
+          <w:u w:val="single"/>
+        </w:rPr>
+      </w:pPr>
+      <w:r>
+        <w:rPr>
+          <w:b/>
+          <w:bCs/>
+          <w:color w:val="EE0000"/>
+          <w:sz w:val="22"/>
+          <w:szCs w:val="22"/>
+          <w:u w:val="single"/>
+        </w:rPr>
+        <w:t>all the SQL data statements (except the insert statement) include an optional where clause</w:t>
+      </w:r>
+    </w:p>
+    <w:p>
+      <w:pPr>
+        <w:rPr>
+          <w:color w:val="000000" w:themeColor="text1"/>
+          <w:sz w:val="22"/>
+          <w:szCs w:val="22"/>
+        </w:rPr>
+      </w:pPr>
+      <w:r>
+        <w:rPr>
+          <w:color w:val="000000" w:themeColor="text1"/>
+          <w:sz w:val="22"/>
+          <w:szCs w:val="22"/>
+        </w:rPr>
+        <w:t xml:space="preserve">this means </w:t>
+      </w:r>
+      <w:r>
+        <w:rPr>
+          <w:b/>
+          <w:bCs/>
+          <w:color w:val="000000" w:themeColor="text1"/>
+          <w:sz w:val="22"/>
+          <w:szCs w:val="22"/>
+        </w:rPr>
+        <w:t>SELECT, UPDATE, DELETE</w:t>
+      </w:r>
+      <w:r>
+        <w:rPr>
+          <w:color w:val="000000" w:themeColor="text1"/>
+          <w:sz w:val="22"/>
+          <w:szCs w:val="22"/>
+        </w:rPr>
+        <w:t xml:space="preserve"> all accept the keyword where.</w:t>
+      </w:r>
+    </w:p>
+    <w:p>
+      <w:pPr>
+        <w:rPr>
+          <w:color w:val="000000" w:themeColor="text1"/>
+          <w:sz w:val="22"/>
+          <w:szCs w:val="22"/>
+        </w:rPr>
+      </w:pPr>
+      <w:r>
+        <w:rPr>
+          <w:color w:val="000000" w:themeColor="text1"/>
+          <w:sz w:val="22"/>
+          <w:szCs w:val="22"/>
+        </w:rPr>
+        <w:t xml:space="preserve">The WHERE clauses works the same for the case of AND, OR usage. </w:t>
+      </w:r>
+    </w:p>
+    <w:p>
+      <w:pPr>
+        <w:rPr>
+          <w:color w:val="000000" w:themeColor="text1"/>
+          <w:sz w:val="22"/>
+          <w:szCs w:val="22"/>
+        </w:rPr>
+      </w:pPr>
+      <w:r>
+        <w:rPr>
+          <w:color w:val="000000" w:themeColor="text1"/>
+          <w:sz w:val="22"/>
+          <w:szCs w:val="22"/>
+        </w:rPr>
+        <w:t>AND evaluates till the end OR terminates once a case is satisfied.</w:t>
+      </w:r>
+    </w:p>
+    <w:p>
+      <w:pPr>
+        <w:rPr>
+          <w:color w:val="000000" w:themeColor="text1"/>
+          <w:sz w:val="22"/>
+          <w:szCs w:val="22"/>
+        </w:rPr>
+      </w:pPr>
+    </w:p>
+    <w:p>
+      <w:pPr>
+        <w:rPr>
+          <w:color w:val="000000" w:themeColor="text1"/>
+          <w:sz w:val="22"/>
+          <w:szCs w:val="22"/>
+        </w:rPr>
+      </w:pPr>
+      <w:r>
+        <w:rPr>
+          <w:color w:val="000000" w:themeColor="text1"/>
+          <w:sz w:val="22"/>
+          <w:szCs w:val="22"/>
+        </w:rPr>
+        <w:t>Since the usage of the keyword NOT is confusing for the user, its usually better to subsititute it with &lt;&gt; examples:</w:t>
+      </w:r>
+    </w:p>
+    <w:p>
+      <w:pPr>
+        <w:rPr>
+          <w:b/>
+          <w:bCs/>
+          <w:color w:val="4472C4" w:themeColor="accent1"/>
+        </w:rPr>
+      </w:pPr>
+      <w:r>
+        <w:rPr>
+          <w:b/>
+          <w:bCs/>
+          <w:color w:val="4472C4" w:themeColor="accent1"/>
+        </w:rPr>
+        <w:t>WHERE first_name &lt;&gt; 'STEVEN' AND last_name &lt;&gt; 'YOUNG'   AND create_date &gt; '2006-01-01'</w:t>
+      </w:r>
+      <w:r>
+        <w:rPr>
+          <w:b/>
+          <w:bCs/>
+          <w:color w:val="4472C4" w:themeColor="accent1"/>
+        </w:rPr>
+        <w:t xml:space="preserve">; </w:t>
+      </w:r>
+    </w:p>
+    <w:p>
+      <w:pPr>
+        <w:rPr>
+          <w:color w:val="000000" w:themeColor="text1"/>
+          <w:sz w:val="22"/>
+          <w:szCs w:val="22"/>
+        </w:rPr>
+      </w:pPr>
+      <w:r>
+        <w:rPr>
+          <w:color w:val="000000" w:themeColor="text1"/>
+          <w:sz w:val="22"/>
+          <w:szCs w:val="22"/>
+        </w:rPr>
+        <w:t xml:space="preserve">Here we are selecting the name that is not steven the last name that is not young </w:t>
+      </w:r>
+    </w:p>
+    <w:p>
+      <w:pPr>
+        <w:rPr>
+          <w:color w:val="000000" w:themeColor="text1"/>
+          <w:sz w:val="22"/>
+          <w:szCs w:val="22"/>
+        </w:rPr>
+      </w:pPr>
+    </w:p>
+    <w:p>
+      <w:pPr>
+        <w:rPr>
+          <w:b/>
+          <w:bCs/>
+          <w:color w:val="000000" w:themeColor="text1"/>
+          <w:sz w:val="28"/>
+          <w:szCs w:val="28"/>
+          <w:u w:val="single"/>
+        </w:rPr>
+      </w:pPr>
+      <w:r>
+        <w:rPr>
+          <w:b/>
+          <w:bCs/>
+          <w:color w:val="000000" w:themeColor="text1"/>
+          <w:sz w:val="28"/>
+          <w:szCs w:val="28"/>
+          <w:u w:val="single"/>
+        </w:rPr>
+        <w:t>Condition Types</w:t>
+      </w:r>
+      <w:r>
+        <w:rPr>
+          <w:b/>
+          <w:bCs/>
+          <w:color w:val="000000" w:themeColor="text1"/>
+          <w:sz w:val="28"/>
+          <w:szCs w:val="28"/>
+          <w:u w:val="single"/>
+        </w:rPr>
+        <w:t>;</w:t>
+      </w:r>
+    </w:p>
+    <w:p>
+      <w:pPr>
+        <w:rPr>
+          <w:color w:val="000000" w:themeColor="text1"/>
+          <w:sz w:val="22"/>
+          <w:szCs w:val="22"/>
+        </w:rPr>
+      </w:pPr>
+      <w:r>
+        <w:rPr>
+          <w:b/>
+          <w:bCs/>
+          <w:color w:val="000000" w:themeColor="text1"/>
+          <w:sz w:val="22"/>
+          <w:szCs w:val="22"/>
+        </w:rPr>
+        <w:t>Equality Condition:</w:t>
+      </w:r>
+      <w:r>
+        <w:rPr>
+          <w:b/>
+          <w:bCs/>
+          <w:color w:val="000000" w:themeColor="text1"/>
+          <w:sz w:val="22"/>
+          <w:szCs w:val="22"/>
+        </w:rPr>
+        <w:t xml:space="preserve"> </w:t>
+      </w:r>
+      <w:r>
+        <w:rPr>
+          <w:color w:val="000000" w:themeColor="text1"/>
+          <w:sz w:val="22"/>
+          <w:szCs w:val="22"/>
+        </w:rPr>
+        <w:t xml:space="preserve"> we are checking that a column is equal to a specific value to select, it update it or delete it.</w:t>
+      </w:r>
+    </w:p>
+    <w:p>
+      <w:pPr>
+        <w:ind w:left="720"/>
+        <w:rPr>
+          <w:b/>
+          <w:bCs/>
+          <w:color w:val="4472C4" w:themeColor="accent1"/>
+        </w:rPr>
+      </w:pPr>
+      <w:r>
+        <w:rPr>
+          <w:b/>
+          <w:bCs/>
+          <w:color w:val="4472C4" w:themeColor="accent1"/>
+        </w:rPr>
+        <w:t xml:space="preserve">title = 'RIVER OUTLAW' </w:t>
+      </w:r>
+    </w:p>
+    <w:p>
+      <w:pPr>
+        <w:ind w:left="720"/>
+        <w:rPr>
+          <w:b/>
+          <w:bCs/>
+          <w:color w:val="4472C4" w:themeColor="accent1"/>
+        </w:rPr>
+      </w:pPr>
+      <w:r>
+        <w:rPr>
+          <w:b/>
+          <w:bCs/>
+          <w:color w:val="4472C4" w:themeColor="accent1"/>
+        </w:rPr>
+        <w:t xml:space="preserve">fed_id = '111-11-1111' amount = 375.25 </w:t>
+      </w:r>
+    </w:p>
+    <w:p>
+      <w:pPr>
+        <w:ind w:left="720"/>
+        <w:rPr>
+          <w:b/>
+          <w:bCs/>
+          <w:color w:val="4472C4" w:themeColor="accent1"/>
+        </w:rPr>
+      </w:pPr>
+      <w:r>
+        <w:rPr>
+          <w:b/>
+          <w:bCs/>
+          <w:color w:val="4472C4" w:themeColor="accent1"/>
+        </w:rPr>
+        <w:t>film_id = (SELECT film_id FROM film WHERE title = 'RIVER OUTLAW')</w:t>
+      </w:r>
+    </w:p>
+    <w:p>
+      <w:pPr>
+        <w:ind w:left="720"/>
+        <w:rPr>
+          <w:color w:val="000000" w:themeColor="text1"/>
+          <w:sz w:val="22"/>
+          <w:szCs w:val="22"/>
+        </w:rPr>
+      </w:pPr>
+    </w:p>
+    <w:p>
+      <w:pPr>
+        <w:rPr>
+          <w:color w:val="000000" w:themeColor="text1"/>
+          <w:sz w:val="22"/>
+          <w:szCs w:val="22"/>
+        </w:rPr>
+      </w:pPr>
+      <w:r>
+        <w:rPr>
+          <w:b/>
+          <w:bCs/>
+          <w:color w:val="000000" w:themeColor="text1"/>
+          <w:sz w:val="22"/>
+          <w:szCs w:val="22"/>
+        </w:rPr>
+        <w:t>inE</w:t>
+      </w:r>
+      <w:r>
+        <w:rPr>
+          <w:b/>
+          <w:bCs/>
+          <w:color w:val="000000" w:themeColor="text1"/>
+          <w:sz w:val="22"/>
+          <w:szCs w:val="22"/>
+        </w:rPr>
+        <w:t>quality Condition:</w:t>
+      </w:r>
+      <w:r>
+        <w:rPr>
+          <w:b/>
+          <w:bCs/>
+          <w:color w:val="000000" w:themeColor="text1"/>
+          <w:sz w:val="22"/>
+          <w:szCs w:val="22"/>
+        </w:rPr>
+        <w:t xml:space="preserve"> </w:t>
+      </w:r>
+      <w:r>
+        <w:rPr>
+          <w:color w:val="000000" w:themeColor="text1"/>
+          <w:sz w:val="22"/>
+          <w:szCs w:val="22"/>
+        </w:rPr>
+        <w:t xml:space="preserve"> we are checking that a column is </w:t>
+      </w:r>
+      <w:r>
+        <w:rPr>
+          <w:color w:val="000000" w:themeColor="text1"/>
+          <w:sz w:val="22"/>
+          <w:szCs w:val="22"/>
+        </w:rPr>
+        <w:t xml:space="preserve">not </w:t>
+      </w:r>
+      <w:r>
+        <w:rPr>
+          <w:color w:val="000000" w:themeColor="text1"/>
+          <w:sz w:val="22"/>
+          <w:szCs w:val="22"/>
+        </w:rPr>
+        <w:t>equal to a specific value to select, it update it or delete it.</w:t>
+      </w:r>
+    </w:p>
+    <w:p>
+      <w:pPr>
+        <w:rPr>
+          <w:b/>
+          <w:bCs/>
+          <w:color w:val="4472C4" w:themeColor="accent1"/>
+        </w:rPr>
+      </w:pPr>
+      <w:r>
+        <w:rPr>
+          <w:b/>
+          <w:bCs/>
+          <w:color w:val="4472C4" w:themeColor="accent1"/>
+        </w:rPr>
+        <w:t xml:space="preserve">SELECT c.email     </w:t>
+      </w:r>
+    </w:p>
+    <w:p>
+      <w:pPr>
+        <w:rPr>
+          <w:b/>
+          <w:bCs/>
+          <w:color w:val="4472C4" w:themeColor="accent1"/>
+        </w:rPr>
+      </w:pPr>
+      <w:r>
+        <w:rPr>
+          <w:b/>
+          <w:bCs/>
+          <w:color w:val="4472C4" w:themeColor="accent1"/>
+        </w:rPr>
+        <w:t xml:space="preserve">FROM customer </w:t>
+      </w:r>
+    </w:p>
+    <w:p>
+      <w:pPr>
+        <w:rPr>
+          <w:b/>
+          <w:bCs/>
+          <w:color w:val="4472C4" w:themeColor="accent1"/>
+        </w:rPr>
+      </w:pPr>
+      <w:r>
+        <w:rPr>
+          <w:b/>
+          <w:bCs/>
+          <w:color w:val="4472C4" w:themeColor="accent1"/>
+        </w:rPr>
+        <w:t>INNER JOIN rental r    </w:t>
+      </w:r>
+    </w:p>
+    <w:p>
+      <w:pPr>
+        <w:rPr>
+          <w:b/>
+          <w:bCs/>
+          <w:color w:val="4472C4" w:themeColor="accent1"/>
+        </w:rPr>
+      </w:pPr>
+      <w:r>
+        <w:rPr>
+          <w:b/>
+          <w:bCs/>
+          <w:color w:val="4472C4" w:themeColor="accent1"/>
+        </w:rPr>
+        <w:t xml:space="preserve">ON c.customer_id = r.customer_id     </w:t>
+      </w:r>
+    </w:p>
+    <w:p>
+      <w:pPr>
+        <w:rPr>
+          <w:color w:val="000000" w:themeColor="text1"/>
+          <w:sz w:val="22"/>
+          <w:szCs w:val="22"/>
+        </w:rPr>
+      </w:pPr>
+      <w:r>
+        <w:rPr>
+          <w:b/>
+          <w:bCs/>
+          <w:color w:val="4472C4" w:themeColor="accent1"/>
+        </w:rPr>
+        <w:t>WHERE date(r.rental_date) &lt;&gt; '2005-06-14'</w:t>
+      </w:r>
+      <w:r>
+        <w:rPr>
+          <w:color w:val="000000" w:themeColor="text1"/>
+          <w:sz w:val="22"/>
+          <w:szCs w:val="22"/>
+        </w:rPr>
+        <w:t>;</w:t>
+      </w:r>
+    </w:p>
+    <w:p>
+      <w:pPr>
+        <w:rPr>
+          <w:color w:val="000000" w:themeColor="text1"/>
+          <w:sz w:val="22"/>
+          <w:szCs w:val="22"/>
+        </w:rPr>
+      </w:pPr>
+      <w:r>
+        <w:rPr>
+          <w:color w:val="000000" w:themeColor="text1"/>
+          <w:sz w:val="22"/>
+          <w:szCs w:val="22"/>
+        </w:rPr>
+        <w:t>Here the last statement where has the &lt;&gt; which means !=</w:t>
+      </w:r>
+    </w:p>
+    <w:p>
+      <w:pPr>
+        <w:rPr>
+          <w:b/>
+          <w:bCs/>
+          <w:color w:val="000000" w:themeColor="text1"/>
+          <w:u w:val="single"/>
+        </w:rPr>
+      </w:pPr>
+      <w:r>
+        <w:rPr>
+          <w:b/>
+          <w:bCs/>
+          <w:color w:val="000000" w:themeColor="text1"/>
+          <w:u w:val="single"/>
+        </w:rPr>
+        <w:lastRenderedPageBreak/>
+        <w:t>D</w:t>
+      </w:r>
+      <w:r>
+        <w:rPr>
+          <w:b/>
+          <w:bCs/>
+          <w:color w:val="000000" w:themeColor="text1"/>
+          <w:u w:val="single"/>
+        </w:rPr>
+        <w:t>ATA MODIFICATION USING EQUALITY CONDITIONS</w:t>
+      </w:r>
+      <w:r>
+        <w:rPr>
+          <w:b/>
+          <w:bCs/>
+          <w:color w:val="000000" w:themeColor="text1"/>
+          <w:u w:val="single"/>
+        </w:rPr>
+        <w:t>:</w:t>
+      </w:r>
+    </w:p>
+    <w:p>
+      <w:pPr>
+        <w:rPr>
+          <w:b/>
+          <w:bCs/>
+          <w:color w:val="4472C4" w:themeColor="accent1"/>
+        </w:rPr>
+      </w:pPr>
+      <w:r>
+        <w:rPr>
+          <w:b/>
+          <w:bCs/>
+          <w:color w:val="4472C4" w:themeColor="accent1"/>
+        </w:rPr>
+        <w:t>DELETE FROM rental WHERE year(rental_date) = 2004;</w:t>
+      </w:r>
+    </w:p>
+    <w:p>
+      <w:pPr>
+        <w:rPr>
+          <w:color w:val="000000" w:themeColor="text1"/>
+          <w:sz w:val="22"/>
+          <w:szCs w:val="22"/>
+        </w:rPr>
+      </w:pPr>
+      <w:r>
+        <w:rPr>
+          <w:color w:val="000000" w:themeColor="text1"/>
+          <w:sz w:val="22"/>
+          <w:szCs w:val="22"/>
+        </w:rPr>
+        <w:t>Deletion is a data modification type.</w:t>
+      </w:r>
+    </w:p>
+    <w:p>
+      <w:pPr>
+        <w:rPr>
+          <w:color w:val="000000" w:themeColor="text1"/>
+          <w:sz w:val="22"/>
+          <w:szCs w:val="22"/>
+        </w:rPr>
+      </w:pPr>
+    </w:p>
+    <w:p>
+      <w:pPr>
+        <w:rPr>
+          <w:b/>
+          <w:bCs/>
+          <w:color w:val="000000" w:themeColor="text1"/>
+          <w:u w:val="single"/>
+        </w:rPr>
+      </w:pPr>
+      <w:r>
+        <w:rPr>
+          <w:b/>
+          <w:bCs/>
+          <w:color w:val="000000" w:themeColor="text1"/>
+          <w:u w:val="single"/>
+        </w:rPr>
+        <w:t>Range Conditions</w:t>
+      </w:r>
+      <w:r>
+        <w:rPr>
+          <w:b/>
+          <w:bCs/>
+          <w:color w:val="000000" w:themeColor="text1"/>
+          <w:u w:val="single"/>
+        </w:rPr>
+        <w:t>:</w:t>
+      </w:r>
+    </w:p>
+    <w:p>
+      <w:pPr>
+        <w:rPr>
+          <w:b/>
+          <w:bCs/>
+          <w:color w:val="4472C4" w:themeColor="accent1"/>
+        </w:rPr>
+      </w:pPr>
+      <w:r>
+        <w:rPr>
+          <w:b/>
+          <w:bCs/>
+          <w:color w:val="4472C4" w:themeColor="accent1"/>
+        </w:rPr>
+        <w:t xml:space="preserve">SELECT customer_id, rental_date     </w:t>
+      </w:r>
+    </w:p>
+    <w:p>
+      <w:pPr>
+        <w:rPr>
+          <w:b/>
+          <w:bCs/>
+          <w:color w:val="4472C4" w:themeColor="accent1"/>
+        </w:rPr>
+      </w:pPr>
+      <w:r>
+        <w:rPr>
+          <w:b/>
+          <w:bCs/>
+          <w:color w:val="4472C4" w:themeColor="accent1"/>
+        </w:rPr>
+        <w:t>FROM rental</w:t>
+      </w:r>
+    </w:p>
+    <w:p>
+      <w:pPr>
+        <w:rPr>
+          <w:b/>
+          <w:bCs/>
+          <w:color w:val="4472C4" w:themeColor="accent1"/>
+        </w:rPr>
+      </w:pPr>
+      <w:r>
+        <w:rPr>
+          <w:b/>
+          <w:bCs/>
+          <w:color w:val="4472C4" w:themeColor="accent1"/>
+        </w:rPr>
+        <w:t>WHERE rental_date &lt;= '2005-06-16'    </w:t>
+      </w:r>
+    </w:p>
+    <w:p>
+      <w:pPr>
+        <w:rPr>
+          <w:b/>
+          <w:bCs/>
+          <w:color w:val="4472C4" w:themeColor="accent1"/>
+        </w:rPr>
+      </w:pPr>
+      <w:r>
+        <w:rPr>
+          <w:b/>
+          <w:bCs/>
+          <w:color w:val="4472C4" w:themeColor="accent1"/>
+        </w:rPr>
+        <w:t>AND rental_date &gt;= '2005-06-14';</w:t>
+      </w:r>
+    </w:p>
+    <w:p>
+      <w:pPr>
+        <w:rPr>
+          <w:color w:val="000000" w:themeColor="text1"/>
+          <w:sz w:val="22"/>
+          <w:szCs w:val="22"/>
+        </w:rPr>
+      </w:pPr>
+      <w:r>
+        <w:rPr>
+          <w:color w:val="000000" w:themeColor="text1"/>
+          <w:sz w:val="22"/>
+          <w:szCs w:val="22"/>
+        </w:rPr>
+        <w:t>the in range condition does not have a keyword it’s a logic that we can achieve by using the operators of &lt; and &gt; on the same data to achieve a logical range.</w:t>
+      </w:r>
+    </w:p>
+    <w:p>
+      <w:pPr>
+        <w:rPr>
+          <w:color w:val="000000" w:themeColor="text1"/>
+          <w:sz w:val="22"/>
+          <w:szCs w:val="22"/>
+        </w:rPr>
+      </w:pPr>
+    </w:p>
+    <w:p>
+      <w:pPr>
+        <w:rPr>
+          <w:b/>
+          <w:bCs/>
+          <w:color w:val="000000" w:themeColor="text1"/>
+          <w:u w:val="single"/>
+        </w:rPr>
+      </w:pPr>
+      <w:r>
+        <w:rPr>
+          <w:b/>
+          <w:bCs/>
+          <w:color w:val="000000" w:themeColor="text1"/>
+          <w:u w:val="single"/>
+        </w:rPr>
+        <w:t>THE BETWEEN OPERATOR</w:t>
+      </w:r>
+      <w:r>
+        <w:rPr>
+          <w:b/>
+          <w:bCs/>
+          <w:color w:val="000000" w:themeColor="text1"/>
+          <w:u w:val="single"/>
+        </w:rPr>
+        <w:t>:</w:t>
+      </w:r>
+    </w:p>
+    <w:p>
+      <w:pPr>
+        <w:rPr>
+          <w:b/>
+          <w:bCs/>
+          <w:color w:val="4472C4" w:themeColor="accent1"/>
+        </w:rPr>
+      </w:pPr>
+      <w:r>
+        <w:rPr>
+          <w:b/>
+          <w:bCs/>
+          <w:color w:val="4472C4" w:themeColor="accent1"/>
+        </w:rPr>
+        <w:t xml:space="preserve">SELECT customer_id, rental_date </w:t>
+      </w:r>
+    </w:p>
+    <w:p>
+      <w:pPr>
+        <w:rPr>
+          <w:b/>
+          <w:bCs/>
+          <w:color w:val="4472C4" w:themeColor="accent1"/>
+        </w:rPr>
+      </w:pPr>
+      <w:r>
+        <w:rPr>
+          <w:b/>
+          <w:bCs/>
+          <w:color w:val="4472C4" w:themeColor="accent1"/>
+        </w:rPr>
+        <w:t>FROM rental    </w:t>
+      </w:r>
+    </w:p>
+    <w:p>
+      <w:pPr>
+        <w:rPr>
+          <w:b/>
+          <w:bCs/>
+          <w:color w:val="4472C4" w:themeColor="accent1"/>
+        </w:rPr>
+      </w:pPr>
+      <w:r>
+        <w:rPr>
+          <w:b/>
+          <w:bCs/>
+          <w:color w:val="4472C4" w:themeColor="accent1"/>
+        </w:rPr>
+        <w:t>WHERE rental_date BETWEEN '2005-06-16' AND</w:t>
+      </w:r>
+      <w:r>
+        <w:rPr>
+          <w:b/>
+          <w:bCs/>
+          <w:color w:val="4472C4" w:themeColor="accent1"/>
+        </w:rPr>
+        <w:t xml:space="preserve"> </w:t>
+      </w:r>
+      <w:r>
+        <w:rPr>
+          <w:b/>
+          <w:bCs/>
+          <w:color w:val="4472C4" w:themeColor="accent1"/>
+        </w:rPr>
+        <w:t>'2005-06-14';</w:t>
+      </w:r>
+    </w:p>
+    <w:p>
+      <w:pPr>
+        <w:rPr>
+          <w:color w:val="000000" w:themeColor="text1"/>
+          <w:sz w:val="22"/>
+          <w:szCs w:val="22"/>
+        </w:rPr>
+      </w:pPr>
+      <w:r>
+        <w:rPr>
+          <w:color w:val="000000" w:themeColor="text1"/>
+          <w:sz w:val="22"/>
+          <w:szCs w:val="22"/>
+        </w:rPr>
+        <w:t>An important note is to put the lower boundary first before the upper boundary</w:t>
+      </w:r>
+    </w:p>
+    <w:p>
+      <w:pPr>
+        <w:rPr>
+          <w:color w:val="000000" w:themeColor="text1"/>
+          <w:sz w:val="22"/>
+          <w:szCs w:val="22"/>
+        </w:rPr>
+      </w:pPr>
+      <w:r>
+        <w:rPr>
+          <w:color w:val="000000" w:themeColor="text1"/>
+          <w:sz w:val="22"/>
+          <w:szCs w:val="22"/>
+        </w:rPr>
+        <w:t>It creates a logical range and its better to use.</w:t>
+      </w:r>
+      <w:r>
+        <w:rPr>
+          <w:color w:val="000000" w:themeColor="text1"/>
+          <w:sz w:val="22"/>
+          <w:szCs w:val="22"/>
+        </w:rPr>
+        <w:t xml:space="preserve"> The lower bound and upper bound are both included.</w:t>
+      </w:r>
+    </w:p>
+    <w:p>
+      <w:pPr>
+        <w:rPr>
+          <w:color w:val="000000" w:themeColor="text1"/>
+          <w:sz w:val="22"/>
+          <w:szCs w:val="22"/>
+        </w:rPr>
+      </w:pPr>
+    </w:p>
+    <w:p>
+      <w:pPr>
+        <w:rPr>
+          <w:color w:val="000000" w:themeColor="text1"/>
+          <w:sz w:val="22"/>
+          <w:szCs w:val="22"/>
+        </w:rPr>
+      </w:pPr>
+      <w:r>
+        <w:rPr>
+          <w:color w:val="000000" w:themeColor="text1"/>
+          <w:sz w:val="22"/>
+          <w:szCs w:val="22"/>
+        </w:rPr>
+        <w:t xml:space="preserve">SQL can filter not only numbers and dates, but also </w:t>
+      </w:r>
+      <w:r>
+        <w:rPr>
+          <w:b/>
+          <w:bCs/>
+          <w:color w:val="000000" w:themeColor="text1"/>
+          <w:sz w:val="22"/>
+          <w:szCs w:val="22"/>
+        </w:rPr>
+        <w:t>text (strings)</w:t>
+      </w:r>
+      <w:r>
+        <w:rPr>
+          <w:color w:val="000000" w:themeColor="text1"/>
+          <w:sz w:val="22"/>
+          <w:szCs w:val="22"/>
+        </w:rPr>
+        <w:t xml:space="preserve"> like names.</w:t>
+      </w:r>
+    </w:p>
+    <w:p>
+      <w:pPr>
+        <w:rPr>
+          <w:color w:val="000000" w:themeColor="text1"/>
+          <w:sz w:val="22"/>
+          <w:szCs w:val="22"/>
+        </w:rPr>
+      </w:pPr>
+    </w:p>
+    <w:p>
+      <w:pPr>
+        <w:rPr>
+          <w:b/>
+          <w:bCs/>
+          <w:color w:val="000000" w:themeColor="text1"/>
+          <w:u w:val="single"/>
+        </w:rPr>
+      </w:pPr>
+      <w:r>
+        <w:rPr>
+          <w:b/>
+          <w:bCs/>
+          <w:color w:val="000000" w:themeColor="text1"/>
+          <w:u w:val="single"/>
+        </w:rPr>
+        <w:t>Membership Conditions</w:t>
+      </w:r>
+      <w:r>
+        <w:rPr>
+          <w:b/>
+          <w:bCs/>
+          <w:color w:val="000000" w:themeColor="text1"/>
+          <w:u w:val="single"/>
+        </w:rPr>
+        <w:t>:</w:t>
+      </w:r>
+    </w:p>
+    <w:p>
+      <w:pPr>
+        <w:rPr>
+          <w:b/>
+          <w:bCs/>
+          <w:color w:val="4472C4" w:themeColor="accent1"/>
+        </w:rPr>
+      </w:pPr>
+      <w:r>
+        <w:rPr>
+          <w:b/>
+          <w:bCs/>
+          <w:color w:val="4472C4" w:themeColor="accent1"/>
+        </w:rPr>
+        <w:t>SELECT title, rating</w:t>
+      </w:r>
+    </w:p>
+    <w:p>
+      <w:pPr>
+        <w:rPr>
+          <w:b/>
+          <w:bCs/>
+          <w:color w:val="4472C4" w:themeColor="accent1"/>
+        </w:rPr>
+      </w:pPr>
+      <w:r>
+        <w:rPr>
+          <w:b/>
+          <w:bCs/>
+          <w:color w:val="4472C4" w:themeColor="accent1"/>
+        </w:rPr>
+        <w:t>FROM film</w:t>
+      </w:r>
+    </w:p>
+    <w:p>
+      <w:pPr>
+        <w:rPr>
+          <w:b/>
+          <w:bCs/>
+          <w:color w:val="4472C4" w:themeColor="accent1"/>
+        </w:rPr>
+      </w:pPr>
+      <w:r>
+        <w:rPr>
+          <w:b/>
+          <w:bCs/>
+          <w:color w:val="4472C4" w:themeColor="accent1"/>
+        </w:rPr>
+        <w:t>WHERE rating IN ('G', 'PG');</w:t>
+      </w:r>
+    </w:p>
+    <w:p>
+      <w:pPr>
+        <w:rPr>
+          <w:color w:val="000000" w:themeColor="text1"/>
+          <w:sz w:val="22"/>
+          <w:szCs w:val="22"/>
+        </w:rPr>
+      </w:pPr>
+      <w:r>
+        <w:rPr>
+          <w:color w:val="000000" w:themeColor="text1"/>
+          <w:sz w:val="22"/>
+          <w:szCs w:val="22"/>
+        </w:rPr>
+        <w:t>this is the same as writing WHERE rating = ‘G’ OR rating = ‘PG’</w:t>
+      </w:r>
+    </w:p>
+    <w:p>
+      <w:pPr>
+        <w:rPr>
+          <w:color w:val="000000" w:themeColor="text1"/>
+          <w:sz w:val="22"/>
+          <w:szCs w:val="22"/>
+        </w:rPr>
+      </w:pPr>
+      <w:r>
+        <w:rPr>
+          <w:color w:val="000000" w:themeColor="text1"/>
+          <w:sz w:val="22"/>
+          <w:szCs w:val="22"/>
+        </w:rPr>
+        <w:lastRenderedPageBreak/>
+        <w:t>however for readability its better to use the IN keyword</w:t>
+      </w:r>
+    </w:p>
+    <w:p>
+      <w:pPr>
+        <w:rPr>
+          <w:color w:val="000000" w:themeColor="text1"/>
+          <w:sz w:val="22"/>
+          <w:szCs w:val="22"/>
+        </w:rPr>
+      </w:pPr>
+    </w:p>
+    <w:p>
+      <w:pPr>
+        <w:rPr>
+          <w:b/>
+          <w:bCs/>
+          <w:color w:val="000000" w:themeColor="text1"/>
+          <w:u w:val="single"/>
+        </w:rPr>
+      </w:pPr>
+      <w:r>
+        <w:rPr>
+          <w:b/>
+          <w:bCs/>
+          <w:color w:val="000000" w:themeColor="text1"/>
+          <w:u w:val="single"/>
+        </w:rPr>
+        <w:t>USING SUBQUERIES</w:t>
+      </w:r>
+      <w:r>
+        <w:rPr>
+          <w:b/>
+          <w:bCs/>
+          <w:color w:val="000000" w:themeColor="text1"/>
+          <w:u w:val="single"/>
+        </w:rPr>
+        <w:t>:</w:t>
+      </w:r>
+    </w:p>
+    <w:p>
+      <w:pPr>
+        <w:rPr>
+          <w:color w:val="000000" w:themeColor="text1"/>
+          <w:sz w:val="22"/>
+          <w:szCs w:val="22"/>
+        </w:rPr>
+      </w:pPr>
+      <w:r>
+        <w:rPr>
+          <w:color w:val="000000" w:themeColor="text1"/>
+          <w:sz w:val="22"/>
+          <w:szCs w:val="22"/>
+        </w:rPr>
+        <w:t>We can also use sub queries to filter data. But this will be covered later. In the book</w:t>
+      </w:r>
+    </w:p>
+    <w:p>
+      <w:pPr>
+        <w:rPr>
+          <w:color w:val="000000" w:themeColor="text1"/>
+          <w:sz w:val="22"/>
+          <w:szCs w:val="22"/>
+        </w:rPr>
+      </w:pPr>
+    </w:p>
+    <w:p>
+      <w:pPr>
+        <w:rPr>
+          <w:b/>
+          <w:bCs/>
+          <w:color w:val="000000" w:themeColor="text1"/>
+          <w:sz w:val="22"/>
+          <w:szCs w:val="22"/>
+        </w:rPr>
+      </w:pPr>
+      <w:r>
+        <w:rPr>
+          <w:b/>
+          <w:bCs/>
+          <w:color w:val="000000" w:themeColor="text1"/>
+          <w:sz w:val="22"/>
+          <w:szCs w:val="22"/>
+        </w:rPr>
+        <w:t>NOT IN works the same as IN as logic but the opposite when it comes to the result.</w:t>
+      </w:r>
+    </w:p>
+    <w:p>
+      <w:pPr>
+        <w:rPr>
+          <w:b/>
+          <w:bCs/>
+          <w:color w:val="000000" w:themeColor="text1"/>
+          <w:sz w:val="22"/>
+          <w:szCs w:val="22"/>
+        </w:rPr>
+      </w:pPr>
+    </w:p>
+    <w:p>
+      <w:pPr>
+        <w:rPr>
+          <w:b/>
+          <w:bCs/>
+          <w:color w:val="000000" w:themeColor="text1"/>
+          <w:u w:val="single"/>
+        </w:rPr>
+      </w:pPr>
+      <w:r>
+        <w:rPr>
+          <w:b/>
+          <w:bCs/>
+          <w:color w:val="000000" w:themeColor="text1"/>
+          <w:u w:val="single"/>
+        </w:rPr>
+        <w:t>USING WILDCARDS</w:t>
+      </w:r>
+      <w:r>
+        <w:rPr>
+          <w:b/>
+          <w:bCs/>
+          <w:color w:val="000000" w:themeColor="text1"/>
+          <w:u w:val="single"/>
+        </w:rPr>
+        <w:t>:</w:t>
+      </w:r>
+    </w:p>
+    <w:p>
+      <w:pPr>
+        <w:rPr>
+          <w:color w:val="000000" w:themeColor="text1"/>
+          <w:sz w:val="22"/>
+          <w:szCs w:val="22"/>
+        </w:rPr>
+      </w:pPr>
+      <w:r>
+        <w:rPr>
+          <w:color w:val="000000" w:themeColor="text1"/>
+          <w:sz w:val="22"/>
+          <w:szCs w:val="22"/>
+        </w:rPr>
+        <w:t>Using the keyword Like “something” we can use expressions to find and compare columns, like regex in java. %means any amount of numbers and _ means exactly one character</w:t>
+      </w:r>
+    </w:p>
+    <w:p>
+      <w:pPr>
+        <w:rPr>
+          <w:b/>
+          <w:bCs/>
+          <w:color w:val="4472C4" w:themeColor="accent1"/>
+        </w:rPr>
+      </w:pPr>
+      <w:r>
+        <w:rPr>
+          <w:b/>
+          <w:bCs/>
+          <w:color w:val="4472C4" w:themeColor="accent1"/>
+        </w:rPr>
+        <w:t xml:space="preserve">SELECT last_name, first_name </w:t>
+      </w:r>
+    </w:p>
+    <w:p>
+      <w:pPr>
+        <w:rPr>
+          <w:b/>
+          <w:bCs/>
+          <w:color w:val="4472C4" w:themeColor="accent1"/>
+        </w:rPr>
+      </w:pPr>
+      <w:r>
+        <w:rPr>
+          <w:b/>
+          <w:bCs/>
+          <w:color w:val="4472C4" w:themeColor="accent1"/>
+        </w:rPr>
+        <w:t>FROM custome</w:t>
+      </w:r>
+    </w:p>
+    <w:p>
+      <w:pPr>
+        <w:rPr>
+          <w:b/>
+          <w:bCs/>
+          <w:color w:val="4472C4" w:themeColor="accent1"/>
+        </w:rPr>
+      </w:pPr>
+      <w:r>
+        <w:rPr>
+          <w:b/>
+          <w:bCs/>
+          <w:color w:val="4472C4" w:themeColor="accent1"/>
+        </w:rPr>
+        <w:t>WHERE last_name LIKE '_A_T%S';</w:t>
+      </w:r>
+    </w:p>
+    <w:p>
+      <w:pPr>
+        <w:rPr>
+          <w:color w:val="000000" w:themeColor="text1"/>
+          <w:sz w:val="22"/>
+          <w:szCs w:val="22"/>
+        </w:rPr>
+      </w:pPr>
+    </w:p>
+    <w:p>
+      <w:pPr>
+        <w:rPr>
+          <w:b/>
+          <w:bCs/>
+          <w:color w:val="000000" w:themeColor="text1"/>
+          <w:u w:val="single"/>
+        </w:rPr>
+      </w:pPr>
+      <w:r>
+        <w:rPr>
+          <w:b/>
+          <w:bCs/>
+          <w:color w:val="000000" w:themeColor="text1"/>
+          <w:u w:val="single"/>
+        </w:rPr>
+        <w:t>Null: That Four-Letter Word</w:t>
+      </w:r>
+      <w:r>
+        <w:rPr>
+          <w:b/>
+          <w:bCs/>
+          <w:color w:val="000000" w:themeColor="text1"/>
+          <w:u w:val="single"/>
+        </w:rPr>
+        <w:t>:</w:t>
+      </w:r>
+    </w:p>
+    <w:p>
+      <w:pPr>
+        <w:rPr>
+          <w:b/>
+          <w:bCs/>
+          <w:color w:val="000000" w:themeColor="text1"/>
+        </w:rPr>
+      </w:pPr>
+      <w:r>
+        <w:rPr>
+          <w:b/>
+          <w:bCs/>
+          <w:color w:val="000000" w:themeColor="text1"/>
+        </w:rPr>
+        <w:t xml:space="preserve">Cases where null is valid: </w:t>
+      </w:r>
+    </w:p>
+    <w:p>
+      <w:pPr>
+        <w:rPr>
+          <w:color w:val="000000" w:themeColor="text1"/>
+        </w:rPr>
+      </w:pPr>
+      <w:r>
+        <w:rPr>
+          <w:color w:val="000000" w:themeColor="text1"/>
+        </w:rPr>
+        <w:t xml:space="preserve">Not applicable Such as the employee ID column for a transaction that took place at an ATM machine </w:t>
+      </w:r>
+    </w:p>
+    <w:p>
+      <w:pPr>
+        <w:rPr>
+          <w:color w:val="000000" w:themeColor="text1"/>
+        </w:rPr>
+      </w:pPr>
+      <w:r>
+        <w:rPr>
+          <w:color w:val="000000" w:themeColor="text1"/>
+        </w:rPr>
+        <w:t xml:space="preserve">Value not yet known Such as when the federal ID is not known at the time a customer row is created </w:t>
+      </w:r>
+    </w:p>
+    <w:p>
+      <w:pPr>
+        <w:rPr>
+          <w:color w:val="000000" w:themeColor="text1"/>
+        </w:rPr>
+      </w:pPr>
+      <w:r>
+        <w:rPr>
+          <w:color w:val="000000" w:themeColor="text1"/>
+        </w:rPr>
+        <w:t>Value undefined Such as when an account is created for a product that has not yet been added to the database</w:t>
+      </w:r>
+    </w:p>
+    <w:p>
+      <w:pPr>
+        <w:rPr>
+          <w:color w:val="000000" w:themeColor="text1"/>
+        </w:rPr>
+      </w:pPr>
+      <w:r>
+        <w:rPr>
+          <w:color w:val="000000" w:themeColor="text1"/>
+        </w:rPr>
+        <w:t>When working with null, you should remember: An expression can be null, but it can never equal null. Two nulls are never equal to each other.</w:t>
+      </w:r>
+    </w:p>
+    <w:p>
+      <w:pPr>
+        <w:rPr>
+          <w:color w:val="000000" w:themeColor="text1"/>
+        </w:rPr>
+      </w:pPr>
+      <w:r>
+        <w:rPr>
+          <w:color w:val="000000" w:themeColor="text1"/>
+        </w:rPr>
+        <w:t>So when writing a code you can not write = null we should write is null</w:t>
+      </w:r>
     </w:p>
     <w:sectPr>
       <w:pgSz w:w="12240" w:h="15840"/>
@@ -6762,7 +6912,7 @@
   <w:style w:type="paragraph" w:default="1" w:styleId="Normal">
     <w:name w:val="Normal"/>
     <w:qFormat/>
-    <w:rsid w:val="003D7596"/>
+    <w:rsid w:val="00817AC9"/>
   </w:style>
   <w:style w:type="paragraph" w:styleId="Heading1">
     <w:name w:val="heading 1"/>

</xml_diff>

<commit_message>
add chapter 6 notes
</commit_message>
<xml_diff>
--- a/Book notes.docx
+++ b/Book notes.docx
@@ -9317,6 +9317,2205 @@
           <w:color w:val="4472C4" w:themeColor="accent1"/>
         </w:rPr>
         <w:t xml:space="preserve"> = m.id;</w:t>
+      </w:r>
+    </w:p>
+    <w:p>
+      <w:pPr>
+        <w:rPr>
+          <w:b/>
+          <w:bCs/>
+          <w:color w:val="4472C4" w:themeColor="accent1"/>
+        </w:rPr>
+      </w:pPr>
+    </w:p>
+    <w:p>
+      <w:pPr>
+        <w:rPr>
+          <w:b/>
+          <w:bCs/>
+          <w:color w:val="000000" w:themeColor="text1"/>
+          <w:u w:val="single"/>
+        </w:rPr>
+      </w:pPr>
+    </w:p>
+    <w:p>
+      <w:pPr>
+        <w:rPr>
+          <w:b/>
+          <w:bCs/>
+          <w:color w:val="000000" w:themeColor="text1"/>
+          <w:u w:val="single"/>
+        </w:rPr>
+      </w:pPr>
+    </w:p>
+    <w:p>
+      <w:pPr>
+        <w:rPr>
+          <w:b/>
+          <w:bCs/>
+          <w:color w:val="000000" w:themeColor="text1"/>
+          <w:u w:val="single"/>
+        </w:rPr>
+      </w:pPr>
+    </w:p>
+    <w:p>
+      <w:pPr>
+        <w:jc w:val="center"/>
+        <w:rPr>
+          <w:b/>
+          <w:bCs/>
+          <w:color w:val="EE0000"/>
+          <w:sz w:val="32"/>
+          <w:szCs w:val="32"/>
+          <w:u w:val="single"/>
+        </w:rPr>
+      </w:pPr>
+      <w:r>
+        <w:rPr>
+          <w:b/>
+          <w:bCs/>
+          <w:color w:val="EE0000"/>
+          <w:sz w:val="32"/>
+          <w:szCs w:val="32"/>
+          <w:u w:val="single"/>
+        </w:rPr>
+        <w:lastRenderedPageBreak/>
+        <w:t>Chapter 6- Working with sets</w:t>
+      </w:r>
+    </w:p>
+    <w:p>
+      <w:pPr>
+        <w:rPr>
+          <w:color w:val="000000" w:themeColor="text1"/>
+          <w:sz w:val="22"/>
+          <w:szCs w:val="22"/>
+        </w:rPr>
+      </w:pPr>
+      <w:r>
+        <w:rPr>
+          <w:color w:val="000000" w:themeColor="text1"/>
+          <w:sz w:val="22"/>
+          <w:szCs w:val="22"/>
+        </w:rPr>
+        <w:t>As easy as it may sounds, we should be able to use these terms as in set</w:t>
+      </w:r>
+    </w:p>
+    <w:p>
+      <w:pPr>
+        <w:rPr>
+          <w:color w:val="000000" w:themeColor="text1"/>
+          <w:sz w:val="22"/>
+          <w:szCs w:val="22"/>
+        </w:rPr>
+      </w:pPr>
+      <w:r>
+        <w:rPr>
+          <w:color w:val="000000" w:themeColor="text1"/>
+          <w:sz w:val="22"/>
+          <w:szCs w:val="22"/>
+        </w:rPr>
+        <w:t xml:space="preserve">A union B is what in A and </w:t>
+      </w:r>
+      <w:proofErr w:type="spellStart"/>
+      <w:r>
+        <w:rPr>
+          <w:color w:val="000000" w:themeColor="text1"/>
+          <w:sz w:val="22"/>
+          <w:szCs w:val="22"/>
+        </w:rPr>
+        <w:t>whats</w:t>
+      </w:r>
+      <w:proofErr w:type="spellEnd"/>
+      <w:r>
+        <w:rPr>
+          <w:color w:val="000000" w:themeColor="text1"/>
+          <w:sz w:val="22"/>
+          <w:szCs w:val="22"/>
+        </w:rPr>
+        <w:t xml:space="preserve"> in </w:t>
+      </w:r>
+      <w:proofErr w:type="spellStart"/>
+      <w:r>
+        <w:rPr>
+          <w:color w:val="000000" w:themeColor="text1"/>
+          <w:sz w:val="22"/>
+          <w:szCs w:val="22"/>
+        </w:rPr>
+        <w:t>B all</w:t>
+      </w:r>
+      <w:proofErr w:type="spellEnd"/>
+      <w:r>
+        <w:rPr>
+          <w:color w:val="000000" w:themeColor="text1"/>
+          <w:sz w:val="22"/>
+          <w:szCs w:val="22"/>
+        </w:rPr>
+        <w:t xml:space="preserve"> combined</w:t>
+      </w:r>
+    </w:p>
+    <w:p>
+      <w:pPr>
+        <w:rPr>
+          <w:color w:val="000000" w:themeColor="text1"/>
+          <w:sz w:val="22"/>
+          <w:szCs w:val="22"/>
+        </w:rPr>
+      </w:pPr>
+      <w:r>
+        <w:rPr>
+          <w:color w:val="000000" w:themeColor="text1"/>
+          <w:sz w:val="22"/>
+          <w:szCs w:val="22"/>
+        </w:rPr>
+        <w:t xml:space="preserve">A Intersect B is </w:t>
+      </w:r>
+      <w:proofErr w:type="spellStart"/>
+      <w:r>
+        <w:rPr>
+          <w:color w:val="000000" w:themeColor="text1"/>
+          <w:sz w:val="22"/>
+          <w:szCs w:val="22"/>
+        </w:rPr>
+        <w:t>whats</w:t>
+      </w:r>
+      <w:proofErr w:type="spellEnd"/>
+      <w:r>
+        <w:rPr>
+          <w:color w:val="000000" w:themeColor="text1"/>
+          <w:sz w:val="22"/>
+          <w:szCs w:val="22"/>
+        </w:rPr>
+        <w:t xml:space="preserve"> in A and </w:t>
+      </w:r>
+      <w:proofErr w:type="spellStart"/>
+      <w:r>
+        <w:rPr>
+          <w:color w:val="000000" w:themeColor="text1"/>
+          <w:sz w:val="22"/>
+          <w:szCs w:val="22"/>
+        </w:rPr>
+        <w:t>whats</w:t>
+      </w:r>
+      <w:proofErr w:type="spellEnd"/>
+      <w:r>
+        <w:rPr>
+          <w:color w:val="000000" w:themeColor="text1"/>
+          <w:sz w:val="22"/>
+          <w:szCs w:val="22"/>
+        </w:rPr>
+        <w:t xml:space="preserve"> in B as in common</w:t>
+      </w:r>
+    </w:p>
+    <w:p>
+      <w:pPr>
+        <w:rPr>
+          <w:color w:val="000000" w:themeColor="text1"/>
+          <w:sz w:val="22"/>
+          <w:szCs w:val="22"/>
+        </w:rPr>
+      </w:pPr>
+      <w:r>
+        <w:rPr>
+          <w:color w:val="000000" w:themeColor="text1"/>
+          <w:sz w:val="22"/>
+          <w:szCs w:val="22"/>
+        </w:rPr>
+        <w:t xml:space="preserve">A except B its </w:t>
+      </w:r>
+      <w:proofErr w:type="spellStart"/>
+      <w:r>
+        <w:rPr>
+          <w:color w:val="000000" w:themeColor="text1"/>
+          <w:sz w:val="22"/>
+          <w:szCs w:val="22"/>
+        </w:rPr>
+        <w:t>whats</w:t>
+      </w:r>
+      <w:proofErr w:type="spellEnd"/>
+      <w:r>
+        <w:rPr>
+          <w:color w:val="000000" w:themeColor="text1"/>
+          <w:sz w:val="22"/>
+          <w:szCs w:val="22"/>
+        </w:rPr>
+        <w:t xml:space="preserve"> in A and not in B, excluding the intersection between A and B </w:t>
+      </w:r>
+    </w:p>
+    <w:p>
+      <w:pPr>
+        <w:rPr>
+          <w:color w:val="000000" w:themeColor="text1"/>
+          <w:sz w:val="22"/>
+          <w:szCs w:val="22"/>
+        </w:rPr>
+      </w:pPr>
+      <w:r>
+        <w:rPr>
+          <w:color w:val="000000" w:themeColor="text1"/>
+          <w:sz w:val="22"/>
+          <w:szCs w:val="22"/>
+        </w:rPr>
+        <w:t xml:space="preserve">A except B union B except A its </w:t>
+      </w:r>
+      <w:proofErr w:type="spellStart"/>
+      <w:r>
+        <w:rPr>
+          <w:color w:val="000000" w:themeColor="text1"/>
+          <w:sz w:val="22"/>
+          <w:szCs w:val="22"/>
+        </w:rPr>
+        <w:t>whats</w:t>
+      </w:r>
+      <w:proofErr w:type="spellEnd"/>
+      <w:r>
+        <w:rPr>
+          <w:color w:val="000000" w:themeColor="text1"/>
+          <w:sz w:val="22"/>
+          <w:szCs w:val="22"/>
+        </w:rPr>
+        <w:t xml:space="preserve"> unique in A + what unique in B excluding the intersection between them</w:t>
+      </w:r>
+    </w:p>
+    <w:p>
+      <w:pPr>
+        <w:rPr>
+          <w:color w:val="000000" w:themeColor="text1"/>
+          <w:sz w:val="22"/>
+          <w:szCs w:val="22"/>
+        </w:rPr>
+      </w:pPr>
+    </w:p>
+    <w:p>
+      <w:pPr>
+        <w:rPr>
+          <w:b/>
+          <w:bCs/>
+          <w:color w:val="000000" w:themeColor="text1"/>
+          <w:u w:val="single"/>
+        </w:rPr>
+      </w:pPr>
+      <w:r>
+        <w:rPr>
+          <w:b/>
+          <w:bCs/>
+          <w:color w:val="000000" w:themeColor="text1"/>
+          <w:u w:val="single"/>
+        </w:rPr>
+        <w:t>Set Theory in Practice</w:t>
+      </w:r>
+      <w:r>
+        <w:rPr>
+          <w:b/>
+          <w:bCs/>
+          <w:color w:val="000000" w:themeColor="text1"/>
+          <w:u w:val="single"/>
+        </w:rPr>
+        <w:t>:</w:t>
+      </w:r>
+    </w:p>
+    <w:p>
+      <w:pPr>
+        <w:rPr>
+          <w:color w:val="000000" w:themeColor="text1"/>
+          <w:sz w:val="22"/>
+          <w:szCs w:val="22"/>
+        </w:rPr>
+      </w:pPr>
+      <w:r>
+        <w:rPr>
+          <w:color w:val="000000" w:themeColor="text1"/>
+          <w:sz w:val="22"/>
+          <w:szCs w:val="22"/>
+        </w:rPr>
+        <w:t>Therefore, when performing set operations</w:t>
+      </w:r>
+      <w:r>
+        <w:rPr>
+          <w:color w:val="000000" w:themeColor="text1"/>
+          <w:sz w:val="22"/>
+          <w:szCs w:val="22"/>
+        </w:rPr>
+        <w:t xml:space="preserve"> (union, intersect, except)</w:t>
+      </w:r>
+      <w:r>
+        <w:rPr>
+          <w:color w:val="000000" w:themeColor="text1"/>
+          <w:sz w:val="22"/>
+          <w:szCs w:val="22"/>
+        </w:rPr>
+        <w:t xml:space="preserve"> on two data sets, the following guidelines must apply: </w:t>
+      </w:r>
+    </w:p>
+    <w:p>
+      <w:pPr>
+        <w:rPr>
+          <w:color w:val="000000" w:themeColor="text1"/>
+          <w:sz w:val="22"/>
+          <w:szCs w:val="22"/>
+        </w:rPr>
+      </w:pPr>
+      <w:r>
+        <w:rPr>
+          <w:color w:val="000000" w:themeColor="text1"/>
+          <w:sz w:val="22"/>
+          <w:szCs w:val="22"/>
+        </w:rPr>
+        <w:t xml:space="preserve">Both data sets must have the same number of columns. </w:t>
+      </w:r>
+    </w:p>
+    <w:p>
+      <w:pPr>
+        <w:rPr>
+          <w:color w:val="000000" w:themeColor="text1"/>
+          <w:sz w:val="22"/>
+          <w:szCs w:val="22"/>
+        </w:rPr>
+      </w:pPr>
+      <w:r>
+        <w:rPr>
+          <w:color w:val="000000" w:themeColor="text1"/>
+          <w:sz w:val="22"/>
+          <w:szCs w:val="22"/>
+        </w:rPr>
+        <w:t>The data types of each column across the two data sets must be the same (or the server must be able to convert one to the other).</w:t>
+      </w:r>
+    </w:p>
+    <w:p>
+      <w:pPr>
+        <w:rPr>
+          <w:color w:val="000000" w:themeColor="text1"/>
+          <w:sz w:val="22"/>
+          <w:szCs w:val="22"/>
+        </w:rPr>
+      </w:pPr>
+    </w:p>
+    <w:p>
+      <w:pPr>
+        <w:rPr>
+          <w:color w:val="000000" w:themeColor="text1"/>
+          <w:sz w:val="22"/>
+          <w:szCs w:val="22"/>
+        </w:rPr>
+      </w:pPr>
+      <w:r>
+        <w:rPr>
+          <w:color w:val="000000" w:themeColor="text1"/>
+          <w:sz w:val="22"/>
+          <w:szCs w:val="22"/>
+        </w:rPr>
+        <w:t xml:space="preserve">You perform a set operation by placing a set operator between two select statements, as demonstrated by the following: </w:t>
+      </w:r>
+    </w:p>
+    <w:p>
+      <w:pPr>
+        <w:rPr>
+          <w:b/>
+          <w:bCs/>
+          <w:color w:val="4472C4" w:themeColor="accent1"/>
+        </w:rPr>
+      </w:pPr>
+      <w:r>
+        <w:rPr>
+          <w:b/>
+          <w:bCs/>
+          <w:color w:val="4472C4" w:themeColor="accent1"/>
+        </w:rPr>
+        <w:t>SELECT 1 num, '</w:t>
+      </w:r>
+      <w:proofErr w:type="spellStart"/>
+      <w:r>
+        <w:rPr>
+          <w:b/>
+          <w:bCs/>
+          <w:color w:val="4472C4" w:themeColor="accent1"/>
+        </w:rPr>
+        <w:t>abc</w:t>
+      </w:r>
+      <w:proofErr w:type="spellEnd"/>
+      <w:r>
+        <w:rPr>
+          <w:b/>
+          <w:bCs/>
+          <w:color w:val="4472C4" w:themeColor="accent1"/>
+        </w:rPr>
+        <w:t xml:space="preserve">' str </w:t>
+      </w:r>
+    </w:p>
+    <w:p>
+      <w:pPr>
+        <w:rPr>
+          <w:b/>
+          <w:bCs/>
+          <w:color w:val="4472C4" w:themeColor="accent1"/>
+        </w:rPr>
+      </w:pPr>
+      <w:r>
+        <w:rPr>
+          <w:b/>
+          <w:bCs/>
+          <w:color w:val="4472C4" w:themeColor="accent1"/>
+        </w:rPr>
+        <w:t xml:space="preserve">UNION </w:t>
+      </w:r>
+    </w:p>
+    <w:p>
+      <w:pPr>
+        <w:rPr>
+          <w:b/>
+          <w:bCs/>
+          <w:color w:val="4472C4" w:themeColor="accent1"/>
+        </w:rPr>
+      </w:pPr>
+      <w:r>
+        <w:rPr>
+          <w:b/>
+          <w:bCs/>
+          <w:color w:val="4472C4" w:themeColor="accent1"/>
+        </w:rPr>
+        <w:t>SELECT 9 num, '</w:t>
+      </w:r>
+      <w:proofErr w:type="spellStart"/>
+      <w:r>
+        <w:rPr>
+          <w:b/>
+          <w:bCs/>
+          <w:color w:val="4472C4" w:themeColor="accent1"/>
+        </w:rPr>
+        <w:t>xyz</w:t>
+      </w:r>
+      <w:proofErr w:type="spellEnd"/>
+      <w:r>
+        <w:rPr>
+          <w:b/>
+          <w:bCs/>
+          <w:color w:val="4472C4" w:themeColor="accent1"/>
+        </w:rPr>
+        <w:t>' str;</w:t>
+      </w:r>
+    </w:p>
+    <w:p>
+      <w:pPr>
+        <w:rPr>
+          <w:color w:val="000000" w:themeColor="text1"/>
+          <w:sz w:val="22"/>
+          <w:szCs w:val="22"/>
+        </w:rPr>
+      </w:pPr>
+    </w:p>
+    <w:p>
+      <w:pPr>
+        <w:rPr>
+          <w:b/>
+          <w:bCs/>
+          <w:color w:val="000000" w:themeColor="text1"/>
+        </w:rPr>
+      </w:pPr>
+      <w:r>
+        <w:rPr>
+          <w:b/>
+          <w:bCs/>
+          <w:color w:val="000000" w:themeColor="text1"/>
+        </w:rPr>
+        <w:t>compound query</w:t>
+      </w:r>
+      <w:r>
+        <w:rPr>
+          <w:b/>
+          <w:bCs/>
+          <w:color w:val="000000" w:themeColor="text1"/>
+        </w:rPr>
+        <w:t>: Union</w:t>
+      </w:r>
+    </w:p>
+    <w:p>
+      <w:pPr>
+        <w:rPr>
+          <w:color w:val="000000" w:themeColor="text1"/>
+          <w:sz w:val="22"/>
+          <w:szCs w:val="22"/>
+        </w:rPr>
+      </w:pPr>
+      <w:r>
+        <w:rPr>
+          <w:color w:val="000000" w:themeColor="text1"/>
+          <w:sz w:val="22"/>
+          <w:szCs w:val="22"/>
+        </w:rPr>
+        <w:t>it combines all the rows from the 2 select statements</w:t>
+      </w:r>
+    </w:p>
+    <w:p>
+      <w:pPr>
+        <w:rPr>
+          <w:color w:val="000000" w:themeColor="text1"/>
+          <w:sz w:val="22"/>
+          <w:szCs w:val="22"/>
+        </w:rPr>
+      </w:pPr>
+    </w:p>
+    <w:p>
+      <w:pPr>
+        <w:rPr>
+          <w:color w:val="000000" w:themeColor="text1"/>
+          <w:sz w:val="22"/>
+          <w:szCs w:val="22"/>
+        </w:rPr>
+      </w:pPr>
+    </w:p>
+    <w:p>
+      <w:pPr>
+        <w:rPr>
+          <w:color w:val="000000" w:themeColor="text1"/>
+          <w:sz w:val="22"/>
+          <w:szCs w:val="22"/>
+        </w:rPr>
+      </w:pPr>
+    </w:p>
+    <w:p>
+      <w:pPr>
+        <w:rPr>
+          <w:color w:val="000000" w:themeColor="text1"/>
+          <w:sz w:val="22"/>
+          <w:szCs w:val="22"/>
+        </w:rPr>
+      </w:pPr>
+    </w:p>
+    <w:p>
+      <w:pPr>
+        <w:rPr>
+          <w:color w:val="000000" w:themeColor="text1"/>
+          <w:sz w:val="22"/>
+          <w:szCs w:val="22"/>
+        </w:rPr>
+      </w:pPr>
+    </w:p>
+    <w:p>
+      <w:pPr>
+        <w:rPr>
+          <w:b/>
+          <w:bCs/>
+          <w:color w:val="000000" w:themeColor="text1"/>
+          <w:u w:val="single"/>
+        </w:rPr>
+      </w:pPr>
+      <w:r>
+        <w:rPr>
+          <w:b/>
+          <w:bCs/>
+          <w:color w:val="000000" w:themeColor="text1"/>
+          <w:u w:val="single"/>
+        </w:rPr>
+        <w:lastRenderedPageBreak/>
+        <w:t>The intersect Operator</w:t>
+      </w:r>
+      <w:r>
+        <w:rPr>
+          <w:b/>
+          <w:bCs/>
+          <w:color w:val="000000" w:themeColor="text1"/>
+          <w:u w:val="single"/>
+        </w:rPr>
+        <w:t>:</w:t>
+      </w:r>
+    </w:p>
+    <w:p>
+      <w:pPr>
+        <w:rPr>
+          <w:color w:val="000000" w:themeColor="text1"/>
+          <w:sz w:val="22"/>
+          <w:szCs w:val="22"/>
+        </w:rPr>
+      </w:pPr>
+      <w:r>
+        <w:rPr>
+          <w:color w:val="000000" w:themeColor="text1"/>
+          <w:sz w:val="22"/>
+          <w:szCs w:val="22"/>
+        </w:rPr>
+        <w:t>Intersect is used to return data rows that are equal in one or more tables</w:t>
+      </w:r>
+    </w:p>
+    <w:p>
+      <w:pPr>
+        <w:rPr>
+          <w:color w:val="000000" w:themeColor="text1"/>
+          <w:sz w:val="22"/>
+          <w:szCs w:val="22"/>
+        </w:rPr>
+      </w:pPr>
+      <w:proofErr w:type="gramStart"/>
+      <w:r>
+        <w:rPr>
+          <w:color w:val="000000" w:themeColor="text1"/>
+          <w:sz w:val="22"/>
+          <w:szCs w:val="22"/>
+        </w:rPr>
+        <w:t>Unfortunately</w:t>
+      </w:r>
+      <w:proofErr w:type="gramEnd"/>
+      <w:r>
+        <w:rPr>
+          <w:color w:val="000000" w:themeColor="text1"/>
+          <w:sz w:val="22"/>
+          <w:szCs w:val="22"/>
+        </w:rPr>
+        <w:t xml:space="preserve"> the </w:t>
+      </w:r>
+      <w:proofErr w:type="spellStart"/>
+      <w:r>
+        <w:rPr>
+          <w:color w:val="000000" w:themeColor="text1"/>
+          <w:sz w:val="22"/>
+          <w:szCs w:val="22"/>
+        </w:rPr>
+        <w:t>mysql</w:t>
+      </w:r>
+      <w:proofErr w:type="spellEnd"/>
+      <w:r>
+        <w:rPr>
+          <w:color w:val="000000" w:themeColor="text1"/>
+          <w:sz w:val="22"/>
+          <w:szCs w:val="22"/>
+        </w:rPr>
+        <w:t xml:space="preserve"> server does not support the intersect operation so we need to use an inner join instead and it works the same below are 2 examples.</w:t>
+      </w:r>
+    </w:p>
+    <w:p>
+      <w:pPr>
+        <w:rPr>
+          <w:color w:val="000000" w:themeColor="text1"/>
+          <w:sz w:val="22"/>
+          <w:szCs w:val="22"/>
+        </w:rPr>
+      </w:pPr>
+      <w:r>
+        <w:rPr>
+          <w:color w:val="000000" w:themeColor="text1"/>
+          <w:sz w:val="22"/>
+          <w:szCs w:val="22"/>
+        </w:rPr>
+        <w:t xml:space="preserve">We have </w:t>
+      </w:r>
+      <w:proofErr w:type="gramStart"/>
+      <w:r>
+        <w:rPr>
+          <w:color w:val="000000" w:themeColor="text1"/>
+          <w:sz w:val="22"/>
+          <w:szCs w:val="22"/>
+        </w:rPr>
+        <w:t>intersect</w:t>
+      </w:r>
+      <w:proofErr w:type="gramEnd"/>
+      <w:r>
+        <w:rPr>
+          <w:color w:val="000000" w:themeColor="text1"/>
+          <w:sz w:val="22"/>
+          <w:szCs w:val="22"/>
+        </w:rPr>
+        <w:t xml:space="preserve"> and intersect all. Intersect all does not remove duplicates</w:t>
+      </w:r>
+    </w:p>
+    <w:p>
+      <w:pPr>
+        <w:rPr>
+          <w:color w:val="000000" w:themeColor="text1"/>
+          <w:sz w:val="22"/>
+          <w:szCs w:val="22"/>
+        </w:rPr>
+      </w:pPr>
+      <w:r>
+        <w:rPr>
+          <w:color w:val="000000" w:themeColor="text1"/>
+          <w:sz w:val="22"/>
+          <w:szCs w:val="22"/>
+        </w:rPr>
+        <w:t>While the other removes duplicates.</w:t>
+      </w:r>
+    </w:p>
+    <w:p>
+      <w:pPr>
+        <w:rPr>
+          <w:b/>
+          <w:bCs/>
+          <w:color w:val="4472C4" w:themeColor="accent1"/>
+        </w:rPr>
+      </w:pPr>
+      <w:r>
+        <w:rPr>
+          <w:b/>
+          <w:bCs/>
+          <w:color w:val="4472C4" w:themeColor="accent1"/>
+        </w:rPr>
+        <w:t xml:space="preserve">SELECT </w:t>
+      </w:r>
+      <w:proofErr w:type="spellStart"/>
+      <w:proofErr w:type="gramStart"/>
+      <w:r>
+        <w:rPr>
+          <w:b/>
+          <w:bCs/>
+          <w:color w:val="4472C4" w:themeColor="accent1"/>
+        </w:rPr>
+        <w:t>c.first</w:t>
+      </w:r>
+      <w:proofErr w:type="gramEnd"/>
+      <w:r>
+        <w:rPr>
+          <w:b/>
+          <w:bCs/>
+          <w:color w:val="4472C4" w:themeColor="accent1"/>
+        </w:rPr>
+        <w:t>_name</w:t>
+      </w:r>
+      <w:proofErr w:type="spellEnd"/>
+      <w:r>
+        <w:rPr>
+          <w:b/>
+          <w:bCs/>
+          <w:color w:val="4472C4" w:themeColor="accent1"/>
+        </w:rPr>
+        <w:t xml:space="preserve">, </w:t>
+      </w:r>
+      <w:proofErr w:type="spellStart"/>
+      <w:proofErr w:type="gramStart"/>
+      <w:r>
+        <w:rPr>
+          <w:b/>
+          <w:bCs/>
+          <w:color w:val="4472C4" w:themeColor="accent1"/>
+        </w:rPr>
+        <w:t>c.last</w:t>
+      </w:r>
+      <w:proofErr w:type="gramEnd"/>
+      <w:r>
+        <w:rPr>
+          <w:b/>
+          <w:bCs/>
+          <w:color w:val="4472C4" w:themeColor="accent1"/>
+        </w:rPr>
+        <w:t>_name</w:t>
+      </w:r>
+      <w:proofErr w:type="spellEnd"/>
+      <w:r>
+        <w:rPr>
+          <w:b/>
+          <w:bCs/>
+          <w:color w:val="4472C4" w:themeColor="accent1"/>
+        </w:rPr>
+        <w:t xml:space="preserve"> </w:t>
+      </w:r>
+    </w:p>
+    <w:p>
+      <w:pPr>
+        <w:rPr>
+          <w:b/>
+          <w:bCs/>
+          <w:color w:val="4472C4" w:themeColor="accent1"/>
+        </w:rPr>
+      </w:pPr>
+      <w:r>
+        <w:rPr>
+          <w:b/>
+          <w:bCs/>
+          <w:color w:val="4472C4" w:themeColor="accent1"/>
+        </w:rPr>
+        <w:t xml:space="preserve">FROM customer c </w:t>
+      </w:r>
+    </w:p>
+    <w:p>
+      <w:pPr>
+        <w:rPr>
+          <w:b/>
+          <w:bCs/>
+          <w:color w:val="4472C4" w:themeColor="accent1"/>
+        </w:rPr>
+      </w:pPr>
+      <w:r>
+        <w:rPr>
+          <w:b/>
+          <w:bCs/>
+          <w:color w:val="4472C4" w:themeColor="accent1"/>
+        </w:rPr>
+        <w:t xml:space="preserve">INNER JOIN actor a </w:t>
+      </w:r>
+    </w:p>
+    <w:p>
+      <w:pPr>
+        <w:rPr>
+          <w:b/>
+          <w:bCs/>
+          <w:color w:val="4472C4" w:themeColor="accent1"/>
+        </w:rPr>
+      </w:pPr>
+      <w:r>
+        <w:rPr>
+          <w:b/>
+          <w:bCs/>
+          <w:color w:val="4472C4" w:themeColor="accent1"/>
+        </w:rPr>
+        <w:t xml:space="preserve">ON </w:t>
+      </w:r>
+      <w:proofErr w:type="spellStart"/>
+      <w:proofErr w:type="gramStart"/>
+      <w:r>
+        <w:rPr>
+          <w:b/>
+          <w:bCs/>
+          <w:color w:val="4472C4" w:themeColor="accent1"/>
+        </w:rPr>
+        <w:t>a.first</w:t>
+      </w:r>
+      <w:proofErr w:type="gramEnd"/>
+      <w:r>
+        <w:rPr>
+          <w:b/>
+          <w:bCs/>
+          <w:color w:val="4472C4" w:themeColor="accent1"/>
+        </w:rPr>
+        <w:t>_name</w:t>
+      </w:r>
+      <w:proofErr w:type="spellEnd"/>
+      <w:r>
+        <w:rPr>
+          <w:b/>
+          <w:bCs/>
+          <w:color w:val="4472C4" w:themeColor="accent1"/>
+        </w:rPr>
+        <w:t xml:space="preserve"> = </w:t>
+      </w:r>
+      <w:proofErr w:type="spellStart"/>
+      <w:proofErr w:type="gramStart"/>
+      <w:r>
+        <w:rPr>
+          <w:b/>
+          <w:bCs/>
+          <w:color w:val="4472C4" w:themeColor="accent1"/>
+        </w:rPr>
+        <w:t>c.first</w:t>
+      </w:r>
+      <w:proofErr w:type="gramEnd"/>
+      <w:r>
+        <w:rPr>
+          <w:b/>
+          <w:bCs/>
+          <w:color w:val="4472C4" w:themeColor="accent1"/>
+        </w:rPr>
+        <w:t>_name</w:t>
+      </w:r>
+      <w:proofErr w:type="spellEnd"/>
+    </w:p>
+    <w:p>
+      <w:pPr>
+        <w:rPr>
+          <w:b/>
+          <w:bCs/>
+          <w:color w:val="4472C4" w:themeColor="accent1"/>
+        </w:rPr>
+      </w:pPr>
+      <w:r>
+        <w:rPr>
+          <w:b/>
+          <w:bCs/>
+          <w:color w:val="4472C4" w:themeColor="accent1"/>
+        </w:rPr>
+        <w:t xml:space="preserve">AND </w:t>
+      </w:r>
+      <w:proofErr w:type="spellStart"/>
+      <w:proofErr w:type="gramStart"/>
+      <w:r>
+        <w:rPr>
+          <w:b/>
+          <w:bCs/>
+          <w:color w:val="4472C4" w:themeColor="accent1"/>
+        </w:rPr>
+        <w:t>a.last</w:t>
+      </w:r>
+      <w:proofErr w:type="gramEnd"/>
+      <w:r>
+        <w:rPr>
+          <w:b/>
+          <w:bCs/>
+          <w:color w:val="4472C4" w:themeColor="accent1"/>
+        </w:rPr>
+        <w:t>_name</w:t>
+      </w:r>
+      <w:proofErr w:type="spellEnd"/>
+      <w:r>
+        <w:rPr>
+          <w:b/>
+          <w:bCs/>
+          <w:color w:val="4472C4" w:themeColor="accent1"/>
+        </w:rPr>
+        <w:t xml:space="preserve"> = </w:t>
+      </w:r>
+      <w:proofErr w:type="spellStart"/>
+      <w:proofErr w:type="gramStart"/>
+      <w:r>
+        <w:rPr>
+          <w:b/>
+          <w:bCs/>
+          <w:color w:val="4472C4" w:themeColor="accent1"/>
+        </w:rPr>
+        <w:t>c.last</w:t>
+      </w:r>
+      <w:proofErr w:type="gramEnd"/>
+      <w:r>
+        <w:rPr>
+          <w:b/>
+          <w:bCs/>
+          <w:color w:val="4472C4" w:themeColor="accent1"/>
+        </w:rPr>
+        <w:t>_name</w:t>
+      </w:r>
+      <w:proofErr w:type="spellEnd"/>
+      <w:r>
+        <w:rPr>
+          <w:b/>
+          <w:bCs/>
+          <w:color w:val="4472C4" w:themeColor="accent1"/>
+        </w:rPr>
+        <w:t>;</w:t>
+      </w:r>
+    </w:p>
+    <w:p>
+      <w:pPr>
+        <w:rPr>
+          <w:b/>
+          <w:bCs/>
+          <w:color w:val="EE0000"/>
+        </w:rPr>
+      </w:pPr>
+      <w:r>
+        <w:rPr>
+          <w:b/>
+          <w:bCs/>
+          <w:color w:val="EE0000"/>
+        </w:rPr>
+        <w:t>That is the same as that:</w:t>
+      </w:r>
+    </w:p>
+    <w:p>
+      <w:pPr>
+        <w:rPr>
+          <w:b/>
+          <w:bCs/>
+          <w:color w:val="4472C4" w:themeColor="accent1"/>
+        </w:rPr>
+      </w:pPr>
+      <w:r>
+        <w:rPr>
+          <w:b/>
+          <w:bCs/>
+          <w:color w:val="4472C4" w:themeColor="accent1"/>
+        </w:rPr>
+        <w:t xml:space="preserve">SELECT </w:t>
+      </w:r>
+      <w:proofErr w:type="spellStart"/>
+      <w:proofErr w:type="gramStart"/>
+      <w:r>
+        <w:rPr>
+          <w:b/>
+          <w:bCs/>
+          <w:color w:val="4472C4" w:themeColor="accent1"/>
+        </w:rPr>
+        <w:t>c.first</w:t>
+      </w:r>
+      <w:proofErr w:type="gramEnd"/>
+      <w:r>
+        <w:rPr>
+          <w:b/>
+          <w:bCs/>
+          <w:color w:val="4472C4" w:themeColor="accent1"/>
+        </w:rPr>
+        <w:t>_name</w:t>
+      </w:r>
+      <w:proofErr w:type="spellEnd"/>
+      <w:r>
+        <w:rPr>
+          <w:b/>
+          <w:bCs/>
+          <w:color w:val="4472C4" w:themeColor="accent1"/>
+        </w:rPr>
+        <w:t xml:space="preserve">, </w:t>
+      </w:r>
+      <w:proofErr w:type="spellStart"/>
+      <w:proofErr w:type="gramStart"/>
+      <w:r>
+        <w:rPr>
+          <w:b/>
+          <w:bCs/>
+          <w:color w:val="4472C4" w:themeColor="accent1"/>
+        </w:rPr>
+        <w:t>c.last</w:t>
+      </w:r>
+      <w:proofErr w:type="gramEnd"/>
+      <w:r>
+        <w:rPr>
+          <w:b/>
+          <w:bCs/>
+          <w:color w:val="4472C4" w:themeColor="accent1"/>
+        </w:rPr>
+        <w:t>_name</w:t>
+      </w:r>
+      <w:proofErr w:type="spellEnd"/>
+      <w:r>
+        <w:rPr>
+          <w:b/>
+          <w:bCs/>
+          <w:color w:val="4472C4" w:themeColor="accent1"/>
+        </w:rPr>
+        <w:t xml:space="preserve"> </w:t>
+      </w:r>
+    </w:p>
+    <w:p>
+      <w:pPr>
+        <w:rPr>
+          <w:b/>
+          <w:bCs/>
+          <w:color w:val="4472C4" w:themeColor="accent1"/>
+        </w:rPr>
+      </w:pPr>
+      <w:r>
+        <w:rPr>
+          <w:b/>
+          <w:bCs/>
+          <w:color w:val="4472C4" w:themeColor="accent1"/>
+        </w:rPr>
+        <w:t xml:space="preserve">FROM customer c </w:t>
+      </w:r>
+    </w:p>
+    <w:p>
+      <w:pPr>
+        <w:rPr>
+          <w:b/>
+          <w:bCs/>
+          <w:color w:val="4472C4" w:themeColor="accent1"/>
+        </w:rPr>
+      </w:pPr>
+      <w:r>
+        <w:rPr>
+          <w:b/>
+          <w:bCs/>
+          <w:color w:val="4472C4" w:themeColor="accent1"/>
+        </w:rPr>
+        <w:t xml:space="preserve">INTERSECT </w:t>
+      </w:r>
+    </w:p>
+    <w:p>
+      <w:pPr>
+        <w:rPr>
+          <w:b/>
+          <w:bCs/>
+          <w:color w:val="4472C4" w:themeColor="accent1"/>
+        </w:rPr>
+      </w:pPr>
+      <w:r>
+        <w:rPr>
+          <w:b/>
+          <w:bCs/>
+          <w:color w:val="4472C4" w:themeColor="accent1"/>
+        </w:rPr>
+        <w:t xml:space="preserve">SELECT </w:t>
+      </w:r>
+      <w:proofErr w:type="spellStart"/>
+      <w:proofErr w:type="gramStart"/>
+      <w:r>
+        <w:rPr>
+          <w:b/>
+          <w:bCs/>
+          <w:color w:val="4472C4" w:themeColor="accent1"/>
+        </w:rPr>
+        <w:t>a.first</w:t>
+      </w:r>
+      <w:proofErr w:type="gramEnd"/>
+      <w:r>
+        <w:rPr>
+          <w:b/>
+          <w:bCs/>
+          <w:color w:val="4472C4" w:themeColor="accent1"/>
+        </w:rPr>
+        <w:t>_name</w:t>
+      </w:r>
+      <w:proofErr w:type="spellEnd"/>
+      <w:r>
+        <w:rPr>
+          <w:b/>
+          <w:bCs/>
+          <w:color w:val="4472C4" w:themeColor="accent1"/>
+        </w:rPr>
+        <w:t xml:space="preserve">, </w:t>
+      </w:r>
+      <w:proofErr w:type="spellStart"/>
+      <w:proofErr w:type="gramStart"/>
+      <w:r>
+        <w:rPr>
+          <w:b/>
+          <w:bCs/>
+          <w:color w:val="4472C4" w:themeColor="accent1"/>
+        </w:rPr>
+        <w:t>a.last</w:t>
+      </w:r>
+      <w:proofErr w:type="gramEnd"/>
+      <w:r>
+        <w:rPr>
+          <w:b/>
+          <w:bCs/>
+          <w:color w:val="4472C4" w:themeColor="accent1"/>
+        </w:rPr>
+        <w:t>_name</w:t>
+      </w:r>
+      <w:proofErr w:type="spellEnd"/>
+      <w:r>
+        <w:rPr>
+          <w:b/>
+          <w:bCs/>
+          <w:color w:val="4472C4" w:themeColor="accent1"/>
+        </w:rPr>
+        <w:t xml:space="preserve"> </w:t>
+      </w:r>
+    </w:p>
+    <w:p>
+      <w:pPr>
+        <w:rPr>
+          <w:b/>
+          <w:bCs/>
+          <w:color w:val="4472C4" w:themeColor="accent1"/>
+        </w:rPr>
+      </w:pPr>
+      <w:r>
+        <w:rPr>
+          <w:b/>
+          <w:bCs/>
+          <w:color w:val="4472C4" w:themeColor="accent1"/>
+        </w:rPr>
+        <w:t xml:space="preserve">FROM actor </w:t>
+      </w:r>
+      <w:proofErr w:type="gramStart"/>
+      <w:r>
+        <w:rPr>
+          <w:b/>
+          <w:bCs/>
+          <w:color w:val="4472C4" w:themeColor="accent1"/>
+        </w:rPr>
+        <w:t>a ;</w:t>
+      </w:r>
+      <w:proofErr w:type="gramEnd"/>
+      <w:r>
+        <w:rPr>
+          <w:b/>
+          <w:bCs/>
+          <w:color w:val="4472C4" w:themeColor="accent1"/>
+        </w:rPr>
+        <w:t xml:space="preserve"> </w:t>
+      </w:r>
+    </w:p>
+    <w:p>
+      <w:pPr>
+        <w:rPr>
+          <w:b/>
+          <w:bCs/>
+          <w:color w:val="4472C4" w:themeColor="accent1"/>
+        </w:rPr>
+      </w:pPr>
+    </w:p>
+    <w:p>
+      <w:pPr>
+        <w:rPr>
+          <w:b/>
+          <w:bCs/>
+          <w:color w:val="000000" w:themeColor="text1"/>
+          <w:u w:val="single"/>
+        </w:rPr>
+      </w:pPr>
+      <w:r>
+        <w:rPr>
+          <w:b/>
+          <w:bCs/>
+          <w:color w:val="000000" w:themeColor="text1"/>
+          <w:u w:val="single"/>
+        </w:rPr>
+        <w:t>The except Operator</w:t>
+      </w:r>
+      <w:r>
+        <w:rPr>
+          <w:b/>
+          <w:bCs/>
+          <w:color w:val="000000" w:themeColor="text1"/>
+          <w:u w:val="single"/>
+        </w:rPr>
+        <w:t>:</w:t>
+      </w:r>
+    </w:p>
+    <w:p>
+      <w:pPr>
+        <w:rPr>
+          <w:color w:val="000000" w:themeColor="text1"/>
+          <w:sz w:val="22"/>
+          <w:szCs w:val="22"/>
+        </w:rPr>
+      </w:pPr>
+      <w:r>
+        <w:rPr>
+          <w:color w:val="000000" w:themeColor="text1"/>
+          <w:sz w:val="22"/>
+          <w:szCs w:val="22"/>
+        </w:rPr>
+        <w:t>Therefore, the difference between the two operations is that except removes all occurrences of duplicate data from set A, whereas except all removes only one occurrence of duplicate data from set A for every occurrence in set B.</w:t>
+      </w:r>
+    </w:p>
+    <w:p>
+      <w:pPr>
+        <w:rPr>
+          <w:color w:val="000000" w:themeColor="text1"/>
+          <w:sz w:val="22"/>
+          <w:szCs w:val="22"/>
+        </w:rPr>
+      </w:pPr>
+    </w:p>
+    <w:p>
+      <w:pPr>
+        <w:rPr>
+          <w:b/>
+          <w:bCs/>
+          <w:color w:val="000000" w:themeColor="text1"/>
+          <w:u w:val="single"/>
+        </w:rPr>
+      </w:pPr>
+      <w:r>
+        <w:rPr>
+          <w:b/>
+          <w:bCs/>
+          <w:color w:val="000000" w:themeColor="text1"/>
+          <w:u w:val="single"/>
+        </w:rPr>
+        <w:t>Set Operation Rules</w:t>
+      </w:r>
+      <w:r>
+        <w:rPr>
+          <w:b/>
+          <w:bCs/>
+          <w:color w:val="000000" w:themeColor="text1"/>
+          <w:u w:val="single"/>
+        </w:rPr>
+        <w:t>:</w:t>
+      </w:r>
+    </w:p>
+    <w:p>
+      <w:pPr>
+        <w:rPr>
+          <w:color w:val="000000" w:themeColor="text1"/>
+          <w:sz w:val="22"/>
+          <w:szCs w:val="22"/>
+        </w:rPr>
+      </w:pPr>
+      <w:r>
+        <w:rPr>
+          <w:color w:val="000000" w:themeColor="text1"/>
+          <w:sz w:val="22"/>
+          <w:szCs w:val="22"/>
+        </w:rPr>
+        <w:t xml:space="preserve"> The following sections outline some rules that you must follow when working with compound queries.</w:t>
+      </w:r>
+    </w:p>
+    <w:p>
+      <w:pPr>
+        <w:rPr>
+          <w:color w:val="000000" w:themeColor="text1"/>
+          <w:sz w:val="22"/>
+          <w:szCs w:val="22"/>
+        </w:rPr>
+      </w:pPr>
+      <w:r>
+        <w:rPr>
+          <w:color w:val="000000" w:themeColor="text1"/>
+          <w:sz w:val="22"/>
+          <w:szCs w:val="22"/>
+        </w:rPr>
+        <w:t>Order by is used to sort our result of the operation using a column name that should be in our query result.</w:t>
+      </w:r>
+    </w:p>
+    <w:p>
+      <w:pPr>
+        <w:rPr>
+          <w:color w:val="EE0000"/>
+          <w:sz w:val="22"/>
+          <w:szCs w:val="22"/>
+        </w:rPr>
+      </w:pPr>
+      <w:r>
+        <w:rPr>
+          <w:color w:val="EE0000"/>
+          <w:sz w:val="22"/>
+          <w:szCs w:val="22"/>
+        </w:rPr>
+        <w:lastRenderedPageBreak/>
+        <w:t>In general, compound queries containing three or more queries are evaluated in order from top to bottom,</w:t>
+      </w:r>
+    </w:p>
+    <w:p>
+      <w:pPr>
+        <w:rPr>
+          <w:b/>
+          <w:bCs/>
+          <w:color w:val="EE0000"/>
+          <w:sz w:val="22"/>
+          <w:szCs w:val="22"/>
+        </w:rPr>
+      </w:pPr>
+      <w:r>
+        <w:rPr>
+          <w:b/>
+          <w:bCs/>
+          <w:color w:val="EE0000"/>
+          <w:sz w:val="22"/>
+          <w:szCs w:val="22"/>
+        </w:rPr>
+        <w:t>Explaining:</w:t>
+      </w:r>
+    </w:p>
+    <w:p>
+      <w:pPr>
+        <w:rPr>
+          <w:color w:val="000000" w:themeColor="text1"/>
+          <w:sz w:val="22"/>
+          <w:szCs w:val="22"/>
+        </w:rPr>
+      </w:pPr>
+      <w:r>
+        <w:rPr>
+          <w:color w:val="000000" w:themeColor="text1"/>
+          <w:sz w:val="22"/>
+          <w:szCs w:val="22"/>
+        </w:rPr>
+        <w:t xml:space="preserve">Starting from top to bottom we select all the first and last name of actors starting with j as first name and starting with d union here deletes any duplicate, combined </w:t>
+      </w:r>
+      <w:proofErr w:type="spellStart"/>
+      <w:r>
+        <w:rPr>
+          <w:color w:val="000000" w:themeColor="text1"/>
+          <w:sz w:val="22"/>
+          <w:szCs w:val="22"/>
+        </w:rPr>
+        <w:t>witht</w:t>
+      </w:r>
+      <w:proofErr w:type="spellEnd"/>
+      <w:r>
+        <w:rPr>
+          <w:color w:val="000000" w:themeColor="text1"/>
+          <w:sz w:val="22"/>
+          <w:szCs w:val="22"/>
+        </w:rPr>
+        <w:t xml:space="preserve"> the first and the </w:t>
+      </w:r>
+      <w:proofErr w:type="spellStart"/>
+      <w:r>
+        <w:rPr>
+          <w:color w:val="000000" w:themeColor="text1"/>
+          <w:sz w:val="22"/>
+          <w:szCs w:val="22"/>
+        </w:rPr>
+        <w:t>alst</w:t>
+      </w:r>
+      <w:proofErr w:type="spellEnd"/>
+      <w:r>
+        <w:rPr>
+          <w:color w:val="000000" w:themeColor="text1"/>
+          <w:sz w:val="22"/>
+          <w:szCs w:val="22"/>
+        </w:rPr>
+        <w:t xml:space="preserve"> name of actors starting with m and starting with t but again any duplicates are deleted then we add customers of name j and last d but we leave duplicates, which means any duplicate with the first query would be </w:t>
+      </w:r>
+      <w:proofErr w:type="spellStart"/>
+      <w:r>
+        <w:rPr>
+          <w:color w:val="000000" w:themeColor="text1"/>
+          <w:sz w:val="22"/>
+          <w:szCs w:val="22"/>
+        </w:rPr>
+        <w:t>unioned</w:t>
+      </w:r>
+      <w:proofErr w:type="spellEnd"/>
+      <w:r>
+        <w:rPr>
+          <w:color w:val="000000" w:themeColor="text1"/>
+          <w:sz w:val="22"/>
+          <w:szCs w:val="22"/>
+        </w:rPr>
+        <w:t xml:space="preserve"> at the end with that last query</w:t>
+      </w:r>
+    </w:p>
+    <w:p>
+      <w:pPr>
+        <w:rPr>
+          <w:color w:val="000000" w:themeColor="text1"/>
+          <w:sz w:val="22"/>
+          <w:szCs w:val="22"/>
+        </w:rPr>
+      </w:pPr>
+    </w:p>
+    <w:p>
+      <w:pPr>
+        <w:rPr>
+          <w:b/>
+          <w:bCs/>
+          <w:color w:val="4472C4" w:themeColor="accent1"/>
+        </w:rPr>
+      </w:pPr>
+      <w:r>
+        <w:rPr>
+          <w:b/>
+          <w:bCs/>
+          <w:color w:val="4472C4" w:themeColor="accent1"/>
+        </w:rPr>
+        <w:t xml:space="preserve">SELECT </w:t>
+      </w:r>
+      <w:proofErr w:type="spellStart"/>
+      <w:proofErr w:type="gramStart"/>
+      <w:r>
+        <w:rPr>
+          <w:b/>
+          <w:bCs/>
+          <w:color w:val="4472C4" w:themeColor="accent1"/>
+        </w:rPr>
+        <w:t>a.first</w:t>
+      </w:r>
+      <w:proofErr w:type="gramEnd"/>
+      <w:r>
+        <w:rPr>
+          <w:b/>
+          <w:bCs/>
+          <w:color w:val="4472C4" w:themeColor="accent1"/>
+        </w:rPr>
+        <w:t>_name</w:t>
+      </w:r>
+      <w:proofErr w:type="spellEnd"/>
+      <w:r>
+        <w:rPr>
+          <w:b/>
+          <w:bCs/>
+          <w:color w:val="4472C4" w:themeColor="accent1"/>
+        </w:rPr>
+        <w:t xml:space="preserve">, </w:t>
+      </w:r>
+      <w:proofErr w:type="spellStart"/>
+      <w:proofErr w:type="gramStart"/>
+      <w:r>
+        <w:rPr>
+          <w:b/>
+          <w:bCs/>
+          <w:color w:val="4472C4" w:themeColor="accent1"/>
+        </w:rPr>
+        <w:t>a.last</w:t>
+      </w:r>
+      <w:proofErr w:type="gramEnd"/>
+      <w:r>
+        <w:rPr>
+          <w:b/>
+          <w:bCs/>
+          <w:color w:val="4472C4" w:themeColor="accent1"/>
+        </w:rPr>
+        <w:t>_name</w:t>
+      </w:r>
+      <w:proofErr w:type="spellEnd"/>
+      <w:r>
+        <w:rPr>
+          <w:b/>
+          <w:bCs/>
+          <w:color w:val="4472C4" w:themeColor="accent1"/>
+        </w:rPr>
+        <w:t xml:space="preserve">   </w:t>
+      </w:r>
+    </w:p>
+    <w:p>
+      <w:pPr>
+        <w:rPr>
+          <w:b/>
+          <w:bCs/>
+          <w:color w:val="4472C4" w:themeColor="accent1"/>
+        </w:rPr>
+      </w:pPr>
+      <w:r>
+        <w:rPr>
+          <w:b/>
+          <w:bCs/>
+          <w:color w:val="4472C4" w:themeColor="accent1"/>
+        </w:rPr>
+        <w:t xml:space="preserve">FROM actor a     </w:t>
+      </w:r>
+    </w:p>
+    <w:p>
+      <w:pPr>
+        <w:rPr>
+          <w:b/>
+          <w:bCs/>
+          <w:color w:val="4472C4" w:themeColor="accent1"/>
+        </w:rPr>
+      </w:pPr>
+      <w:r>
+        <w:rPr>
+          <w:b/>
+          <w:bCs/>
+          <w:color w:val="4472C4" w:themeColor="accent1"/>
+        </w:rPr>
+        <w:t xml:space="preserve">WHERE </w:t>
+      </w:r>
+      <w:proofErr w:type="spellStart"/>
+      <w:proofErr w:type="gramStart"/>
+      <w:r>
+        <w:rPr>
+          <w:b/>
+          <w:bCs/>
+          <w:color w:val="4472C4" w:themeColor="accent1"/>
+        </w:rPr>
+        <w:t>a.first</w:t>
+      </w:r>
+      <w:proofErr w:type="gramEnd"/>
+      <w:r>
+        <w:rPr>
+          <w:b/>
+          <w:bCs/>
+          <w:color w:val="4472C4" w:themeColor="accent1"/>
+        </w:rPr>
+        <w:t>_name</w:t>
+      </w:r>
+      <w:proofErr w:type="spellEnd"/>
+      <w:r>
+        <w:rPr>
+          <w:b/>
+          <w:bCs/>
+          <w:color w:val="4472C4" w:themeColor="accent1"/>
+        </w:rPr>
+        <w:t xml:space="preserve"> LIKE 'J%' AND </w:t>
+      </w:r>
+      <w:proofErr w:type="spellStart"/>
+      <w:proofErr w:type="gramStart"/>
+      <w:r>
+        <w:rPr>
+          <w:b/>
+          <w:bCs/>
+          <w:color w:val="4472C4" w:themeColor="accent1"/>
+        </w:rPr>
+        <w:t>a.last</w:t>
+      </w:r>
+      <w:proofErr w:type="gramEnd"/>
+      <w:r>
+        <w:rPr>
+          <w:b/>
+          <w:bCs/>
+          <w:color w:val="4472C4" w:themeColor="accent1"/>
+        </w:rPr>
+        <w:t>_name</w:t>
+      </w:r>
+      <w:proofErr w:type="spellEnd"/>
+      <w:r>
+        <w:rPr>
+          <w:b/>
+          <w:bCs/>
+          <w:color w:val="4472C4" w:themeColor="accent1"/>
+        </w:rPr>
+        <w:t xml:space="preserve"> LIKE 'D%'     </w:t>
+      </w:r>
+    </w:p>
+    <w:p>
+      <w:pPr>
+        <w:rPr>
+          <w:b/>
+          <w:bCs/>
+          <w:color w:val="4472C4" w:themeColor="accent1"/>
+        </w:rPr>
+      </w:pPr>
+      <w:r>
+        <w:rPr>
+          <w:b/>
+          <w:bCs/>
+          <w:color w:val="4472C4" w:themeColor="accent1"/>
+        </w:rPr>
+        <w:t xml:space="preserve"> UNION     </w:t>
+      </w:r>
+    </w:p>
+    <w:p>
+      <w:pPr>
+        <w:rPr>
+          <w:b/>
+          <w:bCs/>
+          <w:color w:val="4472C4" w:themeColor="accent1"/>
+        </w:rPr>
+      </w:pPr>
+      <w:r>
+        <w:rPr>
+          <w:b/>
+          <w:bCs/>
+          <w:color w:val="4472C4" w:themeColor="accent1"/>
+        </w:rPr>
+        <w:t xml:space="preserve">SELECT </w:t>
+      </w:r>
+      <w:proofErr w:type="spellStart"/>
+      <w:proofErr w:type="gramStart"/>
+      <w:r>
+        <w:rPr>
+          <w:b/>
+          <w:bCs/>
+          <w:color w:val="4472C4" w:themeColor="accent1"/>
+        </w:rPr>
+        <w:t>a.first</w:t>
+      </w:r>
+      <w:proofErr w:type="gramEnd"/>
+      <w:r>
+        <w:rPr>
+          <w:b/>
+          <w:bCs/>
+          <w:color w:val="4472C4" w:themeColor="accent1"/>
+        </w:rPr>
+        <w:t>_name</w:t>
+      </w:r>
+      <w:proofErr w:type="spellEnd"/>
+      <w:r>
+        <w:rPr>
+          <w:b/>
+          <w:bCs/>
+          <w:color w:val="4472C4" w:themeColor="accent1"/>
+        </w:rPr>
+        <w:t xml:space="preserve">, </w:t>
+      </w:r>
+      <w:proofErr w:type="spellStart"/>
+      <w:proofErr w:type="gramStart"/>
+      <w:r>
+        <w:rPr>
+          <w:b/>
+          <w:bCs/>
+          <w:color w:val="4472C4" w:themeColor="accent1"/>
+        </w:rPr>
+        <w:t>a.last</w:t>
+      </w:r>
+      <w:proofErr w:type="gramEnd"/>
+      <w:r>
+        <w:rPr>
+          <w:b/>
+          <w:bCs/>
+          <w:color w:val="4472C4" w:themeColor="accent1"/>
+        </w:rPr>
+        <w:t>_name</w:t>
+      </w:r>
+      <w:proofErr w:type="spellEnd"/>
+      <w:r>
+        <w:rPr>
+          <w:b/>
+          <w:bCs/>
+          <w:color w:val="4472C4" w:themeColor="accent1"/>
+        </w:rPr>
+        <w:t xml:space="preserve">     </w:t>
+      </w:r>
+    </w:p>
+    <w:p>
+      <w:pPr>
+        <w:rPr>
+          <w:b/>
+          <w:bCs/>
+          <w:color w:val="4472C4" w:themeColor="accent1"/>
+        </w:rPr>
+      </w:pPr>
+      <w:r>
+        <w:rPr>
+          <w:b/>
+          <w:bCs/>
+          <w:color w:val="4472C4" w:themeColor="accent1"/>
+        </w:rPr>
+        <w:t xml:space="preserve">FROM actor a      </w:t>
+      </w:r>
+    </w:p>
+    <w:p>
+      <w:pPr>
+        <w:rPr>
+          <w:b/>
+          <w:bCs/>
+          <w:color w:val="4472C4" w:themeColor="accent1"/>
+        </w:rPr>
+      </w:pPr>
+      <w:r>
+        <w:rPr>
+          <w:b/>
+          <w:bCs/>
+          <w:color w:val="4472C4" w:themeColor="accent1"/>
+        </w:rPr>
+        <w:t xml:space="preserve">WHERE </w:t>
+      </w:r>
+      <w:proofErr w:type="spellStart"/>
+      <w:proofErr w:type="gramStart"/>
+      <w:r>
+        <w:rPr>
+          <w:b/>
+          <w:bCs/>
+          <w:color w:val="4472C4" w:themeColor="accent1"/>
+        </w:rPr>
+        <w:t>a.first</w:t>
+      </w:r>
+      <w:proofErr w:type="gramEnd"/>
+      <w:r>
+        <w:rPr>
+          <w:b/>
+          <w:bCs/>
+          <w:color w:val="4472C4" w:themeColor="accent1"/>
+        </w:rPr>
+        <w:t>_name</w:t>
+      </w:r>
+      <w:proofErr w:type="spellEnd"/>
+      <w:r>
+        <w:rPr>
+          <w:b/>
+          <w:bCs/>
+          <w:color w:val="4472C4" w:themeColor="accent1"/>
+        </w:rPr>
+        <w:t xml:space="preserve"> LIKE 'M%' AND </w:t>
+      </w:r>
+      <w:proofErr w:type="spellStart"/>
+      <w:proofErr w:type="gramStart"/>
+      <w:r>
+        <w:rPr>
+          <w:b/>
+          <w:bCs/>
+          <w:color w:val="4472C4" w:themeColor="accent1"/>
+        </w:rPr>
+        <w:t>a.last</w:t>
+      </w:r>
+      <w:proofErr w:type="gramEnd"/>
+      <w:r>
+        <w:rPr>
+          <w:b/>
+          <w:bCs/>
+          <w:color w:val="4472C4" w:themeColor="accent1"/>
+        </w:rPr>
+        <w:t>_name</w:t>
+      </w:r>
+      <w:proofErr w:type="spellEnd"/>
+      <w:r>
+        <w:rPr>
+          <w:b/>
+          <w:bCs/>
+          <w:color w:val="4472C4" w:themeColor="accent1"/>
+        </w:rPr>
+        <w:t xml:space="preserve"> LIKE 'T%'     </w:t>
+      </w:r>
+    </w:p>
+    <w:p>
+      <w:pPr>
+        <w:rPr>
+          <w:b/>
+          <w:bCs/>
+          <w:color w:val="4472C4" w:themeColor="accent1"/>
+        </w:rPr>
+      </w:pPr>
+      <w:r>
+        <w:rPr>
+          <w:b/>
+          <w:bCs/>
+          <w:color w:val="4472C4" w:themeColor="accent1"/>
+        </w:rPr>
+        <w:t xml:space="preserve">UNION ALL     -&gt; SELECT </w:t>
+      </w:r>
+      <w:proofErr w:type="spellStart"/>
+      <w:proofErr w:type="gramStart"/>
+      <w:r>
+        <w:rPr>
+          <w:b/>
+          <w:bCs/>
+          <w:color w:val="4472C4" w:themeColor="accent1"/>
+        </w:rPr>
+        <w:t>c.first</w:t>
+      </w:r>
+      <w:proofErr w:type="gramEnd"/>
+      <w:r>
+        <w:rPr>
+          <w:b/>
+          <w:bCs/>
+          <w:color w:val="4472C4" w:themeColor="accent1"/>
+        </w:rPr>
+        <w:t>_name</w:t>
+      </w:r>
+      <w:proofErr w:type="spellEnd"/>
+      <w:r>
+        <w:rPr>
+          <w:b/>
+          <w:bCs/>
+          <w:color w:val="4472C4" w:themeColor="accent1"/>
+        </w:rPr>
+        <w:t xml:space="preserve">, </w:t>
+      </w:r>
+      <w:proofErr w:type="spellStart"/>
+      <w:proofErr w:type="gramStart"/>
+      <w:r>
+        <w:rPr>
+          <w:b/>
+          <w:bCs/>
+          <w:color w:val="4472C4" w:themeColor="accent1"/>
+        </w:rPr>
+        <w:t>c.last</w:t>
+      </w:r>
+      <w:proofErr w:type="gramEnd"/>
+      <w:r>
+        <w:rPr>
+          <w:b/>
+          <w:bCs/>
+          <w:color w:val="4472C4" w:themeColor="accent1"/>
+        </w:rPr>
+        <w:t>_name</w:t>
+      </w:r>
+      <w:proofErr w:type="spellEnd"/>
+      <w:r>
+        <w:rPr>
+          <w:b/>
+          <w:bCs/>
+          <w:color w:val="4472C4" w:themeColor="accent1"/>
+        </w:rPr>
+        <w:t xml:space="preserve">   </w:t>
+      </w:r>
+    </w:p>
+    <w:p>
+      <w:pPr>
+        <w:rPr>
+          <w:b/>
+          <w:bCs/>
+          <w:color w:val="4472C4" w:themeColor="accent1"/>
+        </w:rPr>
+      </w:pPr>
+      <w:r>
+        <w:rPr>
+          <w:b/>
+          <w:bCs/>
+          <w:color w:val="4472C4" w:themeColor="accent1"/>
+        </w:rPr>
+        <w:t xml:space="preserve">FROM customer c     </w:t>
+      </w:r>
+    </w:p>
+    <w:p>
+      <w:pPr>
+        <w:rPr>
+          <w:b/>
+          <w:bCs/>
+          <w:color w:val="4472C4" w:themeColor="accent1"/>
+        </w:rPr>
+      </w:pPr>
+      <w:r>
+        <w:rPr>
+          <w:b/>
+          <w:bCs/>
+          <w:color w:val="4472C4" w:themeColor="accent1"/>
+        </w:rPr>
+        <w:t xml:space="preserve">WHERE </w:t>
+      </w:r>
+      <w:proofErr w:type="spellStart"/>
+      <w:proofErr w:type="gramStart"/>
+      <w:r>
+        <w:rPr>
+          <w:b/>
+          <w:bCs/>
+          <w:color w:val="4472C4" w:themeColor="accent1"/>
+        </w:rPr>
+        <w:t>c.first</w:t>
+      </w:r>
+      <w:proofErr w:type="gramEnd"/>
+      <w:r>
+        <w:rPr>
+          <w:b/>
+          <w:bCs/>
+          <w:color w:val="4472C4" w:themeColor="accent1"/>
+        </w:rPr>
+        <w:t>_name</w:t>
+      </w:r>
+      <w:proofErr w:type="spellEnd"/>
+      <w:r>
+        <w:rPr>
+          <w:b/>
+          <w:bCs/>
+          <w:color w:val="4472C4" w:themeColor="accent1"/>
+        </w:rPr>
+        <w:t xml:space="preserve"> LIKE 'J%' AND </w:t>
+      </w:r>
+      <w:proofErr w:type="spellStart"/>
+      <w:proofErr w:type="gramStart"/>
+      <w:r>
+        <w:rPr>
+          <w:b/>
+          <w:bCs/>
+          <w:color w:val="4472C4" w:themeColor="accent1"/>
+        </w:rPr>
+        <w:t>c.last</w:t>
+      </w:r>
+      <w:proofErr w:type="gramEnd"/>
+      <w:r>
+        <w:rPr>
+          <w:b/>
+          <w:bCs/>
+          <w:color w:val="4472C4" w:themeColor="accent1"/>
+        </w:rPr>
+        <w:t>_name</w:t>
+      </w:r>
+      <w:proofErr w:type="spellEnd"/>
+      <w:r>
+        <w:rPr>
+          <w:b/>
+          <w:bCs/>
+          <w:color w:val="4472C4" w:themeColor="accent1"/>
+        </w:rPr>
+        <w:t xml:space="preserve"> LIKE 'D%';</w:t>
+      </w:r>
+    </w:p>
+    <w:p>
+      <w:pPr>
+        <w:rPr>
+          <w:color w:val="000000" w:themeColor="text1"/>
+          <w:sz w:val="22"/>
+          <w:szCs w:val="22"/>
+        </w:rPr>
+      </w:pPr>
+    </w:p>
+    <w:p>
+      <w:pPr>
+        <w:rPr>
+          <w:color w:val="000000" w:themeColor="text1"/>
+          <w:sz w:val="22"/>
+          <w:szCs w:val="22"/>
+        </w:rPr>
+      </w:pPr>
+      <w:r>
+        <w:rPr>
+          <w:color w:val="000000" w:themeColor="text1"/>
+          <w:sz w:val="22"/>
+          <w:szCs w:val="22"/>
+        </w:rPr>
+        <w:t>To reverse this top to bottom we can make the second union all as a subquery example</w:t>
+      </w:r>
+    </w:p>
+    <w:p>
+      <w:pPr>
+        <w:rPr>
+          <w:b/>
+          <w:bCs/>
+          <w:color w:val="4472C4" w:themeColor="accent1"/>
+        </w:rPr>
+      </w:pPr>
+      <w:r>
+        <w:rPr>
+          <w:b/>
+          <w:bCs/>
+          <w:color w:val="4472C4" w:themeColor="accent1"/>
+        </w:rPr>
+        <w:t xml:space="preserve">SELECT </w:t>
+      </w:r>
+      <w:proofErr w:type="spellStart"/>
+      <w:r>
+        <w:rPr>
+          <w:b/>
+          <w:bCs/>
+          <w:color w:val="4472C4" w:themeColor="accent1"/>
+        </w:rPr>
+        <w:t>a.first_name</w:t>
+      </w:r>
+      <w:proofErr w:type="spellEnd"/>
+      <w:r>
+        <w:rPr>
+          <w:b/>
+          <w:bCs/>
+          <w:color w:val="4472C4" w:themeColor="accent1"/>
+        </w:rPr>
+        <w:t xml:space="preserve">, </w:t>
+      </w:r>
+      <w:proofErr w:type="spellStart"/>
+      <w:r>
+        <w:rPr>
+          <w:b/>
+          <w:bCs/>
+          <w:color w:val="4472C4" w:themeColor="accent1"/>
+        </w:rPr>
+        <w:t>a.last_name</w:t>
+      </w:r>
+      <w:proofErr w:type="spellEnd"/>
+      <w:r>
+        <w:rPr>
+          <w:b/>
+          <w:bCs/>
+          <w:color w:val="4472C4" w:themeColor="accent1"/>
+        </w:rPr>
+        <w:t xml:space="preserve"> FROM actor a WHERE </w:t>
+      </w:r>
+      <w:proofErr w:type="spellStart"/>
+      <w:r>
+        <w:rPr>
+          <w:b/>
+          <w:bCs/>
+          <w:color w:val="4472C4" w:themeColor="accent1"/>
+        </w:rPr>
+        <w:t>a.first_name</w:t>
+      </w:r>
+      <w:proofErr w:type="spellEnd"/>
+      <w:r>
+        <w:rPr>
+          <w:b/>
+          <w:bCs/>
+          <w:color w:val="4472C4" w:themeColor="accent1"/>
+        </w:rPr>
+        <w:t xml:space="preserve"> LIKE 'J%' AND </w:t>
+      </w:r>
+      <w:proofErr w:type="spellStart"/>
+      <w:r>
+        <w:rPr>
+          <w:b/>
+          <w:bCs/>
+          <w:color w:val="4472C4" w:themeColor="accent1"/>
+        </w:rPr>
+        <w:t>a.last_name</w:t>
+      </w:r>
+      <w:proofErr w:type="spellEnd"/>
+      <w:r>
+        <w:rPr>
+          <w:b/>
+          <w:bCs/>
+          <w:color w:val="4472C4" w:themeColor="accent1"/>
+        </w:rPr>
+        <w:t xml:space="preserve"> LIKE 'D%' UNION (SELECT </w:t>
+      </w:r>
+      <w:proofErr w:type="spellStart"/>
+      <w:r>
+        <w:rPr>
+          <w:b/>
+          <w:bCs/>
+          <w:color w:val="4472C4" w:themeColor="accent1"/>
+        </w:rPr>
+        <w:t>a.first_name</w:t>
+      </w:r>
+      <w:proofErr w:type="spellEnd"/>
+      <w:r>
+        <w:rPr>
+          <w:b/>
+          <w:bCs/>
+          <w:color w:val="4472C4" w:themeColor="accent1"/>
+        </w:rPr>
+        <w:t xml:space="preserve">, </w:t>
+      </w:r>
+      <w:proofErr w:type="spellStart"/>
+      <w:r>
+        <w:rPr>
+          <w:b/>
+          <w:bCs/>
+          <w:color w:val="4472C4" w:themeColor="accent1"/>
+        </w:rPr>
+        <w:t>a.last_name</w:t>
+      </w:r>
+      <w:proofErr w:type="spellEnd"/>
+      <w:r>
+        <w:rPr>
+          <w:b/>
+          <w:bCs/>
+          <w:color w:val="4472C4" w:themeColor="accent1"/>
+        </w:rPr>
+        <w:t xml:space="preserve"> ) FROM actor a WHERE </w:t>
+      </w:r>
+      <w:proofErr w:type="spellStart"/>
+      <w:r>
+        <w:rPr>
+          <w:b/>
+          <w:bCs/>
+          <w:color w:val="4472C4" w:themeColor="accent1"/>
+        </w:rPr>
+        <w:t>a.first_name</w:t>
+      </w:r>
+      <w:proofErr w:type="spellEnd"/>
+      <w:r>
+        <w:rPr>
+          <w:b/>
+          <w:bCs/>
+          <w:color w:val="4472C4" w:themeColor="accent1"/>
+        </w:rPr>
+        <w:t xml:space="preserve"> LIKE 'M%' AND </w:t>
+      </w:r>
+      <w:proofErr w:type="spellStart"/>
+      <w:r>
+        <w:rPr>
+          <w:b/>
+          <w:bCs/>
+          <w:color w:val="4472C4" w:themeColor="accent1"/>
+        </w:rPr>
+        <w:t>a.last_name</w:t>
+      </w:r>
+      <w:proofErr w:type="spellEnd"/>
+      <w:r>
+        <w:rPr>
+          <w:b/>
+          <w:bCs/>
+          <w:color w:val="4472C4" w:themeColor="accent1"/>
+        </w:rPr>
+        <w:t xml:space="preserve"> LIKE 'T%' UNION ALL SELECT </w:t>
+      </w:r>
+      <w:proofErr w:type="spellStart"/>
+      <w:r>
+        <w:rPr>
+          <w:b/>
+          <w:bCs/>
+          <w:color w:val="4472C4" w:themeColor="accent1"/>
+        </w:rPr>
+        <w:t>c.first_name</w:t>
+      </w:r>
+      <w:proofErr w:type="spellEnd"/>
+      <w:r>
+        <w:rPr>
+          <w:b/>
+          <w:bCs/>
+          <w:color w:val="4472C4" w:themeColor="accent1"/>
+        </w:rPr>
+        <w:t xml:space="preserve">, </w:t>
+      </w:r>
+      <w:proofErr w:type="spellStart"/>
+      <w:r>
+        <w:rPr>
+          <w:b/>
+          <w:bCs/>
+          <w:color w:val="4472C4" w:themeColor="accent1"/>
+        </w:rPr>
+        <w:t>c.last_name</w:t>
+      </w:r>
+      <w:proofErr w:type="spellEnd"/>
+      <w:r>
+        <w:rPr>
+          <w:b/>
+          <w:bCs/>
+          <w:color w:val="4472C4" w:themeColor="accent1"/>
+        </w:rPr>
+        <w:t xml:space="preserve"> FROM customer c WHERE </w:t>
+      </w:r>
+      <w:proofErr w:type="spellStart"/>
+      <w:r>
+        <w:rPr>
+          <w:b/>
+          <w:bCs/>
+          <w:color w:val="4472C4" w:themeColor="accent1"/>
+        </w:rPr>
+        <w:t>c.first_name</w:t>
+      </w:r>
+      <w:proofErr w:type="spellEnd"/>
+      <w:r>
+        <w:rPr>
+          <w:b/>
+          <w:bCs/>
+          <w:color w:val="4472C4" w:themeColor="accent1"/>
+        </w:rPr>
+        <w:t xml:space="preserve"> LIKE 'J%' AND </w:t>
+      </w:r>
+      <w:proofErr w:type="spellStart"/>
+      <w:r>
+        <w:rPr>
+          <w:b/>
+          <w:bCs/>
+          <w:color w:val="4472C4" w:themeColor="accent1"/>
+        </w:rPr>
+        <w:t>c.last_name</w:t>
+      </w:r>
+      <w:proofErr w:type="spellEnd"/>
+      <w:r>
+        <w:rPr>
+          <w:b/>
+          <w:bCs/>
+          <w:color w:val="4472C4" w:themeColor="accent1"/>
+        </w:rPr>
+        <w:t xml:space="preserve"> LIKE 'D%'</w:t>
       </w:r>
     </w:p>
     <w:p>

</xml_diff>

<commit_message>
add chapter 11 notes
</commit_message>
<xml_diff>
--- a/Book notes.docx
+++ b/Book notes.docx
@@ -19657,15 +19657,851 @@
           <w:color w:val="000000" w:themeColor="text1"/>
           <w:u w:val="single"/>
         </w:rPr>
-        <w:t>Outer Joins</w:t>
-      </w:r>
-      <w:r>
+        <w:t>Outer Joins:</w:t>
+      </w:r>
+    </w:p>
+    <w:p>
+      <w:pPr>
+        <w:rPr>
+          <w:color w:val="000000" w:themeColor="text1"/>
+          <w:sz w:val="22"/>
+          <w:szCs w:val="22"/>
+        </w:rPr>
+      </w:pPr>
+      <w:r>
+        <w:rPr>
+          <w:color w:val="000000" w:themeColor="text1"/>
+          <w:sz w:val="22"/>
+          <w:szCs w:val="22"/>
+        </w:rPr>
+        <w:t>An inner join matches the 2 tables based on a primary = foreign key and only keeps the results that are common in both tables.</w:t>
+      </w:r>
+    </w:p>
+    <w:p>
+      <w:pPr>
+        <w:rPr>
+          <w:color w:val="000000" w:themeColor="text1"/>
+          <w:sz w:val="22"/>
+          <w:szCs w:val="22"/>
+        </w:rPr>
+      </w:pPr>
+      <w:r>
+        <w:rPr>
+          <w:color w:val="000000" w:themeColor="text1"/>
+          <w:sz w:val="22"/>
+          <w:szCs w:val="22"/>
+        </w:rPr>
+        <w:t>An outer join on the other hands keeps all the results from a specific table like LEFT JOIN OR RIGHT JOIN OR FULLY OUTER JOIN</w:t>
+      </w:r>
+    </w:p>
+    <w:p>
+      <w:pPr>
+        <w:rPr>
+          <w:color w:val="000000" w:themeColor="text1"/>
+          <w:sz w:val="22"/>
+          <w:szCs w:val="22"/>
+        </w:rPr>
+      </w:pPr>
+      <w:r>
+        <w:rPr>
+          <w:color w:val="000000" w:themeColor="text1"/>
+          <w:sz w:val="22"/>
+          <w:szCs w:val="22"/>
+        </w:rPr>
+        <w:t xml:space="preserve">A </w:t>
+      </w:r>
+      <w:r>
+        <w:rPr>
+          <w:b/>
+          <w:bCs/>
+          <w:color w:val="4472C4" w:themeColor="accent1"/>
+        </w:rPr>
+        <w:t>LEFT OUTER JOIN</w:t>
+      </w:r>
+      <w:r>
+        <w:rPr>
+          <w:color w:val="000000" w:themeColor="text1"/>
+          <w:sz w:val="22"/>
+          <w:szCs w:val="22"/>
+        </w:rPr>
+        <w:t xml:space="preserve"> WHICH IS ALSO A NORMAL </w:t>
+      </w:r>
+      <w:r>
+        <w:rPr>
+          <w:b/>
+          <w:bCs/>
+          <w:color w:val="4472C4" w:themeColor="accent1"/>
+        </w:rPr>
+        <w:t>LEFT JOIN</w:t>
+      </w:r>
+      <w:r>
+        <w:rPr>
+          <w:b/>
+          <w:bCs/>
+          <w:color w:val="4472C4" w:themeColor="accent1"/>
+        </w:rPr>
+        <w:t xml:space="preserve"> </w:t>
+      </w:r>
+      <w:r>
+        <w:rPr>
+          <w:color w:val="000000" w:themeColor="text1"/>
+          <w:sz w:val="22"/>
+          <w:szCs w:val="22"/>
+        </w:rPr>
+        <w:t>it matches all the values based on the matching conditions and if there is any value on the left table that has no matching value from the right it gives us the left value and the right value will be null</w:t>
+      </w:r>
+    </w:p>
+    <w:p>
+      <w:pPr>
+        <w:rPr>
+          <w:color w:val="000000" w:themeColor="text1"/>
+          <w:sz w:val="22"/>
+          <w:szCs w:val="22"/>
+        </w:rPr>
+      </w:pPr>
+    </w:p>
+    <w:p>
+      <w:pPr>
+        <w:rPr>
+          <w:color w:val="000000" w:themeColor="text1"/>
+          <w:sz w:val="22"/>
+          <w:szCs w:val="22"/>
+        </w:rPr>
+      </w:pPr>
+      <w:r>
+        <w:rPr>
+          <w:b/>
+          <w:bCs/>
+          <w:color w:val="4472C4" w:themeColor="accent1"/>
+        </w:rPr>
+        <w:t xml:space="preserve">RIGHT OUTER </w:t>
+      </w:r>
+      <w:proofErr w:type="gramStart"/>
+      <w:r>
+        <w:rPr>
+          <w:b/>
+          <w:bCs/>
+          <w:color w:val="4472C4" w:themeColor="accent1"/>
+        </w:rPr>
+        <w:t>JOIN ;</w:t>
+      </w:r>
+      <w:proofErr w:type="gramEnd"/>
+      <w:r>
+        <w:rPr>
+          <w:b/>
+          <w:bCs/>
+          <w:color w:val="4472C4" w:themeColor="accent1"/>
+        </w:rPr>
+        <w:t xml:space="preserve"> RIGHT </w:t>
+      </w:r>
+      <w:proofErr w:type="gramStart"/>
+      <w:r>
+        <w:rPr>
+          <w:b/>
+          <w:bCs/>
+          <w:color w:val="4472C4" w:themeColor="accent1"/>
+        </w:rPr>
+        <w:t xml:space="preserve">JOIN </w:t>
+      </w:r>
+      <w:r>
+        <w:rPr>
+          <w:b/>
+          <w:bCs/>
+          <w:color w:val="4472C4" w:themeColor="accent1"/>
+        </w:rPr>
+        <w:t xml:space="preserve"> </w:t>
+      </w:r>
+      <w:r>
+        <w:rPr>
+          <w:color w:val="000000" w:themeColor="text1"/>
+          <w:sz w:val="22"/>
+          <w:szCs w:val="22"/>
+        </w:rPr>
+        <w:t>is</w:t>
+      </w:r>
+      <w:proofErr w:type="gramEnd"/>
+      <w:r>
+        <w:rPr>
+          <w:color w:val="000000" w:themeColor="text1"/>
+          <w:sz w:val="22"/>
+          <w:szCs w:val="22"/>
+        </w:rPr>
+        <w:t xml:space="preserve"> the same idea for the left join but the opposite direction so we match the values from the right and the left and if the left values don’t exist for the right </w:t>
+      </w:r>
+      <w:proofErr w:type="gramStart"/>
+      <w:r>
+        <w:rPr>
+          <w:color w:val="000000" w:themeColor="text1"/>
+          <w:sz w:val="22"/>
+          <w:szCs w:val="22"/>
+        </w:rPr>
+        <w:t>values</w:t>
+      </w:r>
+      <w:proofErr w:type="gramEnd"/>
+      <w:r>
+        <w:rPr>
+          <w:color w:val="000000" w:themeColor="text1"/>
+          <w:sz w:val="22"/>
+          <w:szCs w:val="22"/>
+        </w:rPr>
+        <w:t xml:space="preserve"> we give the left values a null and the right values stay the same</w:t>
+      </w:r>
+    </w:p>
+    <w:p>
+      <w:pPr>
+        <w:rPr>
+          <w:color w:val="000000" w:themeColor="text1"/>
+          <w:sz w:val="22"/>
+          <w:szCs w:val="22"/>
+        </w:rPr>
+      </w:pPr>
+    </w:p>
+    <w:p>
+      <w:pPr>
+        <w:rPr>
+          <w:color w:val="000000" w:themeColor="text1"/>
+          <w:sz w:val="22"/>
+          <w:szCs w:val="22"/>
+        </w:rPr>
+      </w:pPr>
+      <w:r>
+        <w:rPr>
+          <w:color w:val="000000" w:themeColor="text1"/>
+          <w:sz w:val="22"/>
+          <w:szCs w:val="22"/>
+        </w:rPr>
+        <w:t xml:space="preserve">An </w:t>
+      </w:r>
+      <w:r>
+        <w:rPr>
+          <w:b/>
+          <w:bCs/>
+          <w:color w:val="4472C4" w:themeColor="accent1"/>
+        </w:rPr>
+        <w:t>OUTER JOIN, FULLY OUTER JOIN</w:t>
+      </w:r>
+      <w:r>
+        <w:rPr>
+          <w:color w:val="000000" w:themeColor="text1"/>
+          <w:sz w:val="22"/>
+          <w:szCs w:val="22"/>
+        </w:rPr>
+        <w:t>, matches all the values from the left and the right and gives null for the non-existent values from both tables.</w:t>
+      </w:r>
+    </w:p>
+    <w:p>
+      <w:pPr>
+        <w:rPr>
+          <w:color w:val="000000" w:themeColor="text1"/>
+          <w:sz w:val="22"/>
+          <w:szCs w:val="22"/>
+        </w:rPr>
+      </w:pPr>
+    </w:p>
+    <w:p>
+      <w:pPr>
+        <w:rPr>
+          <w:color w:val="000000" w:themeColor="text1"/>
+          <w:sz w:val="22"/>
+          <w:szCs w:val="22"/>
+        </w:rPr>
+      </w:pPr>
+    </w:p>
+    <w:p>
+      <w:pPr>
         <w:rPr>
           <w:b/>
           <w:bCs/>
           <w:color w:val="000000" w:themeColor="text1"/>
           <w:u w:val="single"/>
         </w:rPr>
+      </w:pPr>
+      <w:r>
+        <w:rPr>
+          <w:b/>
+          <w:bCs/>
+          <w:color w:val="000000" w:themeColor="text1"/>
+          <w:u w:val="single"/>
+        </w:rPr>
+        <w:t>Three-Way Outer Joins:</w:t>
+      </w:r>
+    </w:p>
+    <w:p>
+      <w:pPr>
+        <w:rPr>
+          <w:color w:val="000000" w:themeColor="text1"/>
+          <w:sz w:val="22"/>
+          <w:szCs w:val="22"/>
+        </w:rPr>
+      </w:pPr>
+      <w:r>
+        <w:rPr>
+          <w:color w:val="000000" w:themeColor="text1"/>
+          <w:sz w:val="22"/>
+          <w:szCs w:val="22"/>
+        </w:rPr>
+        <w:t>The join normally works from left to right, top bottom style.</w:t>
+      </w:r>
+    </w:p>
+    <w:p>
+      <w:pPr>
+        <w:rPr>
+          <w:color w:val="000000" w:themeColor="text1"/>
+          <w:sz w:val="22"/>
+          <w:szCs w:val="22"/>
+        </w:rPr>
+      </w:pPr>
+    </w:p>
+    <w:p>
+      <w:pPr>
+        <w:rPr>
+          <w:b/>
+          <w:bCs/>
+          <w:color w:val="000000" w:themeColor="text1"/>
+          <w:u w:val="single"/>
+        </w:rPr>
+      </w:pPr>
+      <w:r>
+        <w:rPr>
+          <w:b/>
+          <w:bCs/>
+          <w:color w:val="000000" w:themeColor="text1"/>
+          <w:u w:val="single"/>
+        </w:rPr>
+        <w:t>Cross Join:</w:t>
+      </w:r>
+    </w:p>
+    <w:p>
+      <w:pPr>
+        <w:rPr>
+          <w:color w:val="000000" w:themeColor="text1"/>
+          <w:sz w:val="22"/>
+          <w:szCs w:val="22"/>
+        </w:rPr>
+      </w:pPr>
+      <w:r>
+        <w:rPr>
+          <w:color w:val="000000" w:themeColor="text1"/>
+          <w:sz w:val="22"/>
+          <w:szCs w:val="22"/>
+        </w:rPr>
+        <w:t>the c</w:t>
+      </w:r>
+      <w:r>
+        <w:rPr>
+          <w:color w:val="000000" w:themeColor="text1"/>
+          <w:sz w:val="22"/>
+          <w:szCs w:val="22"/>
+        </w:rPr>
+        <w:t>ro</w:t>
+      </w:r>
+      <w:r>
+        <w:rPr>
+          <w:color w:val="000000" w:themeColor="text1"/>
+          <w:sz w:val="22"/>
+          <w:szCs w:val="22"/>
+        </w:rPr>
+        <w:t>ss join just every element from the left joined to every element from the right with no con</w:t>
+      </w:r>
+      <w:r>
+        <w:rPr>
+          <w:color w:val="000000" w:themeColor="text1"/>
+          <w:sz w:val="22"/>
+          <w:szCs w:val="22"/>
+        </w:rPr>
+        <w:t>d</w:t>
+      </w:r>
+      <w:r>
+        <w:rPr>
+          <w:color w:val="000000" w:themeColor="text1"/>
+          <w:sz w:val="22"/>
+          <w:szCs w:val="22"/>
+        </w:rPr>
+        <w:t>i</w:t>
+      </w:r>
+      <w:r>
+        <w:rPr>
+          <w:color w:val="000000" w:themeColor="text1"/>
+          <w:sz w:val="22"/>
+          <w:szCs w:val="22"/>
+        </w:rPr>
+        <w:t>t</w:t>
+      </w:r>
+      <w:r>
+        <w:rPr>
+          <w:color w:val="000000" w:themeColor="text1"/>
+          <w:sz w:val="22"/>
+          <w:szCs w:val="22"/>
+        </w:rPr>
+        <w:t>ions?</w:t>
+      </w:r>
+    </w:p>
+    <w:p>
+      <w:pPr>
+        <w:rPr>
+          <w:color w:val="000000" w:themeColor="text1"/>
+          <w:sz w:val="22"/>
+          <w:szCs w:val="22"/>
+        </w:rPr>
+      </w:pPr>
+      <w:r>
+        <w:rPr>
+          <w:color w:val="000000" w:themeColor="text1"/>
+          <w:sz w:val="22"/>
+          <w:szCs w:val="22"/>
+        </w:rPr>
+        <w:t>Its usually mistakenly used and it may generate memory chaos.</w:t>
+      </w:r>
+    </w:p>
+    <w:p>
+      <w:pPr>
+        <w:rPr>
+          <w:color w:val="000000" w:themeColor="text1"/>
+          <w:sz w:val="22"/>
+          <w:szCs w:val="22"/>
+        </w:rPr>
+      </w:pPr>
+    </w:p>
+    <w:p>
+      <w:pPr>
+        <w:rPr>
+          <w:b/>
+          <w:bCs/>
+          <w:color w:val="000000" w:themeColor="text1"/>
+          <w:u w:val="single"/>
+        </w:rPr>
+      </w:pPr>
+      <w:r>
+        <w:rPr>
+          <w:b/>
+          <w:bCs/>
+          <w:color w:val="000000" w:themeColor="text1"/>
+          <w:u w:val="single"/>
+        </w:rPr>
+        <w:t>Natural Join:</w:t>
+      </w:r>
+    </w:p>
+    <w:p>
+      <w:pPr>
+        <w:rPr>
+          <w:color w:val="000000" w:themeColor="text1"/>
+          <w:sz w:val="22"/>
+          <w:szCs w:val="22"/>
+        </w:rPr>
+      </w:pPr>
+      <w:r>
+        <w:rPr>
+          <w:color w:val="000000" w:themeColor="text1"/>
+          <w:sz w:val="22"/>
+          <w:szCs w:val="22"/>
+        </w:rPr>
+        <w:t>A NATURAL JOIN automatically joins two tables using all columns that have the same name in both tables.</w:t>
+      </w:r>
+      <w:r>
+        <w:rPr>
+          <w:color w:val="000000" w:themeColor="text1"/>
+          <w:sz w:val="22"/>
+          <w:szCs w:val="22"/>
+        </w:rPr>
+        <w:t xml:space="preserve"> In real world its avoided since it can behave un-expectedly.</w:t>
+      </w:r>
+    </w:p>
+    <w:p>
+      <w:pPr>
+        <w:rPr>
+          <w:color w:val="000000" w:themeColor="text1"/>
+          <w:sz w:val="22"/>
+          <w:szCs w:val="22"/>
+        </w:rPr>
+      </w:pPr>
+      <w:r>
+        <w:rPr>
+          <w:color w:val="000000" w:themeColor="text1"/>
+          <w:sz w:val="22"/>
+          <w:szCs w:val="22"/>
+        </w:rPr>
+        <w:t>NATURAL JOIN can be dangerous because:</w:t>
+      </w:r>
+      <w:r>
+        <w:rPr>
+          <w:color w:val="000000" w:themeColor="text1"/>
+          <w:sz w:val="22"/>
+          <w:szCs w:val="22"/>
+        </w:rPr>
+        <w:t xml:space="preserve"> </w:t>
+      </w:r>
+      <w:r>
+        <w:rPr>
+          <w:color w:val="000000" w:themeColor="text1"/>
+          <w:sz w:val="22"/>
+          <w:szCs w:val="22"/>
+        </w:rPr>
+        <w:t>It silently depends on column names.</w:t>
+      </w:r>
+    </w:p>
+    <w:p>
+      <w:pPr>
+        <w:jc w:val="center"/>
+        <w:rPr>
+          <w:b/>
+          <w:bCs/>
+          <w:color w:val="EE0000"/>
+          <w:sz w:val="32"/>
+          <w:szCs w:val="32"/>
+          <w:u w:val="single"/>
+        </w:rPr>
+      </w:pPr>
+      <w:r>
+        <w:rPr>
+          <w:b/>
+          <w:bCs/>
+          <w:color w:val="EE0000"/>
+          <w:sz w:val="32"/>
+          <w:szCs w:val="32"/>
+          <w:u w:val="single"/>
+        </w:rPr>
+        <w:lastRenderedPageBreak/>
+        <w:t>Chapter 11. Conditional Logic</w:t>
+      </w:r>
+    </w:p>
+    <w:p>
+      <w:pPr>
+        <w:rPr>
+          <w:color w:val="000000" w:themeColor="text1"/>
+          <w:sz w:val="22"/>
+          <w:szCs w:val="22"/>
+        </w:rPr>
+      </w:pPr>
+      <w:r>
+        <w:rPr>
+          <w:b/>
+          <w:bCs/>
+          <w:color w:val="4472C4" w:themeColor="accent1"/>
+        </w:rPr>
+        <w:t>C</w:t>
+      </w:r>
+      <w:r>
+        <w:rPr>
+          <w:b/>
+          <w:bCs/>
+          <w:color w:val="4472C4" w:themeColor="accent1"/>
+        </w:rPr>
+        <w:t>ase</w:t>
+      </w:r>
+      <w:r>
+        <w:rPr>
+          <w:color w:val="000000" w:themeColor="text1"/>
+          <w:sz w:val="22"/>
+          <w:szCs w:val="22"/>
+        </w:rPr>
+        <w:t xml:space="preserve"> expression, which can be utilized in select, insert, update, and delete statements.</w:t>
+      </w:r>
+    </w:p>
+    <w:p>
+      <w:pPr>
+        <w:rPr>
+          <w:color w:val="000000" w:themeColor="text1"/>
+          <w:sz w:val="22"/>
+          <w:szCs w:val="22"/>
+        </w:rPr>
+      </w:pPr>
+      <w:r>
+        <w:rPr>
+          <w:color w:val="000000" w:themeColor="text1"/>
+          <w:sz w:val="22"/>
+          <w:szCs w:val="22"/>
+        </w:rPr>
+        <w:t xml:space="preserve">Sometimes we want our </w:t>
+      </w:r>
+      <w:proofErr w:type="spellStart"/>
+      <w:r>
+        <w:rPr>
+          <w:color w:val="000000" w:themeColor="text1"/>
+          <w:sz w:val="22"/>
+          <w:szCs w:val="22"/>
+        </w:rPr>
+        <w:t>sql</w:t>
+      </w:r>
+      <w:proofErr w:type="spellEnd"/>
+      <w:r>
+        <w:rPr>
+          <w:color w:val="000000" w:themeColor="text1"/>
+          <w:sz w:val="22"/>
+          <w:szCs w:val="22"/>
+        </w:rPr>
+        <w:t xml:space="preserve"> query to behave differently on certain column values.</w:t>
+      </w:r>
+    </w:p>
+    <w:p>
+      <w:pPr>
+        <w:rPr>
+          <w:b/>
+          <w:bCs/>
+          <w:color w:val="4472C4" w:themeColor="accent1"/>
+        </w:rPr>
+      </w:pPr>
+      <w:r>
+        <w:rPr>
+          <w:b/>
+          <w:bCs/>
+          <w:color w:val="4472C4" w:themeColor="accent1"/>
+        </w:rPr>
+        <w:t xml:space="preserve">SELECT </w:t>
+      </w:r>
+      <w:proofErr w:type="spellStart"/>
+      <w:r>
+        <w:rPr>
+          <w:b/>
+          <w:bCs/>
+          <w:color w:val="4472C4" w:themeColor="accent1"/>
+        </w:rPr>
+        <w:t>first_name</w:t>
+      </w:r>
+      <w:proofErr w:type="spellEnd"/>
+      <w:r>
+        <w:rPr>
+          <w:b/>
+          <w:bCs/>
+          <w:color w:val="4472C4" w:themeColor="accent1"/>
+        </w:rPr>
+        <w:t xml:space="preserve">, </w:t>
+      </w:r>
+      <w:proofErr w:type="spellStart"/>
+      <w:r>
+        <w:rPr>
+          <w:b/>
+          <w:bCs/>
+          <w:color w:val="4472C4" w:themeColor="accent1"/>
+        </w:rPr>
+        <w:t>credit_limit</w:t>
+      </w:r>
+      <w:proofErr w:type="spellEnd"/>
+      <w:r>
+        <w:rPr>
+          <w:b/>
+          <w:bCs/>
+          <w:color w:val="4472C4" w:themeColor="accent1"/>
+        </w:rPr>
+        <w:t>,</w:t>
+      </w:r>
+    </w:p>
+    <w:p>
+      <w:pPr>
+        <w:rPr>
+          <w:b/>
+          <w:bCs/>
+          <w:color w:val="4472C4" w:themeColor="accent1"/>
+        </w:rPr>
+      </w:pPr>
+      <w:r>
+        <w:rPr>
+          <w:b/>
+          <w:bCs/>
+          <w:color w:val="4472C4" w:themeColor="accent1"/>
+        </w:rPr>
+        <w:t xml:space="preserve">       CASE</w:t>
+      </w:r>
+    </w:p>
+    <w:p>
+      <w:pPr>
+        <w:rPr>
+          <w:b/>
+          <w:bCs/>
+          <w:color w:val="4472C4" w:themeColor="accent1"/>
+        </w:rPr>
+      </w:pPr>
+      <w:r>
+        <w:rPr>
+          <w:b/>
+          <w:bCs/>
+          <w:color w:val="4472C4" w:themeColor="accent1"/>
+        </w:rPr>
+        <w:t xml:space="preserve">         WHEN </w:t>
+      </w:r>
+      <w:proofErr w:type="spellStart"/>
+      <w:r>
+        <w:rPr>
+          <w:b/>
+          <w:bCs/>
+          <w:color w:val="4472C4" w:themeColor="accent1"/>
+        </w:rPr>
+        <w:t>credit_limit</w:t>
+      </w:r>
+      <w:proofErr w:type="spellEnd"/>
+      <w:r>
+        <w:rPr>
+          <w:b/>
+          <w:bCs/>
+          <w:color w:val="4472C4" w:themeColor="accent1"/>
+        </w:rPr>
+        <w:t xml:space="preserve"> &gt; 10000 THEN 'VIP'</w:t>
+      </w:r>
+    </w:p>
+    <w:p>
+      <w:pPr>
+        <w:rPr>
+          <w:b/>
+          <w:bCs/>
+          <w:color w:val="4472C4" w:themeColor="accent1"/>
+        </w:rPr>
+      </w:pPr>
+      <w:r>
+        <w:rPr>
+          <w:b/>
+          <w:bCs/>
+          <w:color w:val="4472C4" w:themeColor="accent1"/>
+        </w:rPr>
+        <w:t xml:space="preserve">         WHEN </w:t>
+      </w:r>
+      <w:proofErr w:type="spellStart"/>
+      <w:r>
+        <w:rPr>
+          <w:b/>
+          <w:bCs/>
+          <w:color w:val="4472C4" w:themeColor="accent1"/>
+        </w:rPr>
+        <w:t>credit_limit</w:t>
+      </w:r>
+      <w:proofErr w:type="spellEnd"/>
+      <w:r>
+        <w:rPr>
+          <w:b/>
+          <w:bCs/>
+          <w:color w:val="4472C4" w:themeColor="accent1"/>
+        </w:rPr>
+        <w:t xml:space="preserve"> &gt; 5000 THEN 'GOLD'</w:t>
+      </w:r>
+    </w:p>
+    <w:p>
+      <w:pPr>
+        <w:rPr>
+          <w:b/>
+          <w:bCs/>
+          <w:color w:val="4472C4" w:themeColor="accent1"/>
+        </w:rPr>
+      </w:pPr>
+      <w:r>
+        <w:rPr>
+          <w:b/>
+          <w:bCs/>
+          <w:color w:val="4472C4" w:themeColor="accent1"/>
+        </w:rPr>
+        <w:t xml:space="preserve">         ELSE 'STANDARD'</w:t>
+      </w:r>
+    </w:p>
+    <w:p>
+      <w:pPr>
+        <w:rPr>
+          <w:b/>
+          <w:bCs/>
+          <w:color w:val="4472C4" w:themeColor="accent1"/>
+        </w:rPr>
+      </w:pPr>
+      <w:r>
+        <w:rPr>
+          <w:b/>
+          <w:bCs/>
+          <w:color w:val="4472C4" w:themeColor="accent1"/>
+        </w:rPr>
+        <w:t xml:space="preserve">       END AS </w:t>
+      </w:r>
+      <w:proofErr w:type="spellStart"/>
+      <w:r>
+        <w:rPr>
+          <w:b/>
+          <w:bCs/>
+          <w:color w:val="4472C4" w:themeColor="accent1"/>
+        </w:rPr>
+        <w:t>customer_tier</w:t>
+      </w:r>
+      <w:proofErr w:type="spellEnd"/>
+    </w:p>
+    <w:p>
+      <w:pPr>
+        <w:rPr>
+          <w:b/>
+          <w:bCs/>
+          <w:color w:val="4472C4" w:themeColor="accent1"/>
+        </w:rPr>
+      </w:pPr>
+      <w:r>
+        <w:rPr>
+          <w:b/>
+          <w:bCs/>
+          <w:color w:val="4472C4" w:themeColor="accent1"/>
+        </w:rPr>
+        <w:t>FROM customer;</w:t>
+      </w:r>
+    </w:p>
+    <w:p>
+      <w:pPr>
+        <w:rPr>
+          <w:color w:val="000000" w:themeColor="text1"/>
+          <w:sz w:val="22"/>
+          <w:szCs w:val="22"/>
+        </w:rPr>
+      </w:pPr>
+      <w:r>
+        <w:rPr>
+          <w:color w:val="000000" w:themeColor="text1"/>
+          <w:sz w:val="22"/>
+          <w:szCs w:val="22"/>
+        </w:rPr>
+        <w:t xml:space="preserve">Explanation: we are selecting first name and credit limit columns no matter what, but we are generating a new column based on some conditions of an ALREADY EXISTING column called </w:t>
+      </w:r>
+      <w:proofErr w:type="spellStart"/>
+      <w:r>
+        <w:rPr>
+          <w:color w:val="000000" w:themeColor="text1"/>
+          <w:sz w:val="22"/>
+          <w:szCs w:val="22"/>
+        </w:rPr>
+        <w:t>credit_limit</w:t>
+      </w:r>
+      <w:proofErr w:type="spellEnd"/>
+      <w:r>
+        <w:rPr>
+          <w:color w:val="000000" w:themeColor="text1"/>
+          <w:sz w:val="22"/>
+          <w:szCs w:val="22"/>
+        </w:rPr>
+        <w:t>. The syntax should be looked up again.</w:t>
+      </w:r>
+    </w:p>
+    <w:p>
+      <w:pPr>
+        <w:rPr>
+          <w:color w:val="000000" w:themeColor="text1"/>
+          <w:sz w:val="22"/>
+          <w:szCs w:val="22"/>
+        </w:rPr>
+      </w:pPr>
+    </w:p>
+    <w:p>
+      <w:pPr>
+        <w:rPr>
+          <w:b/>
+          <w:bCs/>
+          <w:color w:val="000000" w:themeColor="text1"/>
+          <w:u w:val="single"/>
+        </w:rPr>
+      </w:pPr>
+      <w:r>
+        <w:rPr>
+          <w:b/>
+          <w:bCs/>
+          <w:color w:val="000000" w:themeColor="text1"/>
+          <w:u w:val="single"/>
+        </w:rPr>
+        <w:t>The case Expression</w:t>
+      </w:r>
+      <w:r>
+        <w:rPr>
+          <w:b/>
+          <w:bCs/>
+          <w:color w:val="000000" w:themeColor="text1"/>
+          <w:u w:val="single"/>
+        </w:rPr>
         <w:t>:</w:t>
       </w:r>
     </w:p>
@@ -19683,71 +20519,31 @@
           <w:sz w:val="22"/>
           <w:szCs w:val="22"/>
         </w:rPr>
-        <w:t>An inner join matches the 2 tables based on a primary = foreign key and only keeps the results that are common in both tables.</w:t>
-      </w:r>
-    </w:p>
-    <w:p>
-      <w:pPr>
-        <w:rPr>
-          <w:color w:val="000000" w:themeColor="text1"/>
-          <w:sz w:val="22"/>
-          <w:szCs w:val="22"/>
-        </w:rPr>
-      </w:pPr>
-      <w:r>
-        <w:rPr>
-          <w:color w:val="000000" w:themeColor="text1"/>
-          <w:sz w:val="22"/>
-          <w:szCs w:val="22"/>
-        </w:rPr>
-        <w:t>An outer join on the other hands keeps all the results from a specific table like LEFT JOIN OR RIGHT JOIN OR FULLY OUTER JOIN</w:t>
-      </w:r>
-    </w:p>
-    <w:p>
-      <w:pPr>
-        <w:rPr>
-          <w:color w:val="000000" w:themeColor="text1"/>
-          <w:sz w:val="22"/>
-          <w:szCs w:val="22"/>
-        </w:rPr>
-      </w:pPr>
-      <w:r>
-        <w:rPr>
-          <w:color w:val="000000" w:themeColor="text1"/>
-          <w:sz w:val="22"/>
-          <w:szCs w:val="22"/>
-        </w:rPr>
-        <w:t xml:space="preserve">A </w:t>
-      </w:r>
-      <w:r>
-        <w:rPr>
-          <w:b/>
-          <w:bCs/>
-          <w:color w:val="4472C4" w:themeColor="accent1"/>
-        </w:rPr>
-        <w:t>LEFT OUTER JOIN</w:t>
-      </w:r>
-      <w:r>
-        <w:rPr>
-          <w:color w:val="000000" w:themeColor="text1"/>
-          <w:sz w:val="22"/>
-          <w:szCs w:val="22"/>
-        </w:rPr>
-        <w:t xml:space="preserve"> WHICH IS ALSO A NORMAL </w:t>
-      </w:r>
-      <w:r>
-        <w:rPr>
-          <w:b/>
-          <w:bCs/>
-          <w:color w:val="4472C4" w:themeColor="accent1"/>
-        </w:rPr>
-        <w:t>LEFT JOIN</w:t>
-      </w:r>
-      <w:r>
-        <w:rPr>
-          <w:b/>
-          <w:bCs/>
-          <w:color w:val="4472C4" w:themeColor="accent1"/>
+        <w:t xml:space="preserve">In MySQL we have a function called if that mimics the if-else if – else as well as the case (similar to switch in java) but CASE has 2 advantages over the </w:t>
+      </w:r>
+      <w:proofErr w:type="gramStart"/>
+      <w:r>
+        <w:rPr>
+          <w:color w:val="000000" w:themeColor="text1"/>
+          <w:sz w:val="22"/>
+          <w:szCs w:val="22"/>
+        </w:rPr>
+        <w:t>if(</w:t>
+      </w:r>
+      <w:proofErr w:type="gramEnd"/>
+      <w:r>
+        <w:rPr>
+          <w:color w:val="000000" w:themeColor="text1"/>
+          <w:sz w:val="22"/>
+          <w:szCs w:val="22"/>
+        </w:rPr>
+        <w:t>) function.</w:t>
+      </w:r>
+      <w:r>
+        <w:rPr>
+          <w:color w:val="000000" w:themeColor="text1"/>
+          <w:sz w:val="22"/>
+          <w:szCs w:val="22"/>
         </w:rPr>
         <w:t xml:space="preserve"> </w:t>
       </w:r>
@@ -19757,155 +20553,16 @@
           <w:sz w:val="22"/>
           <w:szCs w:val="22"/>
         </w:rPr>
-        <w:t>it matches all the values based on the matching conditions and if there is any value on the left table that has no matching value from the right it gives us the left value and the right value will be null</w:t>
-      </w:r>
-    </w:p>
-    <w:p>
-      <w:pPr>
-        <w:rPr>
-          <w:color w:val="000000" w:themeColor="text1"/>
-          <w:sz w:val="22"/>
-          <w:szCs w:val="22"/>
-        </w:rPr>
-      </w:pPr>
-    </w:p>
-    <w:p>
-      <w:pPr>
-        <w:rPr>
-          <w:color w:val="000000" w:themeColor="text1"/>
-          <w:sz w:val="22"/>
-          <w:szCs w:val="22"/>
-        </w:rPr>
-      </w:pPr>
-      <w:r>
-        <w:rPr>
-          <w:b/>
-          <w:bCs/>
-          <w:color w:val="4472C4" w:themeColor="accent1"/>
-        </w:rPr>
-        <w:t xml:space="preserve">RIGHT OUTER </w:t>
-      </w:r>
-      <w:proofErr w:type="gramStart"/>
-      <w:r>
-        <w:rPr>
-          <w:b/>
-          <w:bCs/>
-          <w:color w:val="4472C4" w:themeColor="accent1"/>
-        </w:rPr>
-        <w:t>JOIN ;</w:t>
-      </w:r>
-      <w:proofErr w:type="gramEnd"/>
-      <w:r>
-        <w:rPr>
-          <w:b/>
-          <w:bCs/>
-          <w:color w:val="4472C4" w:themeColor="accent1"/>
-        </w:rPr>
-        <w:t xml:space="preserve"> RIGHT </w:t>
-      </w:r>
-      <w:proofErr w:type="gramStart"/>
-      <w:r>
-        <w:rPr>
-          <w:b/>
-          <w:bCs/>
-          <w:color w:val="4472C4" w:themeColor="accent1"/>
-        </w:rPr>
-        <w:t xml:space="preserve">JOIN </w:t>
-      </w:r>
-      <w:r>
-        <w:rPr>
-          <w:b/>
-          <w:bCs/>
-          <w:color w:val="4472C4" w:themeColor="accent1"/>
-        </w:rPr>
-        <w:t xml:space="preserve"> </w:t>
-      </w:r>
-      <w:r>
-        <w:rPr>
-          <w:color w:val="000000" w:themeColor="text1"/>
-          <w:sz w:val="22"/>
-          <w:szCs w:val="22"/>
-        </w:rPr>
-        <w:t>is</w:t>
-      </w:r>
-      <w:proofErr w:type="gramEnd"/>
-      <w:r>
-        <w:rPr>
-          <w:color w:val="000000" w:themeColor="text1"/>
-          <w:sz w:val="22"/>
-          <w:szCs w:val="22"/>
-        </w:rPr>
-        <w:t xml:space="preserve"> the same idea for the left join but the opposite direction so we match the values from the right and the left and if the left values don’t exist for the right </w:t>
-      </w:r>
-      <w:proofErr w:type="gramStart"/>
-      <w:r>
-        <w:rPr>
-          <w:color w:val="000000" w:themeColor="text1"/>
-          <w:sz w:val="22"/>
-          <w:szCs w:val="22"/>
-        </w:rPr>
-        <w:t>values</w:t>
-      </w:r>
-      <w:proofErr w:type="gramEnd"/>
-      <w:r>
-        <w:rPr>
-          <w:color w:val="000000" w:themeColor="text1"/>
-          <w:sz w:val="22"/>
-          <w:szCs w:val="22"/>
-        </w:rPr>
-        <w:t xml:space="preserve"> we give the left values a null and the right values stay the same</w:t>
-      </w:r>
-    </w:p>
-    <w:p>
-      <w:pPr>
-        <w:rPr>
-          <w:color w:val="000000" w:themeColor="text1"/>
-          <w:sz w:val="22"/>
-          <w:szCs w:val="22"/>
-        </w:rPr>
-      </w:pPr>
-    </w:p>
-    <w:p>
-      <w:pPr>
-        <w:rPr>
-          <w:color w:val="000000" w:themeColor="text1"/>
-          <w:sz w:val="22"/>
-          <w:szCs w:val="22"/>
-        </w:rPr>
-      </w:pPr>
-      <w:r>
-        <w:rPr>
-          <w:color w:val="000000" w:themeColor="text1"/>
-          <w:sz w:val="22"/>
-          <w:szCs w:val="22"/>
-        </w:rPr>
-        <w:t xml:space="preserve">An </w:t>
-      </w:r>
-      <w:r>
-        <w:rPr>
-          <w:b/>
-          <w:bCs/>
-          <w:color w:val="4472C4" w:themeColor="accent1"/>
-        </w:rPr>
-        <w:t>OUTER JOIN, FULLY OUTER JOIN</w:t>
-      </w:r>
-      <w:r>
-        <w:rPr>
-          <w:color w:val="000000" w:themeColor="text1"/>
-          <w:sz w:val="22"/>
-          <w:szCs w:val="22"/>
-        </w:rPr>
-        <w:t>, matches all the values from the left and the right and gives null for the non-existent values from both tables.</w:t>
-      </w:r>
-    </w:p>
-    <w:p>
-      <w:pPr>
-        <w:rPr>
-          <w:color w:val="000000" w:themeColor="text1"/>
-          <w:sz w:val="22"/>
-          <w:szCs w:val="22"/>
-        </w:rPr>
-      </w:pPr>
+        <w:t>case expressions are built into the SQL grammar and can be included in select, insert, update, and delete statements.</w:t>
+      </w:r>
+      <w:r>
+        <w:rPr>
+          <w:color w:val="000000" w:themeColor="text1"/>
+          <w:sz w:val="22"/>
+          <w:szCs w:val="22"/>
+        </w:rPr>
+        <w:t xml:space="preserve"> And its also standardized. </w:t>
+      </w:r>
     </w:p>
     <w:p>
       <w:pPr>
@@ -19932,7 +20589,7 @@
           <w:color w:val="000000" w:themeColor="text1"/>
           <w:u w:val="single"/>
         </w:rPr>
-        <w:t>Three-Way Outer Joins</w:t>
+        <w:t>Searched case Expressions</w:t>
       </w:r>
       <w:r>
         <w:rPr>
@@ -19947,18 +20604,547 @@
     <w:p>
       <w:pPr>
         <w:rPr>
-          <w:color w:val="000000" w:themeColor="text1"/>
-          <w:sz w:val="22"/>
-          <w:szCs w:val="22"/>
-        </w:rPr>
-      </w:pPr>
-      <w:r>
-        <w:rPr>
-          <w:color w:val="000000" w:themeColor="text1"/>
-          <w:sz w:val="22"/>
-          <w:szCs w:val="22"/>
-        </w:rPr>
-        <w:t>The join normally works from left to right, top bottom style.</w:t>
+          <w:b/>
+          <w:bCs/>
+          <w:color w:val="4472C4" w:themeColor="accent1"/>
+        </w:rPr>
+      </w:pPr>
+      <w:r>
+        <w:rPr>
+          <w:b/>
+          <w:bCs/>
+          <w:color w:val="4472C4" w:themeColor="accent1"/>
+        </w:rPr>
+        <w:t xml:space="preserve">CASE </w:t>
+      </w:r>
+    </w:p>
+    <w:p>
+      <w:pPr>
+        <w:rPr>
+          <w:b/>
+          <w:bCs/>
+          <w:color w:val="4472C4" w:themeColor="accent1"/>
+        </w:rPr>
+      </w:pPr>
+      <w:r>
+        <w:rPr>
+          <w:b/>
+          <w:bCs/>
+          <w:color w:val="4472C4" w:themeColor="accent1"/>
+        </w:rPr>
+        <w:t>WHEN C1 THEN E1</w:t>
+      </w:r>
+    </w:p>
+    <w:p>
+      <w:pPr>
+        <w:rPr>
+          <w:b/>
+          <w:bCs/>
+          <w:color w:val="4472C4" w:themeColor="accent1"/>
+        </w:rPr>
+      </w:pPr>
+      <w:r>
+        <w:rPr>
+          <w:b/>
+          <w:bCs/>
+          <w:color w:val="4472C4" w:themeColor="accent1"/>
+        </w:rPr>
+        <w:t>WHEN C2 THEN E2</w:t>
+      </w:r>
+    </w:p>
+    <w:p>
+      <w:pPr>
+        <w:rPr>
+          <w:b/>
+          <w:bCs/>
+          <w:color w:val="4472C4" w:themeColor="accent1"/>
+        </w:rPr>
+      </w:pPr>
+      <w:r>
+        <w:rPr>
+          <w:b/>
+          <w:bCs/>
+          <w:color w:val="4472C4" w:themeColor="accent1"/>
+        </w:rPr>
+        <w:t xml:space="preserve">WHEN CN THEN EN </w:t>
+      </w:r>
+    </w:p>
+    <w:p>
+      <w:pPr>
+        <w:rPr>
+          <w:b/>
+          <w:bCs/>
+          <w:color w:val="4472C4" w:themeColor="accent1"/>
+        </w:rPr>
+      </w:pPr>
+      <w:r>
+        <w:rPr>
+          <w:b/>
+          <w:bCs/>
+          <w:color w:val="4472C4" w:themeColor="accent1"/>
+        </w:rPr>
+        <w:t xml:space="preserve">[ELSE ED] </w:t>
+      </w:r>
+    </w:p>
+    <w:p>
+      <w:pPr>
+        <w:rPr>
+          <w:b/>
+          <w:bCs/>
+          <w:color w:val="4472C4" w:themeColor="accent1"/>
+        </w:rPr>
+      </w:pPr>
+      <w:r>
+        <w:rPr>
+          <w:b/>
+          <w:bCs/>
+          <w:color w:val="4472C4" w:themeColor="accent1"/>
+        </w:rPr>
+        <w:t>END</w:t>
+      </w:r>
+      <w:r>
+        <w:rPr>
+          <w:b/>
+          <w:bCs/>
+          <w:color w:val="4472C4" w:themeColor="accent1"/>
+        </w:rPr>
+        <w:t xml:space="preserve"> AS NEW_COLUMN_NAME</w:t>
+      </w:r>
+    </w:p>
+    <w:p>
+      <w:pPr>
+        <w:rPr>
+          <w:color w:val="000000" w:themeColor="text1"/>
+          <w:sz w:val="22"/>
+          <w:szCs w:val="22"/>
+        </w:rPr>
+      </w:pPr>
+    </w:p>
+    <w:p>
+      <w:pPr>
+        <w:rPr>
+          <w:b/>
+          <w:bCs/>
+          <w:color w:val="EE0000"/>
+        </w:rPr>
+      </w:pPr>
+      <w:r>
+        <w:rPr>
+          <w:b/>
+          <w:bCs/>
+          <w:color w:val="EE0000"/>
+        </w:rPr>
+        <w:lastRenderedPageBreak/>
+        <w:t>All the expressions returned by the various when clauses must evaluate to the same type (e.g., date, number, varchar).</w:t>
+      </w:r>
+    </w:p>
+    <w:p>
+      <w:pPr>
+        <w:rPr>
+          <w:color w:val="000000" w:themeColor="text1"/>
+          <w:sz w:val="22"/>
+          <w:szCs w:val="22"/>
+        </w:rPr>
+      </w:pPr>
+    </w:p>
+    <w:p>
+      <w:pPr>
+        <w:rPr>
+          <w:b/>
+          <w:bCs/>
+          <w:color w:val="4472C4" w:themeColor="accent1"/>
+        </w:rPr>
+      </w:pPr>
+      <w:r>
+        <w:rPr>
+          <w:b/>
+          <w:bCs/>
+          <w:color w:val="4472C4" w:themeColor="accent1"/>
+        </w:rPr>
+        <w:t>SELECT</w:t>
+      </w:r>
+    </w:p>
+    <w:p>
+      <w:pPr>
+        <w:rPr>
+          <w:b/>
+          <w:bCs/>
+          <w:color w:val="4472C4" w:themeColor="accent1"/>
+        </w:rPr>
+      </w:pPr>
+      <w:r>
+        <w:rPr>
+          <w:b/>
+          <w:bCs/>
+          <w:color w:val="4472C4" w:themeColor="accent1"/>
+        </w:rPr>
+        <w:t xml:space="preserve">    </w:t>
+      </w:r>
+      <w:proofErr w:type="gramStart"/>
+      <w:r>
+        <w:rPr>
+          <w:b/>
+          <w:bCs/>
+          <w:color w:val="4472C4" w:themeColor="accent1"/>
+        </w:rPr>
+        <w:t>SUM(</w:t>
+      </w:r>
+      <w:proofErr w:type="gramEnd"/>
+      <w:r>
+        <w:rPr>
+          <w:b/>
+          <w:bCs/>
+          <w:color w:val="4472C4" w:themeColor="accent1"/>
+        </w:rPr>
+        <w:t xml:space="preserve">CASE WHEN </w:t>
+      </w:r>
+      <w:proofErr w:type="gramStart"/>
+      <w:r>
+        <w:rPr>
+          <w:b/>
+          <w:bCs/>
+          <w:color w:val="4472C4" w:themeColor="accent1"/>
+        </w:rPr>
+        <w:t>MONTHNAME(</w:t>
+      </w:r>
+      <w:proofErr w:type="spellStart"/>
+      <w:proofErr w:type="gramEnd"/>
+      <w:r>
+        <w:rPr>
+          <w:b/>
+          <w:bCs/>
+          <w:color w:val="4472C4" w:themeColor="accent1"/>
+        </w:rPr>
+        <w:t>rental_date</w:t>
+      </w:r>
+      <w:proofErr w:type="spellEnd"/>
+      <w:r>
+        <w:rPr>
+          <w:b/>
+          <w:bCs/>
+          <w:color w:val="4472C4" w:themeColor="accent1"/>
+        </w:rPr>
+        <w:t>) = 'May</w:t>
+      </w:r>
+      <w:proofErr w:type="gramStart"/>
+      <w:r>
+        <w:rPr>
+          <w:b/>
+          <w:bCs/>
+          <w:color w:val="4472C4" w:themeColor="accent1"/>
+        </w:rPr>
+        <w:t>'  THEN</w:t>
+      </w:r>
+      <w:proofErr w:type="gramEnd"/>
+      <w:r>
+        <w:rPr>
+          <w:b/>
+          <w:bCs/>
+          <w:color w:val="4472C4" w:themeColor="accent1"/>
+        </w:rPr>
+        <w:t xml:space="preserve"> 1 ELSE 0 END) AS </w:t>
+      </w:r>
+      <w:proofErr w:type="spellStart"/>
+      <w:r>
+        <w:rPr>
+          <w:b/>
+          <w:bCs/>
+          <w:color w:val="4472C4" w:themeColor="accent1"/>
+        </w:rPr>
+        <w:t>May_rentals</w:t>
+      </w:r>
+      <w:proofErr w:type="spellEnd"/>
+      <w:r>
+        <w:rPr>
+          <w:b/>
+          <w:bCs/>
+          <w:color w:val="4472C4" w:themeColor="accent1"/>
+        </w:rPr>
+        <w:t>,</w:t>
+      </w:r>
+    </w:p>
+    <w:p>
+      <w:pPr>
+        <w:rPr>
+          <w:b/>
+          <w:bCs/>
+          <w:color w:val="4472C4" w:themeColor="accent1"/>
+        </w:rPr>
+      </w:pPr>
+      <w:r>
+        <w:rPr>
+          <w:b/>
+          <w:bCs/>
+          <w:color w:val="4472C4" w:themeColor="accent1"/>
+        </w:rPr>
+        <w:t xml:space="preserve">    </w:t>
+      </w:r>
+      <w:proofErr w:type="gramStart"/>
+      <w:r>
+        <w:rPr>
+          <w:b/>
+          <w:bCs/>
+          <w:color w:val="4472C4" w:themeColor="accent1"/>
+        </w:rPr>
+        <w:t>SUM(</w:t>
+      </w:r>
+      <w:proofErr w:type="gramEnd"/>
+      <w:r>
+        <w:rPr>
+          <w:b/>
+          <w:bCs/>
+          <w:color w:val="4472C4" w:themeColor="accent1"/>
+        </w:rPr>
+        <w:t xml:space="preserve">CASE WHEN </w:t>
+      </w:r>
+      <w:proofErr w:type="gramStart"/>
+      <w:r>
+        <w:rPr>
+          <w:b/>
+          <w:bCs/>
+          <w:color w:val="4472C4" w:themeColor="accent1"/>
+        </w:rPr>
+        <w:t>MONTHNAME(</w:t>
+      </w:r>
+      <w:proofErr w:type="spellStart"/>
+      <w:proofErr w:type="gramEnd"/>
+      <w:r>
+        <w:rPr>
+          <w:b/>
+          <w:bCs/>
+          <w:color w:val="4472C4" w:themeColor="accent1"/>
+        </w:rPr>
+        <w:t>rental_date</w:t>
+      </w:r>
+      <w:proofErr w:type="spellEnd"/>
+      <w:r>
+        <w:rPr>
+          <w:b/>
+          <w:bCs/>
+          <w:color w:val="4472C4" w:themeColor="accent1"/>
+        </w:rPr>
+        <w:t xml:space="preserve">) = 'June' THEN 1 ELSE 0 END) AS </w:t>
+      </w:r>
+      <w:proofErr w:type="spellStart"/>
+      <w:r>
+        <w:rPr>
+          <w:b/>
+          <w:bCs/>
+          <w:color w:val="4472C4" w:themeColor="accent1"/>
+        </w:rPr>
+        <w:t>June_rentals</w:t>
+      </w:r>
+      <w:proofErr w:type="spellEnd"/>
+      <w:r>
+        <w:rPr>
+          <w:b/>
+          <w:bCs/>
+          <w:color w:val="4472C4" w:themeColor="accent1"/>
+        </w:rPr>
+        <w:t>,</w:t>
+      </w:r>
+    </w:p>
+    <w:p>
+      <w:pPr>
+        <w:rPr>
+          <w:b/>
+          <w:bCs/>
+          <w:color w:val="4472C4" w:themeColor="accent1"/>
+        </w:rPr>
+      </w:pPr>
+      <w:r>
+        <w:rPr>
+          <w:b/>
+          <w:bCs/>
+          <w:color w:val="4472C4" w:themeColor="accent1"/>
+        </w:rPr>
+        <w:t xml:space="preserve">    </w:t>
+      </w:r>
+      <w:proofErr w:type="gramStart"/>
+      <w:r>
+        <w:rPr>
+          <w:b/>
+          <w:bCs/>
+          <w:color w:val="4472C4" w:themeColor="accent1"/>
+        </w:rPr>
+        <w:t>SUM(</w:t>
+      </w:r>
+      <w:proofErr w:type="gramEnd"/>
+      <w:r>
+        <w:rPr>
+          <w:b/>
+          <w:bCs/>
+          <w:color w:val="4472C4" w:themeColor="accent1"/>
+        </w:rPr>
+        <w:t xml:space="preserve">CASE WHEN </w:t>
+      </w:r>
+      <w:proofErr w:type="gramStart"/>
+      <w:r>
+        <w:rPr>
+          <w:b/>
+          <w:bCs/>
+          <w:color w:val="4472C4" w:themeColor="accent1"/>
+        </w:rPr>
+        <w:t>MONTHNAME(</w:t>
+      </w:r>
+      <w:proofErr w:type="spellStart"/>
+      <w:proofErr w:type="gramEnd"/>
+      <w:r>
+        <w:rPr>
+          <w:b/>
+          <w:bCs/>
+          <w:color w:val="4472C4" w:themeColor="accent1"/>
+        </w:rPr>
+        <w:t>rental_date</w:t>
+      </w:r>
+      <w:proofErr w:type="spellEnd"/>
+      <w:r>
+        <w:rPr>
+          <w:b/>
+          <w:bCs/>
+          <w:color w:val="4472C4" w:themeColor="accent1"/>
+        </w:rPr>
+        <w:t xml:space="preserve">) = 'July' THEN 1 ELSE 0 END) AS </w:t>
+      </w:r>
+      <w:proofErr w:type="spellStart"/>
+      <w:r>
+        <w:rPr>
+          <w:b/>
+          <w:bCs/>
+          <w:color w:val="4472C4" w:themeColor="accent1"/>
+        </w:rPr>
+        <w:t>July_rentals</w:t>
+      </w:r>
+      <w:proofErr w:type="spellEnd"/>
+    </w:p>
+    <w:p>
+      <w:pPr>
+        <w:rPr>
+          <w:b/>
+          <w:bCs/>
+          <w:color w:val="4472C4" w:themeColor="accent1"/>
+        </w:rPr>
+      </w:pPr>
+      <w:r>
+        <w:rPr>
+          <w:b/>
+          <w:bCs/>
+          <w:color w:val="4472C4" w:themeColor="accent1"/>
+        </w:rPr>
+        <w:t>FROM rental</w:t>
+      </w:r>
+    </w:p>
+    <w:p>
+      <w:pPr>
+        <w:rPr>
+          <w:b/>
+          <w:bCs/>
+          <w:color w:val="4472C4" w:themeColor="accent1"/>
+        </w:rPr>
+      </w:pPr>
+      <w:r>
+        <w:rPr>
+          <w:b/>
+          <w:bCs/>
+          <w:color w:val="4472C4" w:themeColor="accent1"/>
+        </w:rPr>
+        <w:t xml:space="preserve">WHERE </w:t>
+      </w:r>
+      <w:proofErr w:type="spellStart"/>
+      <w:r>
+        <w:rPr>
+          <w:b/>
+          <w:bCs/>
+          <w:color w:val="4472C4" w:themeColor="accent1"/>
+        </w:rPr>
+        <w:t>rental_date</w:t>
+      </w:r>
+      <w:proofErr w:type="spellEnd"/>
+      <w:r>
+        <w:rPr>
+          <w:b/>
+          <w:bCs/>
+          <w:color w:val="4472C4" w:themeColor="accent1"/>
+        </w:rPr>
+        <w:t xml:space="preserve"> BETWEEN '2005-05-01' AND '2005-08-01'</w:t>
+      </w:r>
+      <w:r>
+        <w:rPr>
+          <w:b/>
+          <w:bCs/>
+          <w:color w:val="4472C4" w:themeColor="accent1"/>
+        </w:rPr>
+        <w:t>;</w:t>
+      </w:r>
+    </w:p>
+    <w:p>
+      <w:pPr>
+        <w:rPr>
+          <w:color w:val="000000" w:themeColor="text1"/>
+          <w:sz w:val="22"/>
+          <w:szCs w:val="22"/>
+        </w:rPr>
+      </w:pPr>
+      <w:r>
+        <w:rPr>
+          <w:color w:val="000000" w:themeColor="text1"/>
+          <w:sz w:val="22"/>
+          <w:szCs w:val="22"/>
+        </w:rPr>
+        <w:t>This returns one column per each making a row of 3 columns</w:t>
+      </w:r>
+    </w:p>
+    <w:p>
+      <w:pPr>
+        <w:rPr>
+          <w:color w:val="000000" w:themeColor="text1"/>
+          <w:sz w:val="22"/>
+          <w:szCs w:val="22"/>
+        </w:rPr>
+      </w:pPr>
+      <w:r>
+        <w:rPr>
+          <w:color w:val="000000" w:themeColor="text1"/>
+          <w:sz w:val="22"/>
+          <w:szCs w:val="22"/>
+        </w:rPr>
+        <w:t xml:space="preserve">If a query contains aggregates and </w:t>
+      </w:r>
+      <w:r>
+        <w:rPr>
+          <w:b/>
+          <w:bCs/>
+          <w:color w:val="000000" w:themeColor="text1"/>
+          <w:sz w:val="22"/>
+          <w:szCs w:val="22"/>
+        </w:rPr>
+        <w:t>no GROUP BY</w:t>
+      </w:r>
+      <w:r>
+        <w:rPr>
+          <w:color w:val="000000" w:themeColor="text1"/>
+          <w:sz w:val="22"/>
+          <w:szCs w:val="22"/>
+        </w:rPr>
+        <w:t>, the result is one</w:t>
+      </w:r>
+      <w:r>
+        <w:rPr>
+          <w:b/>
+          <w:bCs/>
+          <w:color w:val="000000" w:themeColor="text1"/>
+          <w:sz w:val="22"/>
+          <w:szCs w:val="22"/>
+        </w:rPr>
+        <w:t xml:space="preserve"> row for the entire dataset</w:t>
+      </w:r>
+      <w:r>
+        <w:rPr>
+          <w:color w:val="000000" w:themeColor="text1"/>
+          <w:sz w:val="22"/>
+          <w:szCs w:val="22"/>
+        </w:rPr>
+        <w:t>.</w:t>
       </w:r>
     </w:p>
     <w:p>
@@ -19986,250 +21172,1289 @@
           <w:color w:val="000000" w:themeColor="text1"/>
           <w:u w:val="single"/>
         </w:rPr>
-        <w:t>Cross Join:</w:t>
-      </w:r>
-    </w:p>
-    <w:p>
-      <w:pPr>
-        <w:rPr>
-          <w:color w:val="000000" w:themeColor="text1"/>
-          <w:sz w:val="22"/>
-          <w:szCs w:val="22"/>
-        </w:rPr>
-      </w:pPr>
-      <w:r>
-        <w:rPr>
-          <w:color w:val="000000" w:themeColor="text1"/>
-          <w:sz w:val="22"/>
-          <w:szCs w:val="22"/>
-        </w:rPr>
-        <w:t>the c</w:t>
-      </w:r>
-      <w:r>
-        <w:rPr>
-          <w:color w:val="000000" w:themeColor="text1"/>
-          <w:sz w:val="22"/>
-          <w:szCs w:val="22"/>
-        </w:rPr>
-        <w:t>ro</w:t>
-      </w:r>
-      <w:r>
-        <w:rPr>
-          <w:color w:val="000000" w:themeColor="text1"/>
-          <w:sz w:val="22"/>
-          <w:szCs w:val="22"/>
-        </w:rPr>
-        <w:t>ss join just every element from the left joined to every element from the right with no con</w:t>
-      </w:r>
-      <w:r>
-        <w:rPr>
-          <w:color w:val="000000" w:themeColor="text1"/>
-          <w:sz w:val="22"/>
-          <w:szCs w:val="22"/>
-        </w:rPr>
-        <w:t>d</w:t>
-      </w:r>
-      <w:r>
-        <w:rPr>
-          <w:color w:val="000000" w:themeColor="text1"/>
-          <w:sz w:val="22"/>
-          <w:szCs w:val="22"/>
-        </w:rPr>
-        <w:t>i</w:t>
-      </w:r>
-      <w:r>
-        <w:rPr>
-          <w:color w:val="000000" w:themeColor="text1"/>
-          <w:sz w:val="22"/>
-          <w:szCs w:val="22"/>
-        </w:rPr>
-        <w:t>t</w:t>
-      </w:r>
-      <w:r>
-        <w:rPr>
-          <w:color w:val="000000" w:themeColor="text1"/>
-          <w:sz w:val="22"/>
-          <w:szCs w:val="22"/>
-        </w:rPr>
-        <w:t>ions?</w:t>
-      </w:r>
-    </w:p>
-    <w:p>
-      <w:pPr>
-        <w:rPr>
-          <w:color w:val="000000" w:themeColor="text1"/>
-          <w:sz w:val="22"/>
-          <w:szCs w:val="22"/>
-        </w:rPr>
-      </w:pPr>
-      <w:r>
-        <w:rPr>
-          <w:color w:val="000000" w:themeColor="text1"/>
-          <w:sz w:val="22"/>
-          <w:szCs w:val="22"/>
-        </w:rPr>
-        <w:t>Its usually mistakenly used and it may generate memory chaos.</w:t>
-      </w:r>
-    </w:p>
-    <w:p>
-      <w:pPr>
-        <w:rPr>
-          <w:color w:val="000000" w:themeColor="text1"/>
-          <w:sz w:val="22"/>
-          <w:szCs w:val="22"/>
-        </w:rPr>
-      </w:pPr>
-    </w:p>
-    <w:p>
-      <w:pPr>
+        <w:t>Checking for Existence</w:t>
+      </w:r>
+      <w:r>
         <w:rPr>
           <w:b/>
           <w:bCs/>
           <w:color w:val="000000" w:themeColor="text1"/>
           <w:u w:val="single"/>
         </w:rPr>
-      </w:pPr>
-      <w:r>
+        <w:t>:</w:t>
+      </w:r>
+    </w:p>
+    <w:p>
+      <w:pPr>
+        <w:rPr>
+          <w:color w:val="000000" w:themeColor="text1"/>
+          <w:sz w:val="22"/>
+          <w:szCs w:val="22"/>
+        </w:rPr>
+      </w:pPr>
+      <w:r>
+        <w:rPr>
+          <w:color w:val="000000" w:themeColor="text1"/>
+          <w:sz w:val="22"/>
+          <w:szCs w:val="22"/>
+        </w:rPr>
+        <w:t xml:space="preserve">The core idea is: EXISTS is used inside a CASE to turn a relational “does a related row exist?” question into a simple output value. Instead of counting rows or returning data, the subquery checks whether a relationship exists between the current row in the outer query and any matching rows in another table (via a correlated condition). Then CASE takes the TRUE/FALSE result from EXISTS and converts it into something meaningful like 'Y' or 'N', or any label you choose. </w:t>
+      </w:r>
+      <w:proofErr w:type="gramStart"/>
+      <w:r>
+        <w:rPr>
+          <w:color w:val="000000" w:themeColor="text1"/>
+          <w:sz w:val="22"/>
+          <w:szCs w:val="22"/>
+        </w:rPr>
+        <w:t>So</w:t>
+      </w:r>
+      <w:proofErr w:type="gramEnd"/>
+      <w:r>
+        <w:rPr>
+          <w:color w:val="000000" w:themeColor="text1"/>
+          <w:sz w:val="22"/>
+          <w:szCs w:val="22"/>
+        </w:rPr>
+        <w:t xml:space="preserve"> the logic flow is: for each row in the outer table, SQL asks “is there at least one related record that satisfies this condition?” (EXISTS), and then CASE translates that existence check into a readable classification.</w:t>
+      </w:r>
+    </w:p>
+    <w:p>
+      <w:pPr>
+        <w:rPr>
+          <w:b/>
+          <w:bCs/>
+          <w:color w:val="4472C4" w:themeColor="accent1"/>
+        </w:rPr>
+      </w:pPr>
+      <w:r>
+        <w:rPr>
+          <w:b/>
+          <w:bCs/>
+          <w:color w:val="4472C4" w:themeColor="accent1"/>
+        </w:rPr>
+        <w:t xml:space="preserve">SELECT </w:t>
+      </w:r>
+      <w:proofErr w:type="spellStart"/>
+      <w:proofErr w:type="gramStart"/>
+      <w:r>
+        <w:rPr>
+          <w:b/>
+          <w:bCs/>
+          <w:color w:val="4472C4" w:themeColor="accent1"/>
+        </w:rPr>
+        <w:t>a.first</w:t>
+      </w:r>
+      <w:proofErr w:type="gramEnd"/>
+      <w:r>
+        <w:rPr>
+          <w:b/>
+          <w:bCs/>
+          <w:color w:val="4472C4" w:themeColor="accent1"/>
+        </w:rPr>
+        <w:t>_name</w:t>
+      </w:r>
+      <w:proofErr w:type="spellEnd"/>
+      <w:r>
+        <w:rPr>
+          <w:b/>
+          <w:bCs/>
+          <w:color w:val="4472C4" w:themeColor="accent1"/>
+        </w:rPr>
+        <w:t xml:space="preserve">, </w:t>
+      </w:r>
+      <w:proofErr w:type="spellStart"/>
+      <w:proofErr w:type="gramStart"/>
+      <w:r>
+        <w:rPr>
+          <w:b/>
+          <w:bCs/>
+          <w:color w:val="4472C4" w:themeColor="accent1"/>
+        </w:rPr>
+        <w:t>a.last</w:t>
+      </w:r>
+      <w:proofErr w:type="gramEnd"/>
+      <w:r>
+        <w:rPr>
+          <w:b/>
+          <w:bCs/>
+          <w:color w:val="4472C4" w:themeColor="accent1"/>
+        </w:rPr>
+        <w:t>_name</w:t>
+      </w:r>
+      <w:proofErr w:type="spellEnd"/>
+      <w:r>
+        <w:rPr>
+          <w:b/>
+          <w:bCs/>
+          <w:color w:val="4472C4" w:themeColor="accent1"/>
+        </w:rPr>
+        <w:t>,</w:t>
+      </w:r>
+    </w:p>
+    <w:p>
+      <w:pPr>
+        <w:rPr>
+          <w:b/>
+          <w:bCs/>
+          <w:color w:val="4472C4" w:themeColor="accent1"/>
+        </w:rPr>
+      </w:pPr>
+      <w:r>
+        <w:rPr>
+          <w:b/>
+          <w:bCs/>
+          <w:color w:val="4472C4" w:themeColor="accent1"/>
+        </w:rPr>
+        <w:t xml:space="preserve">       CASE WHEN EXISTS (SELECT 1 FROM </w:t>
+      </w:r>
+      <w:proofErr w:type="spellStart"/>
+      <w:r>
+        <w:rPr>
+          <w:b/>
+          <w:bCs/>
+          <w:color w:val="4472C4" w:themeColor="accent1"/>
+        </w:rPr>
+        <w:t>film_actor</w:t>
+      </w:r>
+      <w:proofErr w:type="spellEnd"/>
+      <w:r>
+        <w:rPr>
+          <w:b/>
+          <w:bCs/>
+          <w:color w:val="4472C4" w:themeColor="accent1"/>
+        </w:rPr>
+        <w:t xml:space="preserve"> fa INNER JOIN film f ON </w:t>
+      </w:r>
+      <w:proofErr w:type="spellStart"/>
+      <w:proofErr w:type="gramStart"/>
+      <w:r>
+        <w:rPr>
+          <w:b/>
+          <w:bCs/>
+          <w:color w:val="4472C4" w:themeColor="accent1"/>
+        </w:rPr>
+        <w:t>fa.film</w:t>
+      </w:r>
+      <w:proofErr w:type="gramEnd"/>
+      <w:r>
+        <w:rPr>
+          <w:b/>
+          <w:bCs/>
+          <w:color w:val="4472C4" w:themeColor="accent1"/>
+        </w:rPr>
+        <w:t>_id</w:t>
+      </w:r>
+      <w:proofErr w:type="spellEnd"/>
+      <w:r>
+        <w:rPr>
+          <w:b/>
+          <w:bCs/>
+          <w:color w:val="4472C4" w:themeColor="accent1"/>
+        </w:rPr>
+        <w:t xml:space="preserve"> = </w:t>
+      </w:r>
+      <w:proofErr w:type="spellStart"/>
+      <w:proofErr w:type="gramStart"/>
+      <w:r>
+        <w:rPr>
+          <w:b/>
+          <w:bCs/>
+          <w:color w:val="4472C4" w:themeColor="accent1"/>
+        </w:rPr>
+        <w:t>f.film</w:t>
+      </w:r>
+      <w:proofErr w:type="gramEnd"/>
+      <w:r>
+        <w:rPr>
+          <w:b/>
+          <w:bCs/>
+          <w:color w:val="4472C4" w:themeColor="accent1"/>
+        </w:rPr>
+        <w:t>_id</w:t>
+      </w:r>
+      <w:proofErr w:type="spellEnd"/>
+      <w:r>
+        <w:rPr>
+          <w:b/>
+          <w:bCs/>
+          <w:color w:val="4472C4" w:themeColor="accent1"/>
+        </w:rPr>
+        <w:t xml:space="preserve"> WHERE </w:t>
+      </w:r>
+      <w:proofErr w:type="spellStart"/>
+      <w:proofErr w:type="gramStart"/>
+      <w:r>
+        <w:rPr>
+          <w:b/>
+          <w:bCs/>
+          <w:color w:val="4472C4" w:themeColor="accent1"/>
+        </w:rPr>
+        <w:t>fa.actor</w:t>
+      </w:r>
+      <w:proofErr w:type="gramEnd"/>
+      <w:r>
+        <w:rPr>
+          <w:b/>
+          <w:bCs/>
+          <w:color w:val="4472C4" w:themeColor="accent1"/>
+        </w:rPr>
+        <w:t>_id</w:t>
+      </w:r>
+      <w:proofErr w:type="spellEnd"/>
+      <w:r>
+        <w:rPr>
+          <w:b/>
+          <w:bCs/>
+          <w:color w:val="4472C4" w:themeColor="accent1"/>
+        </w:rPr>
+        <w:t xml:space="preserve"> = </w:t>
+      </w:r>
+      <w:proofErr w:type="spellStart"/>
+      <w:proofErr w:type="gramStart"/>
+      <w:r>
+        <w:rPr>
+          <w:b/>
+          <w:bCs/>
+          <w:color w:val="4472C4" w:themeColor="accent1"/>
+        </w:rPr>
+        <w:t>a.actor</w:t>
+      </w:r>
+      <w:proofErr w:type="gramEnd"/>
+      <w:r>
+        <w:rPr>
+          <w:b/>
+          <w:bCs/>
+          <w:color w:val="4472C4" w:themeColor="accent1"/>
+        </w:rPr>
+        <w:t>_id</w:t>
+      </w:r>
+      <w:proofErr w:type="spellEnd"/>
+      <w:r>
+        <w:rPr>
+          <w:b/>
+          <w:bCs/>
+          <w:color w:val="4472C4" w:themeColor="accent1"/>
+        </w:rPr>
+        <w:t xml:space="preserve"> AND </w:t>
+      </w:r>
+      <w:proofErr w:type="spellStart"/>
+      <w:proofErr w:type="gramStart"/>
+      <w:r>
+        <w:rPr>
+          <w:b/>
+          <w:bCs/>
+          <w:color w:val="4472C4" w:themeColor="accent1"/>
+        </w:rPr>
+        <w:t>f.rating</w:t>
+      </w:r>
+      <w:proofErr w:type="spellEnd"/>
+      <w:proofErr w:type="gramEnd"/>
+      <w:r>
+        <w:rPr>
+          <w:b/>
+          <w:bCs/>
+          <w:color w:val="4472C4" w:themeColor="accent1"/>
+        </w:rPr>
+        <w:t xml:space="preserve"> = 'G') THEN 'Y' ELSE 'N' END AS </w:t>
+      </w:r>
+      <w:proofErr w:type="spellStart"/>
+      <w:r>
+        <w:rPr>
+          <w:b/>
+          <w:bCs/>
+          <w:color w:val="4472C4" w:themeColor="accent1"/>
+        </w:rPr>
+        <w:t>g_actor</w:t>
+      </w:r>
+      <w:proofErr w:type="spellEnd"/>
+      <w:r>
+        <w:rPr>
+          <w:b/>
+          <w:bCs/>
+          <w:color w:val="4472C4" w:themeColor="accent1"/>
+        </w:rPr>
+        <w:t>,</w:t>
+      </w:r>
+    </w:p>
+    <w:p>
+      <w:pPr>
+        <w:rPr>
+          <w:b/>
+          <w:bCs/>
+          <w:color w:val="4472C4" w:themeColor="accent1"/>
+        </w:rPr>
+      </w:pPr>
+      <w:r>
+        <w:rPr>
+          <w:b/>
+          <w:bCs/>
+          <w:color w:val="4472C4" w:themeColor="accent1"/>
+        </w:rPr>
+        <w:t xml:space="preserve">       CASE WHEN EXISTS (SELECT 1 FROM </w:t>
+      </w:r>
+      <w:proofErr w:type="spellStart"/>
+      <w:r>
+        <w:rPr>
+          <w:b/>
+          <w:bCs/>
+          <w:color w:val="4472C4" w:themeColor="accent1"/>
+        </w:rPr>
+        <w:t>film_actor</w:t>
+      </w:r>
+      <w:proofErr w:type="spellEnd"/>
+      <w:r>
+        <w:rPr>
+          <w:b/>
+          <w:bCs/>
+          <w:color w:val="4472C4" w:themeColor="accent1"/>
+        </w:rPr>
+        <w:t xml:space="preserve"> fa INNER JOIN film f ON </w:t>
+      </w:r>
+      <w:proofErr w:type="spellStart"/>
+      <w:proofErr w:type="gramStart"/>
+      <w:r>
+        <w:rPr>
+          <w:b/>
+          <w:bCs/>
+          <w:color w:val="4472C4" w:themeColor="accent1"/>
+        </w:rPr>
+        <w:t>fa.film</w:t>
+      </w:r>
+      <w:proofErr w:type="gramEnd"/>
+      <w:r>
+        <w:rPr>
+          <w:b/>
+          <w:bCs/>
+          <w:color w:val="4472C4" w:themeColor="accent1"/>
+        </w:rPr>
+        <w:t>_id</w:t>
+      </w:r>
+      <w:proofErr w:type="spellEnd"/>
+      <w:r>
+        <w:rPr>
+          <w:b/>
+          <w:bCs/>
+          <w:color w:val="4472C4" w:themeColor="accent1"/>
+        </w:rPr>
+        <w:t xml:space="preserve"> = </w:t>
+      </w:r>
+      <w:proofErr w:type="spellStart"/>
+      <w:proofErr w:type="gramStart"/>
+      <w:r>
+        <w:rPr>
+          <w:b/>
+          <w:bCs/>
+          <w:color w:val="4472C4" w:themeColor="accent1"/>
+        </w:rPr>
+        <w:t>f.film</w:t>
+      </w:r>
+      <w:proofErr w:type="gramEnd"/>
+      <w:r>
+        <w:rPr>
+          <w:b/>
+          <w:bCs/>
+          <w:color w:val="4472C4" w:themeColor="accent1"/>
+        </w:rPr>
+        <w:t>_id</w:t>
+      </w:r>
+      <w:proofErr w:type="spellEnd"/>
+      <w:r>
+        <w:rPr>
+          <w:b/>
+          <w:bCs/>
+          <w:color w:val="4472C4" w:themeColor="accent1"/>
+        </w:rPr>
+        <w:t xml:space="preserve"> WHERE </w:t>
+      </w:r>
+      <w:proofErr w:type="spellStart"/>
+      <w:proofErr w:type="gramStart"/>
+      <w:r>
+        <w:rPr>
+          <w:b/>
+          <w:bCs/>
+          <w:color w:val="4472C4" w:themeColor="accent1"/>
+        </w:rPr>
+        <w:t>fa.actor</w:t>
+      </w:r>
+      <w:proofErr w:type="gramEnd"/>
+      <w:r>
+        <w:rPr>
+          <w:b/>
+          <w:bCs/>
+          <w:color w:val="4472C4" w:themeColor="accent1"/>
+        </w:rPr>
+        <w:t>_id</w:t>
+      </w:r>
+      <w:proofErr w:type="spellEnd"/>
+      <w:r>
+        <w:rPr>
+          <w:b/>
+          <w:bCs/>
+          <w:color w:val="4472C4" w:themeColor="accent1"/>
+        </w:rPr>
+        <w:t xml:space="preserve"> = </w:t>
+      </w:r>
+      <w:proofErr w:type="spellStart"/>
+      <w:proofErr w:type="gramStart"/>
+      <w:r>
+        <w:rPr>
+          <w:b/>
+          <w:bCs/>
+          <w:color w:val="4472C4" w:themeColor="accent1"/>
+        </w:rPr>
+        <w:t>a.actor</w:t>
+      </w:r>
+      <w:proofErr w:type="gramEnd"/>
+      <w:r>
+        <w:rPr>
+          <w:b/>
+          <w:bCs/>
+          <w:color w:val="4472C4" w:themeColor="accent1"/>
+        </w:rPr>
+        <w:t>_id</w:t>
+      </w:r>
+      <w:proofErr w:type="spellEnd"/>
+      <w:r>
+        <w:rPr>
+          <w:b/>
+          <w:bCs/>
+          <w:color w:val="4472C4" w:themeColor="accent1"/>
+        </w:rPr>
+        <w:t xml:space="preserve"> AND </w:t>
+      </w:r>
+      <w:proofErr w:type="spellStart"/>
+      <w:proofErr w:type="gramStart"/>
+      <w:r>
+        <w:rPr>
+          <w:b/>
+          <w:bCs/>
+          <w:color w:val="4472C4" w:themeColor="accent1"/>
+        </w:rPr>
+        <w:t>f.rating</w:t>
+      </w:r>
+      <w:proofErr w:type="spellEnd"/>
+      <w:proofErr w:type="gramEnd"/>
+      <w:r>
+        <w:rPr>
+          <w:b/>
+          <w:bCs/>
+          <w:color w:val="4472C4" w:themeColor="accent1"/>
+        </w:rPr>
+        <w:t xml:space="preserve"> = 'PG') THEN 'Y' ELSE 'N' END AS </w:t>
+      </w:r>
+      <w:proofErr w:type="spellStart"/>
+      <w:r>
+        <w:rPr>
+          <w:b/>
+          <w:bCs/>
+          <w:color w:val="4472C4" w:themeColor="accent1"/>
+        </w:rPr>
+        <w:t>pg_actor</w:t>
+      </w:r>
+      <w:proofErr w:type="spellEnd"/>
+      <w:r>
+        <w:rPr>
+          <w:b/>
+          <w:bCs/>
+          <w:color w:val="4472C4" w:themeColor="accent1"/>
+        </w:rPr>
+        <w:t>,</w:t>
+      </w:r>
+    </w:p>
+    <w:p>
+      <w:pPr>
+        <w:rPr>
+          <w:b/>
+          <w:bCs/>
+          <w:color w:val="4472C4" w:themeColor="accent1"/>
+        </w:rPr>
+      </w:pPr>
+      <w:r>
+        <w:rPr>
+          <w:b/>
+          <w:bCs/>
+          <w:color w:val="4472C4" w:themeColor="accent1"/>
+        </w:rPr>
+        <w:lastRenderedPageBreak/>
+        <w:t xml:space="preserve">       CASE WHEN EXISTS (SELECT 1 FROM </w:t>
+      </w:r>
+      <w:proofErr w:type="spellStart"/>
+      <w:r>
+        <w:rPr>
+          <w:b/>
+          <w:bCs/>
+          <w:color w:val="4472C4" w:themeColor="accent1"/>
+        </w:rPr>
+        <w:t>film_actor</w:t>
+      </w:r>
+      <w:proofErr w:type="spellEnd"/>
+      <w:r>
+        <w:rPr>
+          <w:b/>
+          <w:bCs/>
+          <w:color w:val="4472C4" w:themeColor="accent1"/>
+        </w:rPr>
+        <w:t xml:space="preserve"> fa INNER JOIN film f ON </w:t>
+      </w:r>
+      <w:proofErr w:type="spellStart"/>
+      <w:proofErr w:type="gramStart"/>
+      <w:r>
+        <w:rPr>
+          <w:b/>
+          <w:bCs/>
+          <w:color w:val="4472C4" w:themeColor="accent1"/>
+        </w:rPr>
+        <w:t>fa.film</w:t>
+      </w:r>
+      <w:proofErr w:type="gramEnd"/>
+      <w:r>
+        <w:rPr>
+          <w:b/>
+          <w:bCs/>
+          <w:color w:val="4472C4" w:themeColor="accent1"/>
+        </w:rPr>
+        <w:t>_id</w:t>
+      </w:r>
+      <w:proofErr w:type="spellEnd"/>
+      <w:r>
+        <w:rPr>
+          <w:b/>
+          <w:bCs/>
+          <w:color w:val="4472C4" w:themeColor="accent1"/>
+        </w:rPr>
+        <w:t xml:space="preserve"> = </w:t>
+      </w:r>
+      <w:proofErr w:type="spellStart"/>
+      <w:proofErr w:type="gramStart"/>
+      <w:r>
+        <w:rPr>
+          <w:b/>
+          <w:bCs/>
+          <w:color w:val="4472C4" w:themeColor="accent1"/>
+        </w:rPr>
+        <w:t>f.film</w:t>
+      </w:r>
+      <w:proofErr w:type="gramEnd"/>
+      <w:r>
+        <w:rPr>
+          <w:b/>
+          <w:bCs/>
+          <w:color w:val="4472C4" w:themeColor="accent1"/>
+        </w:rPr>
+        <w:t>_id</w:t>
+      </w:r>
+      <w:proofErr w:type="spellEnd"/>
+      <w:r>
+        <w:rPr>
+          <w:b/>
+          <w:bCs/>
+          <w:color w:val="4472C4" w:themeColor="accent1"/>
+        </w:rPr>
+        <w:t xml:space="preserve"> WHERE </w:t>
+      </w:r>
+      <w:proofErr w:type="spellStart"/>
+      <w:proofErr w:type="gramStart"/>
+      <w:r>
+        <w:rPr>
+          <w:b/>
+          <w:bCs/>
+          <w:color w:val="4472C4" w:themeColor="accent1"/>
+        </w:rPr>
+        <w:t>fa.actor</w:t>
+      </w:r>
+      <w:proofErr w:type="gramEnd"/>
+      <w:r>
+        <w:rPr>
+          <w:b/>
+          <w:bCs/>
+          <w:color w:val="4472C4" w:themeColor="accent1"/>
+        </w:rPr>
+        <w:t>_id</w:t>
+      </w:r>
+      <w:proofErr w:type="spellEnd"/>
+      <w:r>
+        <w:rPr>
+          <w:b/>
+          <w:bCs/>
+          <w:color w:val="4472C4" w:themeColor="accent1"/>
+        </w:rPr>
+        <w:t xml:space="preserve"> = </w:t>
+      </w:r>
+      <w:proofErr w:type="spellStart"/>
+      <w:proofErr w:type="gramStart"/>
+      <w:r>
+        <w:rPr>
+          <w:b/>
+          <w:bCs/>
+          <w:color w:val="4472C4" w:themeColor="accent1"/>
+        </w:rPr>
+        <w:t>a.actor</w:t>
+      </w:r>
+      <w:proofErr w:type="gramEnd"/>
+      <w:r>
+        <w:rPr>
+          <w:b/>
+          <w:bCs/>
+          <w:color w:val="4472C4" w:themeColor="accent1"/>
+        </w:rPr>
+        <w:t>_id</w:t>
+      </w:r>
+      <w:proofErr w:type="spellEnd"/>
+      <w:r>
+        <w:rPr>
+          <w:b/>
+          <w:bCs/>
+          <w:color w:val="4472C4" w:themeColor="accent1"/>
+        </w:rPr>
+        <w:t xml:space="preserve"> AND </w:t>
+      </w:r>
+      <w:proofErr w:type="spellStart"/>
+      <w:proofErr w:type="gramStart"/>
+      <w:r>
+        <w:rPr>
+          <w:b/>
+          <w:bCs/>
+          <w:color w:val="4472C4" w:themeColor="accent1"/>
+        </w:rPr>
+        <w:t>f.rating</w:t>
+      </w:r>
+      <w:proofErr w:type="spellEnd"/>
+      <w:proofErr w:type="gramEnd"/>
+      <w:r>
+        <w:rPr>
+          <w:b/>
+          <w:bCs/>
+          <w:color w:val="4472C4" w:themeColor="accent1"/>
+        </w:rPr>
+        <w:t xml:space="preserve"> = 'NC-17') THEN 'Y' ELSE 'N' END AS nc17_actor</w:t>
+      </w:r>
+    </w:p>
+    <w:p>
+      <w:pPr>
+        <w:rPr>
+          <w:b/>
+          <w:bCs/>
+          <w:color w:val="4472C4" w:themeColor="accent1"/>
+        </w:rPr>
+      </w:pPr>
+      <w:r>
+        <w:rPr>
+          <w:b/>
+          <w:bCs/>
+          <w:color w:val="4472C4" w:themeColor="accent1"/>
+        </w:rPr>
+        <w:t>FROM actor a</w:t>
+      </w:r>
+    </w:p>
+    <w:p>
+      <w:pPr>
+        <w:rPr>
+          <w:b/>
+          <w:bCs/>
+          <w:color w:val="4472C4" w:themeColor="accent1"/>
+        </w:rPr>
+      </w:pPr>
+      <w:r>
+        <w:rPr>
+          <w:b/>
+          <w:bCs/>
+          <w:color w:val="4472C4" w:themeColor="accent1"/>
+        </w:rPr>
+        <w:t xml:space="preserve">WHERE </w:t>
+      </w:r>
+      <w:proofErr w:type="spellStart"/>
+      <w:proofErr w:type="gramStart"/>
+      <w:r>
+        <w:rPr>
+          <w:b/>
+          <w:bCs/>
+          <w:color w:val="4472C4" w:themeColor="accent1"/>
+        </w:rPr>
+        <w:t>a.last</w:t>
+      </w:r>
+      <w:proofErr w:type="gramEnd"/>
+      <w:r>
+        <w:rPr>
+          <w:b/>
+          <w:bCs/>
+          <w:color w:val="4472C4" w:themeColor="accent1"/>
+        </w:rPr>
+        <w:t>_name</w:t>
+      </w:r>
+      <w:proofErr w:type="spellEnd"/>
+      <w:r>
+        <w:rPr>
+          <w:b/>
+          <w:bCs/>
+          <w:color w:val="4472C4" w:themeColor="accent1"/>
+        </w:rPr>
+        <w:t xml:space="preserve"> LIKE 'S%' OR </w:t>
+      </w:r>
+      <w:proofErr w:type="spellStart"/>
+      <w:proofErr w:type="gramStart"/>
+      <w:r>
+        <w:rPr>
+          <w:b/>
+          <w:bCs/>
+          <w:color w:val="4472C4" w:themeColor="accent1"/>
+        </w:rPr>
+        <w:t>a.first</w:t>
+      </w:r>
+      <w:proofErr w:type="gramEnd"/>
+      <w:r>
+        <w:rPr>
+          <w:b/>
+          <w:bCs/>
+          <w:color w:val="4472C4" w:themeColor="accent1"/>
+        </w:rPr>
+        <w:t>_name</w:t>
+      </w:r>
+      <w:proofErr w:type="spellEnd"/>
+      <w:r>
+        <w:rPr>
+          <w:b/>
+          <w:bCs/>
+          <w:color w:val="4472C4" w:themeColor="accent1"/>
+        </w:rPr>
+        <w:t xml:space="preserve"> LIKE 'S%';</w:t>
+      </w:r>
+    </w:p>
+    <w:p>
+      <w:pPr>
+        <w:rPr>
+          <w:b/>
+          <w:bCs/>
+          <w:color w:val="4472C4" w:themeColor="accent1"/>
+        </w:rPr>
+      </w:pPr>
+    </w:p>
+    <w:p>
+      <w:pPr>
+        <w:rPr>
+          <w:color w:val="000000" w:themeColor="text1"/>
+          <w:sz w:val="22"/>
+          <w:szCs w:val="22"/>
+        </w:rPr>
+      </w:pPr>
+    </w:p>
+    <w:p>
+      <w:pPr>
         <w:rPr>
           <w:b/>
           <w:bCs/>
           <w:color w:val="000000" w:themeColor="text1"/>
           <w:u w:val="single"/>
         </w:rPr>
-        <w:t>Natural Join:</w:t>
-      </w:r>
-    </w:p>
-    <w:p>
-      <w:pPr>
-        <w:rPr>
-          <w:color w:val="000000" w:themeColor="text1"/>
-          <w:sz w:val="22"/>
-          <w:szCs w:val="22"/>
-        </w:rPr>
-      </w:pPr>
-      <w:r>
-        <w:rPr>
-          <w:color w:val="000000" w:themeColor="text1"/>
-          <w:sz w:val="22"/>
-          <w:szCs w:val="22"/>
-        </w:rPr>
-        <w:t>A NATURAL JOIN automatically joins two tables using all columns that have the same name in both tables.</w:t>
-      </w:r>
-      <w:r>
-        <w:rPr>
-          <w:color w:val="000000" w:themeColor="text1"/>
-          <w:sz w:val="22"/>
-          <w:szCs w:val="22"/>
-        </w:rPr>
-        <w:t xml:space="preserve"> In real world its avoided since it can behave un-expectedly.</w:t>
-      </w:r>
-    </w:p>
-    <w:p>
-      <w:pPr>
-        <w:rPr>
-          <w:color w:val="000000" w:themeColor="text1"/>
-          <w:sz w:val="22"/>
-          <w:szCs w:val="22"/>
-        </w:rPr>
-      </w:pPr>
-      <w:r>
-        <w:rPr>
-          <w:color w:val="000000" w:themeColor="text1"/>
-          <w:sz w:val="22"/>
-          <w:szCs w:val="22"/>
-        </w:rPr>
-        <w:t>NATURAL JOIN can be dangerous because:</w:t>
-      </w:r>
-    </w:p>
-    <w:p>
-      <w:pPr>
-        <w:rPr>
-          <w:color w:val="000000" w:themeColor="text1"/>
-          <w:sz w:val="22"/>
-          <w:szCs w:val="22"/>
-        </w:rPr>
-      </w:pPr>
-      <w:r>
-        <w:rPr>
-          <w:color w:val="000000" w:themeColor="text1"/>
-          <w:sz w:val="22"/>
-          <w:szCs w:val="22"/>
+      </w:pPr>
+      <w:r>
+        <w:rPr>
+          <w:b/>
+          <w:bCs/>
+          <w:color w:val="000000" w:themeColor="text1"/>
+          <w:u w:val="single"/>
+        </w:rPr>
+        <w:t>Conditional Updates</w:t>
+      </w:r>
+      <w:r>
+        <w:rPr>
+          <w:b/>
+          <w:bCs/>
+          <w:color w:val="000000" w:themeColor="text1"/>
+          <w:u w:val="single"/>
+        </w:rPr>
+        <w:t>:</w:t>
+      </w:r>
+    </w:p>
+    <w:p>
+      <w:pPr>
+        <w:rPr>
+          <w:color w:val="000000" w:themeColor="text1"/>
+          <w:sz w:val="22"/>
+          <w:szCs w:val="22"/>
+        </w:rPr>
+      </w:pPr>
+      <w:r>
+        <w:rPr>
+          <w:color w:val="000000" w:themeColor="text1"/>
+          <w:sz w:val="22"/>
+          <w:szCs w:val="22"/>
+        </w:rPr>
+        <w:t xml:space="preserve">Conditional updates in SQL allow you to change column values based on logic rather than assigning a fixed value to every row, typically using a CASE expression inside an UPDATE statement. In the example, the goal is to deactivate customers who haven’t rented a film in the last 90 days by setting active to 0 or keeping it as 1. This is achieved by using a correlated subquery, which calculates, for each customer individually, how many days have passed since their most recent rental using </w:t>
+      </w:r>
+      <w:proofErr w:type="gramStart"/>
+      <w:r>
+        <w:rPr>
+          <w:color w:val="000000" w:themeColor="text1"/>
+          <w:sz w:val="22"/>
+          <w:szCs w:val="22"/>
+        </w:rPr>
+        <w:t>MAX(</w:t>
+      </w:r>
+      <w:proofErr w:type="spellStart"/>
+      <w:proofErr w:type="gramEnd"/>
+      <w:r>
+        <w:rPr>
+          <w:color w:val="000000" w:themeColor="text1"/>
+          <w:sz w:val="22"/>
+          <w:szCs w:val="22"/>
+        </w:rPr>
+        <w:t>rental_date</w:t>
+      </w:r>
+      <w:proofErr w:type="spellEnd"/>
+      <w:r>
+        <w:rPr>
+          <w:color w:val="000000" w:themeColor="text1"/>
+          <w:sz w:val="22"/>
+          <w:szCs w:val="22"/>
+        </w:rPr>
+        <w:t>) and DATEDIFF(</w:t>
+      </w:r>
+      <w:proofErr w:type="gramStart"/>
+      <w:r>
+        <w:rPr>
+          <w:color w:val="000000" w:themeColor="text1"/>
+          <w:sz w:val="22"/>
+          <w:szCs w:val="22"/>
+        </w:rPr>
+        <w:t>NOW(</w:t>
+      </w:r>
+      <w:proofErr w:type="gramEnd"/>
+      <w:r>
+        <w:rPr>
+          <w:color w:val="000000" w:themeColor="text1"/>
+          <w:sz w:val="22"/>
+          <w:szCs w:val="22"/>
+        </w:rPr>
+        <w:t xml:space="preserve">), ...). Because the subquery references </w:t>
+      </w:r>
+      <w:proofErr w:type="spellStart"/>
+      <w:proofErr w:type="gramStart"/>
+      <w:r>
+        <w:rPr>
+          <w:color w:val="000000" w:themeColor="text1"/>
+          <w:sz w:val="22"/>
+          <w:szCs w:val="22"/>
+        </w:rPr>
+        <w:t>customer.customer</w:t>
+      </w:r>
+      <w:proofErr w:type="gramEnd"/>
+      <w:r>
+        <w:rPr>
+          <w:color w:val="000000" w:themeColor="text1"/>
+          <w:sz w:val="22"/>
+          <w:szCs w:val="22"/>
+        </w:rPr>
+        <w:t>_id</w:t>
+      </w:r>
+      <w:proofErr w:type="spellEnd"/>
+      <w:r>
+        <w:rPr>
+          <w:color w:val="000000" w:themeColor="text1"/>
+          <w:sz w:val="22"/>
+          <w:szCs w:val="22"/>
+        </w:rPr>
+        <w:t>, it runs once per customer row, making the result dynamic. The CASE then compares this computed number of days to 90: if it is 90 or more, the customer is marked inactive (0), otherwise they remain active (1), and the WHERE active = 1 clause ensures only currently active customers are evaluated and updated.</w:t>
+      </w:r>
+    </w:p>
+    <w:p>
+      <w:pPr>
+        <w:rPr>
+          <w:b/>
+          <w:bCs/>
+          <w:color w:val="4472C4" w:themeColor="accent1"/>
+        </w:rPr>
+      </w:pPr>
+      <w:r>
+        <w:rPr>
+          <w:b/>
+          <w:bCs/>
+          <w:color w:val="4472C4" w:themeColor="accent1"/>
+        </w:rPr>
+        <w:t xml:space="preserve">UPDATE customer SET active =   </w:t>
+      </w:r>
+    </w:p>
+    <w:p>
+      <w:pPr>
+        <w:rPr>
+          <w:b/>
+          <w:bCs/>
+          <w:color w:val="4472C4" w:themeColor="accent1"/>
+        </w:rPr>
+      </w:pPr>
+      <w:r>
+        <w:rPr>
+          <w:b/>
+          <w:bCs/>
+          <w:color w:val="4472C4" w:themeColor="accent1"/>
+        </w:rPr>
+        <w:t xml:space="preserve">CASE     </w:t>
+      </w:r>
+    </w:p>
+    <w:p>
+      <w:pPr>
+        <w:rPr>
+          <w:b/>
+          <w:bCs/>
+          <w:color w:val="4472C4" w:themeColor="accent1"/>
+        </w:rPr>
+      </w:pPr>
+      <w:r>
+        <w:rPr>
+          <w:b/>
+          <w:bCs/>
+          <w:color w:val="4472C4" w:themeColor="accent1"/>
+        </w:rPr>
+        <w:t xml:space="preserve">WHEN 90 &lt;= (SELECT </w:t>
+      </w:r>
+      <w:proofErr w:type="spellStart"/>
+      <w:r>
+        <w:rPr>
+          <w:b/>
+          <w:bCs/>
+          <w:color w:val="4472C4" w:themeColor="accent1"/>
+        </w:rPr>
+        <w:t>datediff</w:t>
+      </w:r>
+      <w:proofErr w:type="spellEnd"/>
+      <w:r>
+        <w:rPr>
+          <w:b/>
+          <w:bCs/>
+          <w:color w:val="4472C4" w:themeColor="accent1"/>
+        </w:rPr>
+        <w:t>(</w:t>
+      </w:r>
+      <w:proofErr w:type="gramStart"/>
+      <w:r>
+        <w:rPr>
+          <w:b/>
+          <w:bCs/>
+          <w:color w:val="4472C4" w:themeColor="accent1"/>
+        </w:rPr>
+        <w:t>now(</w:t>
+      </w:r>
+      <w:proofErr w:type="gramEnd"/>
+      <w:r>
+        <w:rPr>
+          <w:b/>
+          <w:bCs/>
+          <w:color w:val="4472C4" w:themeColor="accent1"/>
+        </w:rPr>
+        <w:t>), max(</w:t>
+      </w:r>
+      <w:proofErr w:type="spellStart"/>
+      <w:r>
+        <w:rPr>
+          <w:b/>
+          <w:bCs/>
+          <w:color w:val="4472C4" w:themeColor="accent1"/>
+        </w:rPr>
+        <w:t>rental_date</w:t>
+      </w:r>
+      <w:proofErr w:type="spellEnd"/>
+      <w:r>
+        <w:rPr>
+          <w:b/>
+          <w:bCs/>
+          <w:color w:val="4472C4" w:themeColor="accent1"/>
+        </w:rPr>
+        <w:t xml:space="preserve">))                 </w:t>
+      </w:r>
+    </w:p>
+    <w:p>
+      <w:pPr>
+        <w:rPr>
+          <w:b/>
+          <w:bCs/>
+          <w:color w:val="4472C4" w:themeColor="accent1"/>
+        </w:rPr>
+      </w:pPr>
+      <w:r>
+        <w:rPr>
+          <w:b/>
+          <w:bCs/>
+          <w:color w:val="4472C4" w:themeColor="accent1"/>
+        </w:rPr>
+        <w:t xml:space="preserve">FROM rental r                 </w:t>
+      </w:r>
+    </w:p>
+    <w:p>
+      <w:pPr>
+        <w:rPr>
+          <w:b/>
+          <w:bCs/>
+          <w:color w:val="4472C4" w:themeColor="accent1"/>
+        </w:rPr>
+      </w:pPr>
+      <w:r>
+        <w:rPr>
+          <w:b/>
+          <w:bCs/>
+          <w:color w:val="4472C4" w:themeColor="accent1"/>
+        </w:rPr>
+        <w:t xml:space="preserve">WHERE </w:t>
+      </w:r>
+      <w:proofErr w:type="spellStart"/>
+      <w:proofErr w:type="gramStart"/>
+      <w:r>
+        <w:rPr>
+          <w:b/>
+          <w:bCs/>
+          <w:color w:val="4472C4" w:themeColor="accent1"/>
+        </w:rPr>
+        <w:t>r.customer</w:t>
+      </w:r>
+      <w:proofErr w:type="gramEnd"/>
+      <w:r>
+        <w:rPr>
+          <w:b/>
+          <w:bCs/>
+          <w:color w:val="4472C4" w:themeColor="accent1"/>
+        </w:rPr>
+        <w:t>_id</w:t>
+      </w:r>
+      <w:proofErr w:type="spellEnd"/>
+      <w:r>
+        <w:rPr>
+          <w:b/>
+          <w:bCs/>
+          <w:color w:val="4472C4" w:themeColor="accent1"/>
+        </w:rPr>
+        <w:t xml:space="preserve"> = </w:t>
+      </w:r>
+      <w:proofErr w:type="spellStart"/>
+      <w:proofErr w:type="gramStart"/>
+      <w:r>
+        <w:rPr>
+          <w:b/>
+          <w:bCs/>
+          <w:color w:val="4472C4" w:themeColor="accent1"/>
+        </w:rPr>
+        <w:t>customer.customer</w:t>
+      </w:r>
+      <w:proofErr w:type="gramEnd"/>
+      <w:r>
+        <w:rPr>
+          <w:b/>
+          <w:bCs/>
+          <w:color w:val="4472C4" w:themeColor="accent1"/>
+        </w:rPr>
+        <w:t>_id</w:t>
+      </w:r>
+      <w:proofErr w:type="spellEnd"/>
+      <w:r>
+        <w:rPr>
+          <w:b/>
+          <w:bCs/>
+          <w:color w:val="4472C4" w:themeColor="accent1"/>
+        </w:rPr>
+        <w:t xml:space="preserve">)       </w:t>
+      </w:r>
+    </w:p>
+    <w:p>
+      <w:pPr>
+        <w:rPr>
+          <w:b/>
+          <w:bCs/>
+          <w:color w:val="4472C4" w:themeColor="accent1"/>
+        </w:rPr>
+      </w:pPr>
+      <w:r>
+        <w:rPr>
+          <w:b/>
+          <w:bCs/>
+          <w:color w:val="4472C4" w:themeColor="accent1"/>
+        </w:rPr>
+        <w:t xml:space="preserve">THEN 0     </w:t>
+      </w:r>
+    </w:p>
+    <w:p>
+      <w:pPr>
+        <w:rPr>
+          <w:b/>
+          <w:bCs/>
+          <w:color w:val="4472C4" w:themeColor="accent1"/>
+        </w:rPr>
+      </w:pPr>
+      <w:r>
+        <w:rPr>
+          <w:b/>
+          <w:bCs/>
+          <w:color w:val="4472C4" w:themeColor="accent1"/>
+        </w:rPr>
+        <w:t xml:space="preserve">ELSE 1   </w:t>
+      </w:r>
+    </w:p>
+    <w:p>
+      <w:pPr>
+        <w:rPr>
+          <w:b/>
+          <w:bCs/>
+          <w:color w:val="4472C4" w:themeColor="accent1"/>
+        </w:rPr>
+      </w:pPr>
+      <w:r>
+        <w:rPr>
+          <w:b/>
+          <w:bCs/>
+          <w:color w:val="4472C4" w:themeColor="accent1"/>
+        </w:rPr>
+        <w:t xml:space="preserve">END </w:t>
+      </w:r>
+    </w:p>
+    <w:p>
+      <w:pPr>
+        <w:rPr>
+          <w:color w:val="000000" w:themeColor="text1"/>
+          <w:sz w:val="22"/>
+          <w:szCs w:val="22"/>
+        </w:rPr>
+      </w:pPr>
+      <w:r>
+        <w:rPr>
+          <w:b/>
+          <w:bCs/>
+          <w:color w:val="4472C4" w:themeColor="accent1"/>
+        </w:rPr>
+        <w:t>WHERE active = 1;</w:t>
+      </w:r>
+    </w:p>
+    <w:p>
+      <w:pPr>
+        <w:rPr>
+          <w:color w:val="000000" w:themeColor="text1"/>
+          <w:sz w:val="22"/>
+          <w:szCs w:val="22"/>
+        </w:rPr>
+      </w:pPr>
+    </w:p>
+    <w:p>
+      <w:pPr>
+        <w:rPr>
+          <w:color w:val="000000" w:themeColor="text1"/>
+          <w:sz w:val="22"/>
+          <w:szCs w:val="22"/>
+        </w:rPr>
+      </w:pPr>
+    </w:p>
+    <w:p>
+      <w:pPr>
+        <w:rPr>
+          <w:color w:val="000000" w:themeColor="text1"/>
+          <w:sz w:val="22"/>
+          <w:szCs w:val="22"/>
+        </w:rPr>
+      </w:pPr>
+    </w:p>
+    <w:p>
+      <w:pPr>
+        <w:rPr>
+          <w:b/>
+          <w:bCs/>
+          <w:color w:val="000000" w:themeColor="text1"/>
+          <w:u w:val="single"/>
+        </w:rPr>
+      </w:pPr>
+      <w:r>
+        <w:rPr>
+          <w:b/>
+          <w:bCs/>
+          <w:color w:val="000000" w:themeColor="text1"/>
+          <w:u w:val="single"/>
         </w:rPr>
         <w:lastRenderedPageBreak/>
-        <w:t>It silently depends on column names.</w:t>
-      </w:r>
-    </w:p>
-    <w:p>
-      <w:pPr>
-        <w:rPr>
-          <w:color w:val="000000" w:themeColor="text1"/>
-          <w:sz w:val="22"/>
-          <w:szCs w:val="22"/>
-        </w:rPr>
-      </w:pPr>
-    </w:p>
-    <w:p>
-      <w:pPr>
-        <w:rPr>
-          <w:color w:val="000000" w:themeColor="text1"/>
-          <w:sz w:val="22"/>
-          <w:szCs w:val="22"/>
-        </w:rPr>
-      </w:pPr>
-    </w:p>
-    <w:p>
-      <w:pPr>
-        <w:rPr>
-          <w:color w:val="000000" w:themeColor="text1"/>
-          <w:sz w:val="22"/>
-          <w:szCs w:val="22"/>
-        </w:rPr>
-      </w:pPr>
-    </w:p>
-    <w:p>
-      <w:pPr>
-        <w:rPr>
-          <w:color w:val="000000" w:themeColor="text1"/>
-          <w:sz w:val="22"/>
-          <w:szCs w:val="22"/>
-        </w:rPr>
-      </w:pPr>
-    </w:p>
-    <w:p>
-      <w:pPr>
-        <w:rPr>
-          <w:color w:val="000000" w:themeColor="text1"/>
-          <w:sz w:val="22"/>
-          <w:szCs w:val="22"/>
-        </w:rPr>
-      </w:pPr>
-    </w:p>
-    <w:p>
-      <w:pPr>
-        <w:rPr>
-          <w:color w:val="000000" w:themeColor="text1"/>
-          <w:sz w:val="22"/>
-          <w:szCs w:val="22"/>
-        </w:rPr>
-      </w:pPr>
-    </w:p>
-    <w:p>
-      <w:pPr>
-        <w:rPr>
-          <w:color w:val="000000" w:themeColor="text1"/>
-          <w:sz w:val="22"/>
-          <w:szCs w:val="22"/>
-        </w:rPr>
-      </w:pPr>
-    </w:p>
-    <w:p>
-      <w:pPr>
-        <w:rPr>
-          <w:color w:val="000000" w:themeColor="text1"/>
-          <w:sz w:val="22"/>
-          <w:szCs w:val="22"/>
-        </w:rPr>
-      </w:pPr>
+        <w:t>Handling Null Values</w:t>
+      </w:r>
+      <w:r>
+        <w:rPr>
+          <w:b/>
+          <w:bCs/>
+          <w:color w:val="000000" w:themeColor="text1"/>
+          <w:u w:val="single"/>
+        </w:rPr>
+        <w:t>:</w:t>
+      </w:r>
+    </w:p>
+    <w:p>
+      <w:pPr>
+        <w:rPr>
+          <w:color w:val="000000" w:themeColor="text1"/>
+          <w:sz w:val="22"/>
+          <w:szCs w:val="22"/>
+        </w:rPr>
+      </w:pPr>
+      <w:r>
+        <w:rPr>
+          <w:color w:val="000000" w:themeColor="text1"/>
+          <w:sz w:val="22"/>
+          <w:szCs w:val="22"/>
+        </w:rPr>
+        <w:t>Handling null values in SQL is necessary because NULL represents unknown or missing data, and it behaves differently from normal values in expressions and output. In display contexts, nulls can be confusing or undesirable, so CASE expressions are often used to replace them with meaningful defaults like 'Unknown', as shown in the joins between customer, address, city, and country, where missing related data is substituted for readability using LEFT JOIN and CASE WHEN column IS NULL THEN .... In calculations, however, NULL is even more critical because it propagates through expressions and typically causes the entire result to become NULL, as demonstrated by arithmetic involving NULL. To prevent this, CASE (or similar logic) can convert NULL into numeric defaults like 0 or 1, ensuring calculations still produce valid results instead of collapsing into NULL, which makes conditional handling essential for both reporting and computation accuracy.</w:t>
+      </w:r>
+    </w:p>
+    <w:p>
+      <w:pPr>
+        <w:rPr>
+          <w:color w:val="000000" w:themeColor="text1"/>
+          <w:sz w:val="22"/>
+          <w:szCs w:val="22"/>
+        </w:rPr>
+      </w:pPr>
+    </w:p>
+    <w:p>
+      <w:pPr>
+        <w:rPr>
+          <w:color w:val="000000" w:themeColor="text1"/>
+          <w:sz w:val="22"/>
+          <w:szCs w:val="22"/>
+        </w:rPr>
+      </w:pPr>
+      <w:r>
+        <w:rPr>
+          <w:b/>
+          <w:bCs/>
+          <w:color w:val="000000" w:themeColor="text1"/>
+          <w:sz w:val="22"/>
+          <w:szCs w:val="22"/>
+        </w:rPr>
+        <w:t xml:space="preserve">Searched case Vs Simple Case: </w:t>
+      </w:r>
+    </w:p>
+    <w:p>
+      <w:pPr>
+        <w:rPr>
+          <w:color w:val="000000" w:themeColor="text1"/>
+          <w:sz w:val="22"/>
+          <w:szCs w:val="22"/>
+        </w:rPr>
+      </w:pPr>
+      <w:r>
+        <w:rPr>
+          <w:color w:val="000000" w:themeColor="text1"/>
+          <w:sz w:val="22"/>
+          <w:szCs w:val="22"/>
+        </w:rPr>
+        <w:t>A simple CASE is used when you are comparing one expression against a fixed set of values, functioning like a switch statement where SQL checks equality only—for example, CASE name WHEN 'English' THEN 'latin1' WHEN 'Japanese' THEN 'utf8' END is best when mapping specific known values to outputs. In contrast, a searched CASE is used when you need flexible conditional logic, where each WHEN contains a full condition such as IN, LIKE, ranges, or combined expressions—for example, CASE WHEN name IN ('</w:t>
+      </w:r>
+      <w:proofErr w:type="spellStart"/>
+      <w:r>
+        <w:rPr>
+          <w:color w:val="000000" w:themeColor="text1"/>
+          <w:sz w:val="22"/>
+          <w:szCs w:val="22"/>
+        </w:rPr>
+        <w:t>English','French</w:t>
+      </w:r>
+      <w:proofErr w:type="spellEnd"/>
+      <w:r>
+        <w:rPr>
+          <w:color w:val="000000" w:themeColor="text1"/>
+          <w:sz w:val="22"/>
+          <w:szCs w:val="22"/>
+        </w:rPr>
+        <w:t>') THEN 'latin1' WHEN name LIKE 'J%' THEN 'utf8' END. The key difference is that simple CASE is cleaner and more readable for direct value matching, while searched CASE is more powerful and widely used because it supports complex conditions and real-world logic; in practice, simple CASE is used for straightforward mappings, whereas searched CASE is used whenever decision-making goes beyond direct equality comparisons.</w:t>
+      </w:r>
     </w:p>
     <w:p>
       <w:pPr>

</xml_diff>

<commit_message>
chapter 15 metadata, not much learned
</commit_message>
<xml_diff>
--- a/Book notes.docx
+++ b/Book notes.docx
@@ -27659,8 +27659,1163 @@
     </w:p>
     <w:p>
       <w:pPr>
-        <w:rPr>
-          <w:color w:val="000000" w:themeColor="text1"/>
+        <w:jc w:val="center"/>
+        <w:rPr>
+          <w:b/>
+          <w:bCs/>
+          <w:color w:val="EE0000"/>
+          <w:sz w:val="32"/>
+          <w:szCs w:val="32"/>
+          <w:u w:val="single"/>
+        </w:rPr>
+      </w:pPr>
+      <w:r>
+        <w:rPr>
+          <w:b/>
+          <w:bCs/>
+          <w:color w:val="EE0000"/>
+          <w:sz w:val="32"/>
+          <w:szCs w:val="32"/>
+          <w:u w:val="single"/>
+        </w:rPr>
+        <w:lastRenderedPageBreak/>
+        <w:t>Chapter 15. Metadata</w:t>
+      </w:r>
+    </w:p>
+    <w:p>
+      <w:pPr>
+        <w:rPr>
+          <w:b/>
+          <w:bCs/>
+          <w:color w:val="000000" w:themeColor="text1"/>
+          <w:u w:val="single"/>
+        </w:rPr>
+      </w:pPr>
+      <w:r>
+        <w:rPr>
+          <w:b/>
+          <w:bCs/>
+          <w:color w:val="000000" w:themeColor="text1"/>
+          <w:u w:val="single"/>
+        </w:rPr>
+        <w:t>What is Metadata:</w:t>
+      </w:r>
+    </w:p>
+    <w:p>
+      <w:pPr>
+        <w:rPr>
+          <w:color w:val="000000" w:themeColor="text1"/>
+          <w:sz w:val="22"/>
+          <w:szCs w:val="22"/>
+        </w:rPr>
+      </w:pPr>
+      <w:r>
+        <w:rPr>
+          <w:color w:val="000000" w:themeColor="text1"/>
+          <w:sz w:val="22"/>
+          <w:szCs w:val="22"/>
+        </w:rPr>
+        <w:t>Metadata is essentially data about data.</w:t>
+      </w:r>
+      <w:r>
+        <w:rPr>
+          <w:color w:val="000000" w:themeColor="text1"/>
+          <w:sz w:val="22"/>
+          <w:szCs w:val="22"/>
+        </w:rPr>
+        <w:t xml:space="preserve"> </w:t>
+      </w:r>
+      <w:r>
+        <w:rPr>
+          <w:color w:val="000000" w:themeColor="text1"/>
+          <w:sz w:val="22"/>
+          <w:szCs w:val="22"/>
+        </w:rPr>
+        <w:t xml:space="preserve">Metadata we are familiar with so far: </w:t>
+      </w:r>
+    </w:p>
+    <w:p>
+      <w:pPr>
+        <w:rPr>
+          <w:b/>
+          <w:bCs/>
+          <w:color w:val="000000" w:themeColor="text1"/>
+          <w:sz w:val="22"/>
+          <w:szCs w:val="22"/>
+        </w:rPr>
+      </w:pPr>
+      <w:r>
+        <w:rPr>
+          <w:b/>
+          <w:bCs/>
+          <w:color w:val="000000" w:themeColor="text1"/>
+          <w:sz w:val="22"/>
+          <w:szCs w:val="22"/>
+        </w:rPr>
+        <w:t>Table name</w:t>
+      </w:r>
+      <w:r>
+        <w:rPr>
+          <w:b/>
+          <w:bCs/>
+          <w:color w:val="000000" w:themeColor="text1"/>
+          <w:sz w:val="22"/>
+          <w:szCs w:val="22"/>
+        </w:rPr>
+        <w:t>,</w:t>
+      </w:r>
+      <w:r>
+        <w:rPr>
+          <w:b/>
+          <w:bCs/>
+          <w:color w:val="000000" w:themeColor="text1"/>
+          <w:sz w:val="22"/>
+          <w:szCs w:val="22"/>
+        </w:rPr>
+        <w:t xml:space="preserve"> Table storage information (tablespace, initial size, etc.)</w:t>
+      </w:r>
+      <w:r>
+        <w:rPr>
+          <w:b/>
+          <w:bCs/>
+          <w:color w:val="000000" w:themeColor="text1"/>
+          <w:sz w:val="22"/>
+          <w:szCs w:val="22"/>
+        </w:rPr>
+        <w:t>,</w:t>
+      </w:r>
+      <w:r>
+        <w:rPr>
+          <w:b/>
+          <w:bCs/>
+          <w:color w:val="000000" w:themeColor="text1"/>
+          <w:sz w:val="22"/>
+          <w:szCs w:val="22"/>
+        </w:rPr>
+        <w:t xml:space="preserve"> Storage engine</w:t>
+      </w:r>
+      <w:r>
+        <w:rPr>
+          <w:b/>
+          <w:bCs/>
+          <w:color w:val="000000" w:themeColor="text1"/>
+          <w:sz w:val="22"/>
+          <w:szCs w:val="22"/>
+        </w:rPr>
+        <w:t>,</w:t>
+      </w:r>
+      <w:r>
+        <w:rPr>
+          <w:b/>
+          <w:bCs/>
+          <w:color w:val="000000" w:themeColor="text1"/>
+          <w:sz w:val="22"/>
+          <w:szCs w:val="22"/>
+        </w:rPr>
+        <w:t xml:space="preserve"> Column names</w:t>
+      </w:r>
+      <w:r>
+        <w:rPr>
+          <w:b/>
+          <w:bCs/>
+          <w:color w:val="000000" w:themeColor="text1"/>
+          <w:sz w:val="22"/>
+          <w:szCs w:val="22"/>
+        </w:rPr>
+        <w:t xml:space="preserve">, </w:t>
+      </w:r>
+      <w:r>
+        <w:rPr>
+          <w:b/>
+          <w:bCs/>
+          <w:color w:val="000000" w:themeColor="text1"/>
+          <w:sz w:val="22"/>
+          <w:szCs w:val="22"/>
+        </w:rPr>
+        <w:t>Column data types</w:t>
+      </w:r>
+      <w:r>
+        <w:rPr>
+          <w:b/>
+          <w:bCs/>
+          <w:color w:val="000000" w:themeColor="text1"/>
+          <w:sz w:val="22"/>
+          <w:szCs w:val="22"/>
+        </w:rPr>
+        <w:t>,</w:t>
+      </w:r>
+      <w:r>
+        <w:rPr>
+          <w:b/>
+          <w:bCs/>
+          <w:color w:val="000000" w:themeColor="text1"/>
+          <w:sz w:val="22"/>
+          <w:szCs w:val="22"/>
+        </w:rPr>
+        <w:t xml:space="preserve"> Default column</w:t>
+      </w:r>
+      <w:r>
+        <w:rPr>
+          <w:b/>
+          <w:bCs/>
+          <w:color w:val="000000" w:themeColor="text1"/>
+          <w:sz w:val="22"/>
+          <w:szCs w:val="22"/>
+        </w:rPr>
+        <w:t>,</w:t>
+      </w:r>
+      <w:r>
+        <w:rPr>
+          <w:b/>
+          <w:bCs/>
+          <w:color w:val="000000" w:themeColor="text1"/>
+          <w:sz w:val="22"/>
+          <w:szCs w:val="22"/>
+        </w:rPr>
+        <w:t xml:space="preserve"> values not null</w:t>
+      </w:r>
+      <w:r>
+        <w:rPr>
+          <w:b/>
+          <w:bCs/>
+          <w:color w:val="000000" w:themeColor="text1"/>
+          <w:sz w:val="22"/>
+          <w:szCs w:val="22"/>
+        </w:rPr>
+        <w:t>,</w:t>
+      </w:r>
+      <w:r>
+        <w:rPr>
+          <w:b/>
+          <w:bCs/>
+          <w:color w:val="000000" w:themeColor="text1"/>
+          <w:sz w:val="22"/>
+          <w:szCs w:val="22"/>
+        </w:rPr>
+        <w:t xml:space="preserve"> column constraints</w:t>
+      </w:r>
+      <w:r>
+        <w:rPr>
+          <w:b/>
+          <w:bCs/>
+          <w:color w:val="000000" w:themeColor="text1"/>
+          <w:sz w:val="22"/>
+          <w:szCs w:val="22"/>
+        </w:rPr>
+        <w:t>,</w:t>
+      </w:r>
+      <w:r>
+        <w:rPr>
+          <w:b/>
+          <w:bCs/>
+          <w:color w:val="000000" w:themeColor="text1"/>
+          <w:sz w:val="22"/>
+          <w:szCs w:val="22"/>
+        </w:rPr>
+        <w:t xml:space="preserve"> Primary key columns</w:t>
+      </w:r>
+      <w:r>
+        <w:rPr>
+          <w:b/>
+          <w:bCs/>
+          <w:color w:val="000000" w:themeColor="text1"/>
+          <w:sz w:val="22"/>
+          <w:szCs w:val="22"/>
+        </w:rPr>
+        <w:t>,</w:t>
+      </w:r>
+      <w:r>
+        <w:rPr>
+          <w:b/>
+          <w:bCs/>
+          <w:color w:val="000000" w:themeColor="text1"/>
+          <w:sz w:val="22"/>
+          <w:szCs w:val="22"/>
+        </w:rPr>
+        <w:t xml:space="preserve"> Primary key name</w:t>
+      </w:r>
+      <w:r>
+        <w:rPr>
+          <w:b/>
+          <w:bCs/>
+          <w:color w:val="000000" w:themeColor="text1"/>
+          <w:sz w:val="22"/>
+          <w:szCs w:val="22"/>
+        </w:rPr>
+        <w:t>,</w:t>
+      </w:r>
+      <w:r>
+        <w:rPr>
+          <w:b/>
+          <w:bCs/>
+          <w:color w:val="000000" w:themeColor="text1"/>
+          <w:sz w:val="22"/>
+          <w:szCs w:val="22"/>
+        </w:rPr>
+        <w:t xml:space="preserve"> Name of primary key</w:t>
+      </w:r>
+      <w:r>
+        <w:rPr>
+          <w:b/>
+          <w:bCs/>
+          <w:color w:val="000000" w:themeColor="text1"/>
+          <w:sz w:val="22"/>
+          <w:szCs w:val="22"/>
+        </w:rPr>
+        <w:t>,</w:t>
+      </w:r>
+      <w:r>
+        <w:rPr>
+          <w:b/>
+          <w:bCs/>
+          <w:color w:val="000000" w:themeColor="text1"/>
+          <w:sz w:val="22"/>
+          <w:szCs w:val="22"/>
+        </w:rPr>
+        <w:t xml:space="preserve"> index</w:t>
+      </w:r>
+      <w:r>
+        <w:rPr>
+          <w:b/>
+          <w:bCs/>
+          <w:color w:val="000000" w:themeColor="text1"/>
+          <w:sz w:val="22"/>
+          <w:szCs w:val="22"/>
+        </w:rPr>
+        <w:t>,</w:t>
+      </w:r>
+      <w:r>
+        <w:rPr>
+          <w:b/>
+          <w:bCs/>
+          <w:color w:val="000000" w:themeColor="text1"/>
+          <w:sz w:val="22"/>
+          <w:szCs w:val="22"/>
+        </w:rPr>
+        <w:t xml:space="preserve"> Index </w:t>
+      </w:r>
+      <w:proofErr w:type="spellStart"/>
+      <w:r>
+        <w:rPr>
+          <w:b/>
+          <w:bCs/>
+          <w:color w:val="000000" w:themeColor="text1"/>
+          <w:sz w:val="22"/>
+          <w:szCs w:val="22"/>
+        </w:rPr>
+        <w:t>name</w:t>
+      </w:r>
+      <w:r>
+        <w:rPr>
+          <w:b/>
+          <w:bCs/>
+          <w:color w:val="000000" w:themeColor="text1"/>
+          <w:sz w:val="22"/>
+          <w:szCs w:val="22"/>
+        </w:rPr>
+        <w:t>,</w:t>
+      </w:r>
+      <w:r>
+        <w:rPr>
+          <w:b/>
+          <w:bCs/>
+          <w:color w:val="000000" w:themeColor="text1"/>
+          <w:sz w:val="22"/>
+          <w:szCs w:val="22"/>
+        </w:rPr>
+        <w:t>s</w:t>
+      </w:r>
+      <w:proofErr w:type="spellEnd"/>
+      <w:r>
+        <w:rPr>
+          <w:b/>
+          <w:bCs/>
+          <w:color w:val="000000" w:themeColor="text1"/>
+          <w:sz w:val="22"/>
+          <w:szCs w:val="22"/>
+        </w:rPr>
+        <w:t xml:space="preserve"> Index types (B-tree, bitmap)</w:t>
+      </w:r>
+      <w:r>
+        <w:rPr>
+          <w:b/>
+          <w:bCs/>
+          <w:color w:val="000000" w:themeColor="text1"/>
+          <w:sz w:val="22"/>
+          <w:szCs w:val="22"/>
+        </w:rPr>
+        <w:t>,</w:t>
+      </w:r>
+      <w:r>
+        <w:rPr>
+          <w:b/>
+          <w:bCs/>
+          <w:color w:val="000000" w:themeColor="text1"/>
+          <w:sz w:val="22"/>
+          <w:szCs w:val="22"/>
+        </w:rPr>
+        <w:t xml:space="preserve"> Indexed columns</w:t>
+      </w:r>
+      <w:r>
+        <w:rPr>
+          <w:b/>
+          <w:bCs/>
+          <w:color w:val="000000" w:themeColor="text1"/>
+          <w:sz w:val="22"/>
+          <w:szCs w:val="22"/>
+        </w:rPr>
+        <w:t>,</w:t>
+      </w:r>
+      <w:r>
+        <w:rPr>
+          <w:b/>
+          <w:bCs/>
+          <w:color w:val="000000" w:themeColor="text1"/>
+          <w:sz w:val="22"/>
+          <w:szCs w:val="22"/>
+        </w:rPr>
+        <w:t xml:space="preserve"> Index column sort order (ascending or descending)</w:t>
+      </w:r>
+      <w:r>
+        <w:rPr>
+          <w:b/>
+          <w:bCs/>
+          <w:color w:val="000000" w:themeColor="text1"/>
+          <w:sz w:val="22"/>
+          <w:szCs w:val="22"/>
+        </w:rPr>
+        <w:t>,</w:t>
+      </w:r>
+      <w:r>
+        <w:rPr>
+          <w:b/>
+          <w:bCs/>
+          <w:color w:val="000000" w:themeColor="text1"/>
+          <w:sz w:val="22"/>
+          <w:szCs w:val="22"/>
+        </w:rPr>
+        <w:t xml:space="preserve"> Index storage information</w:t>
+      </w:r>
+      <w:r>
+        <w:rPr>
+          <w:b/>
+          <w:bCs/>
+          <w:color w:val="000000" w:themeColor="text1"/>
+          <w:sz w:val="22"/>
+          <w:szCs w:val="22"/>
+        </w:rPr>
+        <w:t>,</w:t>
+      </w:r>
+      <w:r>
+        <w:rPr>
+          <w:b/>
+          <w:bCs/>
+          <w:color w:val="000000" w:themeColor="text1"/>
+          <w:sz w:val="22"/>
+          <w:szCs w:val="22"/>
+        </w:rPr>
+        <w:t xml:space="preserve"> Foreign key name</w:t>
+      </w:r>
+      <w:r>
+        <w:rPr>
+          <w:b/>
+          <w:bCs/>
+          <w:color w:val="000000" w:themeColor="text1"/>
+          <w:sz w:val="22"/>
+          <w:szCs w:val="22"/>
+        </w:rPr>
+        <w:t>,</w:t>
+      </w:r>
+      <w:r>
+        <w:rPr>
+          <w:b/>
+          <w:bCs/>
+          <w:color w:val="000000" w:themeColor="text1"/>
+          <w:sz w:val="22"/>
+          <w:szCs w:val="22"/>
+        </w:rPr>
+        <w:t xml:space="preserve"> Foreign key columns</w:t>
+      </w:r>
+      <w:r>
+        <w:rPr>
+          <w:b/>
+          <w:bCs/>
+          <w:color w:val="000000" w:themeColor="text1"/>
+          <w:sz w:val="22"/>
+          <w:szCs w:val="22"/>
+        </w:rPr>
+        <w:t>,</w:t>
+      </w:r>
+      <w:r>
+        <w:rPr>
+          <w:b/>
+          <w:bCs/>
+          <w:color w:val="000000" w:themeColor="text1"/>
+          <w:sz w:val="22"/>
+          <w:szCs w:val="22"/>
+        </w:rPr>
+        <w:t xml:space="preserve"> Associated table/columns for foreign keys</w:t>
+      </w:r>
+    </w:p>
+    <w:p>
+      <w:pPr>
+        <w:rPr>
+          <w:color w:val="000000" w:themeColor="text1"/>
+          <w:sz w:val="22"/>
+          <w:szCs w:val="22"/>
+        </w:rPr>
+      </w:pPr>
+      <w:r>
+        <w:rPr>
+          <w:color w:val="000000" w:themeColor="text1"/>
+          <w:sz w:val="22"/>
+          <w:szCs w:val="22"/>
+        </w:rPr>
+        <w:t>every database server uses a different mechanism to publish metadata</w:t>
+      </w:r>
+      <w:r>
+        <w:rPr>
+          <w:color w:val="000000" w:themeColor="text1"/>
+          <w:sz w:val="22"/>
+          <w:szCs w:val="22"/>
+        </w:rPr>
+        <w:t xml:space="preserve">. </w:t>
+      </w:r>
+    </w:p>
+    <w:p>
+      <w:pPr>
+        <w:rPr>
+          <w:color w:val="000000" w:themeColor="text1"/>
+          <w:sz w:val="22"/>
+          <w:szCs w:val="22"/>
+        </w:rPr>
+      </w:pPr>
+    </w:p>
+    <w:p>
+      <w:pPr>
+        <w:rPr>
+          <w:b/>
+          <w:bCs/>
+          <w:color w:val="000000" w:themeColor="text1"/>
+          <w:u w:val="single"/>
+        </w:rPr>
+      </w:pPr>
+      <w:proofErr w:type="spellStart"/>
+      <w:r>
+        <w:rPr>
+          <w:b/>
+          <w:bCs/>
+          <w:color w:val="000000" w:themeColor="text1"/>
+          <w:u w:val="single"/>
+        </w:rPr>
+        <w:t>information_schema</w:t>
+      </w:r>
+      <w:proofErr w:type="spellEnd"/>
+      <w:r>
+        <w:rPr>
+          <w:b/>
+          <w:bCs/>
+          <w:color w:val="000000" w:themeColor="text1"/>
+          <w:u w:val="single"/>
+        </w:rPr>
+        <w:t>:</w:t>
+      </w:r>
+    </w:p>
+    <w:p>
+      <w:pPr>
+        <w:rPr>
+          <w:color w:val="000000" w:themeColor="text1"/>
+          <w:sz w:val="22"/>
+          <w:szCs w:val="22"/>
+        </w:rPr>
+      </w:pPr>
+      <w:r>
+        <w:rPr>
+          <w:color w:val="000000" w:themeColor="text1"/>
+          <w:sz w:val="22"/>
+          <w:szCs w:val="22"/>
+        </w:rPr>
+        <w:t xml:space="preserve">All of the objects available within the </w:t>
+      </w:r>
+      <w:proofErr w:type="spellStart"/>
+      <w:r>
+        <w:rPr>
+          <w:color w:val="000000" w:themeColor="text1"/>
+          <w:sz w:val="22"/>
+          <w:szCs w:val="22"/>
+        </w:rPr>
+        <w:t>information_schema</w:t>
+      </w:r>
+      <w:proofErr w:type="spellEnd"/>
+      <w:r>
+        <w:rPr>
+          <w:color w:val="000000" w:themeColor="text1"/>
+          <w:sz w:val="22"/>
+          <w:szCs w:val="22"/>
+        </w:rPr>
+        <w:t xml:space="preserve"> database (or schema, in the case of SQL Server) are views. Unlike the describe utility</w:t>
+      </w:r>
+      <w:r>
+        <w:rPr>
+          <w:color w:val="000000" w:themeColor="text1"/>
+          <w:sz w:val="22"/>
+          <w:szCs w:val="22"/>
+        </w:rPr>
+        <w:t>.</w:t>
+      </w:r>
+    </w:p>
+    <w:p>
+      <w:pPr>
+        <w:rPr>
+          <w:b/>
+          <w:bCs/>
+          <w:color w:val="000000" w:themeColor="text1"/>
+          <w:u w:val="single"/>
+        </w:rPr>
+      </w:pPr>
+    </w:p>
+    <w:p>
+      <w:pPr>
+        <w:rPr>
+          <w:b/>
+          <w:bCs/>
+          <w:color w:val="4472C4" w:themeColor="accent1"/>
+        </w:rPr>
+      </w:pPr>
+      <w:r>
+        <w:rPr>
+          <w:b/>
+          <w:bCs/>
+          <w:color w:val="4472C4" w:themeColor="accent1"/>
+        </w:rPr>
+        <w:t xml:space="preserve">SELECT </w:t>
+      </w:r>
+      <w:proofErr w:type="spellStart"/>
+      <w:r>
+        <w:rPr>
+          <w:b/>
+          <w:bCs/>
+          <w:color w:val="4472C4" w:themeColor="accent1"/>
+        </w:rPr>
+        <w:t>table_name</w:t>
+      </w:r>
+      <w:proofErr w:type="spellEnd"/>
+      <w:r>
+        <w:rPr>
+          <w:b/>
+          <w:bCs/>
+          <w:color w:val="4472C4" w:themeColor="accent1"/>
+        </w:rPr>
+        <w:t xml:space="preserve">, </w:t>
+      </w:r>
+      <w:proofErr w:type="spellStart"/>
+      <w:r>
+        <w:rPr>
+          <w:b/>
+          <w:bCs/>
+          <w:color w:val="4472C4" w:themeColor="accent1"/>
+        </w:rPr>
+        <w:t>table_type</w:t>
+      </w:r>
+      <w:proofErr w:type="spellEnd"/>
+      <w:r>
+        <w:rPr>
+          <w:b/>
+          <w:bCs/>
+          <w:color w:val="4472C4" w:themeColor="accent1"/>
+        </w:rPr>
+        <w:t xml:space="preserve">      </w:t>
+      </w:r>
+    </w:p>
+    <w:p>
+      <w:pPr>
+        <w:rPr>
+          <w:b/>
+          <w:bCs/>
+          <w:color w:val="4472C4" w:themeColor="accent1"/>
+        </w:rPr>
+      </w:pPr>
+      <w:r>
+        <w:rPr>
+          <w:b/>
+          <w:bCs/>
+          <w:color w:val="4472C4" w:themeColor="accent1"/>
+        </w:rPr>
+        <w:t xml:space="preserve">FROM </w:t>
+      </w:r>
+      <w:proofErr w:type="spellStart"/>
+      <w:r>
+        <w:rPr>
+          <w:b/>
+          <w:bCs/>
+          <w:color w:val="4472C4" w:themeColor="accent1"/>
+        </w:rPr>
+        <w:t>information_</w:t>
+      </w:r>
+      <w:proofErr w:type="gramStart"/>
+      <w:r>
+        <w:rPr>
+          <w:b/>
+          <w:bCs/>
+          <w:color w:val="4472C4" w:themeColor="accent1"/>
+        </w:rPr>
+        <w:t>schema.tables</w:t>
+      </w:r>
+      <w:proofErr w:type="spellEnd"/>
+      <w:proofErr w:type="gramEnd"/>
+      <w:r>
+        <w:rPr>
+          <w:b/>
+          <w:bCs/>
+          <w:color w:val="4472C4" w:themeColor="accent1"/>
+        </w:rPr>
+        <w:t xml:space="preserve">     -</w:t>
+      </w:r>
+    </w:p>
+    <w:p>
+      <w:pPr>
+        <w:rPr>
+          <w:b/>
+          <w:bCs/>
+          <w:color w:val="4472C4" w:themeColor="accent1"/>
+        </w:rPr>
+      </w:pPr>
+      <w:r>
+        <w:rPr>
+          <w:b/>
+          <w:bCs/>
+          <w:color w:val="4472C4" w:themeColor="accent1"/>
+        </w:rPr>
+        <w:t xml:space="preserve">WHERE </w:t>
+      </w:r>
+      <w:proofErr w:type="spellStart"/>
+      <w:r>
+        <w:rPr>
+          <w:b/>
+          <w:bCs/>
+          <w:color w:val="4472C4" w:themeColor="accent1"/>
+        </w:rPr>
+        <w:t>table_schema</w:t>
+      </w:r>
+      <w:proofErr w:type="spellEnd"/>
+      <w:r>
+        <w:rPr>
+          <w:b/>
+          <w:bCs/>
+          <w:color w:val="4472C4" w:themeColor="accent1"/>
+        </w:rPr>
+        <w:t xml:space="preserve"> = '</w:t>
+      </w:r>
+      <w:proofErr w:type="spellStart"/>
+      <w:r>
+        <w:rPr>
+          <w:b/>
+          <w:bCs/>
+          <w:color w:val="4472C4" w:themeColor="accent1"/>
+        </w:rPr>
+        <w:t>sakila</w:t>
+      </w:r>
+      <w:proofErr w:type="spellEnd"/>
+      <w:r>
+        <w:rPr>
+          <w:b/>
+          <w:bCs/>
+          <w:color w:val="4472C4" w:themeColor="accent1"/>
+        </w:rPr>
+        <w:t>'    </w:t>
+      </w:r>
+    </w:p>
+    <w:p>
+      <w:pPr>
+        <w:rPr>
+          <w:color w:val="4472C4" w:themeColor="accent1"/>
+          <w:sz w:val="22"/>
+          <w:szCs w:val="22"/>
+        </w:rPr>
+      </w:pPr>
+      <w:r>
+        <w:rPr>
+          <w:b/>
+          <w:bCs/>
+          <w:color w:val="4472C4" w:themeColor="accent1"/>
+        </w:rPr>
+        <w:t>ORDER BY 1;</w:t>
+      </w:r>
+      <w:r>
+        <w:rPr>
+          <w:b/>
+          <w:bCs/>
+          <w:color w:val="4472C4" w:themeColor="accent1"/>
+        </w:rPr>
+        <w:t xml:space="preserve"> </w:t>
+      </w:r>
+    </w:p>
+    <w:p>
+      <w:pPr>
+        <w:rPr>
+          <w:b/>
+          <w:bCs/>
+          <w:color w:val="4472C4" w:themeColor="accent1"/>
+        </w:rPr>
+      </w:pPr>
+    </w:p>
+    <w:p>
+      <w:pPr>
+        <w:rPr>
+          <w:b/>
+          <w:bCs/>
+          <w:color w:val="4472C4" w:themeColor="accent1"/>
+        </w:rPr>
+      </w:pPr>
+      <w:r>
+        <w:rPr>
+          <w:b/>
+          <w:bCs/>
+          <w:color w:val="4472C4" w:themeColor="accent1"/>
+        </w:rPr>
+        <w:t xml:space="preserve">SELECT </w:t>
+      </w:r>
+      <w:proofErr w:type="spellStart"/>
+      <w:r>
+        <w:rPr>
+          <w:b/>
+          <w:bCs/>
+          <w:color w:val="4472C4" w:themeColor="accent1"/>
+        </w:rPr>
+        <w:t>table_name</w:t>
+      </w:r>
+      <w:proofErr w:type="spellEnd"/>
+      <w:r>
+        <w:rPr>
+          <w:b/>
+          <w:bCs/>
+          <w:color w:val="4472C4" w:themeColor="accent1"/>
+        </w:rPr>
+        <w:t xml:space="preserve">, </w:t>
+      </w:r>
+      <w:proofErr w:type="spellStart"/>
+      <w:r>
+        <w:rPr>
+          <w:b/>
+          <w:bCs/>
+          <w:color w:val="4472C4" w:themeColor="accent1"/>
+        </w:rPr>
+        <w:t>is_updatable</w:t>
+      </w:r>
+      <w:proofErr w:type="spellEnd"/>
+      <w:r>
+        <w:rPr>
+          <w:b/>
+          <w:bCs/>
+          <w:color w:val="4472C4" w:themeColor="accent1"/>
+        </w:rPr>
+        <w:t xml:space="preserve">     </w:t>
+      </w:r>
+    </w:p>
+    <w:p>
+      <w:pPr>
+        <w:rPr>
+          <w:b/>
+          <w:bCs/>
+          <w:color w:val="4472C4" w:themeColor="accent1"/>
+        </w:rPr>
+      </w:pPr>
+      <w:r>
+        <w:rPr>
+          <w:b/>
+          <w:bCs/>
+          <w:color w:val="4472C4" w:themeColor="accent1"/>
+        </w:rPr>
+        <w:t xml:space="preserve">FROM </w:t>
+      </w:r>
+      <w:proofErr w:type="spellStart"/>
+      <w:r>
+        <w:rPr>
+          <w:b/>
+          <w:bCs/>
+          <w:color w:val="4472C4" w:themeColor="accent1"/>
+        </w:rPr>
+        <w:t>information_</w:t>
+      </w:r>
+      <w:proofErr w:type="gramStart"/>
+      <w:r>
+        <w:rPr>
+          <w:b/>
+          <w:bCs/>
+          <w:color w:val="4472C4" w:themeColor="accent1"/>
+        </w:rPr>
+        <w:t>schema.views</w:t>
+      </w:r>
+      <w:proofErr w:type="spellEnd"/>
+      <w:proofErr w:type="gramEnd"/>
+      <w:r>
+        <w:rPr>
+          <w:b/>
+          <w:bCs/>
+          <w:color w:val="4472C4" w:themeColor="accent1"/>
+        </w:rPr>
+        <w:t xml:space="preserve">     </w:t>
+      </w:r>
+    </w:p>
+    <w:p>
+      <w:pPr>
+        <w:rPr>
+          <w:b/>
+          <w:bCs/>
+          <w:color w:val="4472C4" w:themeColor="accent1"/>
+        </w:rPr>
+      </w:pPr>
+      <w:r>
+        <w:rPr>
+          <w:b/>
+          <w:bCs/>
+          <w:color w:val="4472C4" w:themeColor="accent1"/>
+        </w:rPr>
+        <w:t xml:space="preserve">WHERE </w:t>
+      </w:r>
+      <w:proofErr w:type="spellStart"/>
+      <w:r>
+        <w:rPr>
+          <w:b/>
+          <w:bCs/>
+          <w:color w:val="4472C4" w:themeColor="accent1"/>
+        </w:rPr>
+        <w:t>table_schema</w:t>
+      </w:r>
+      <w:proofErr w:type="spellEnd"/>
+      <w:r>
+        <w:rPr>
+          <w:b/>
+          <w:bCs/>
+          <w:color w:val="4472C4" w:themeColor="accent1"/>
+        </w:rPr>
+        <w:t xml:space="preserve"> = '</w:t>
+      </w:r>
+      <w:proofErr w:type="spellStart"/>
+      <w:r>
+        <w:rPr>
+          <w:b/>
+          <w:bCs/>
+          <w:color w:val="4472C4" w:themeColor="accent1"/>
+        </w:rPr>
+        <w:t>sakila</w:t>
+      </w:r>
+      <w:proofErr w:type="spellEnd"/>
+      <w:r>
+        <w:rPr>
+          <w:b/>
+          <w:bCs/>
+          <w:color w:val="4472C4" w:themeColor="accent1"/>
+        </w:rPr>
+        <w:t>'    </w:t>
+      </w:r>
+    </w:p>
+    <w:p>
+      <w:pPr>
+        <w:rPr>
+          <w:b/>
+          <w:bCs/>
+          <w:color w:val="4472C4" w:themeColor="accent1"/>
+        </w:rPr>
+      </w:pPr>
+      <w:r>
+        <w:rPr>
+          <w:b/>
+          <w:bCs/>
+          <w:color w:val="4472C4" w:themeColor="accent1"/>
+        </w:rPr>
+        <w:t>ORDER BY 1;</w:t>
+      </w:r>
+      <w:r>
+        <w:rPr>
+          <w:b/>
+          <w:bCs/>
+          <w:color w:val="4472C4" w:themeColor="accent1"/>
+        </w:rPr>
+        <w:br/>
+      </w:r>
+    </w:p>
+    <w:p>
+      <w:pPr>
+        <w:rPr>
+          <w:color w:val="000000" w:themeColor="text1"/>
+          <w:sz w:val="22"/>
+          <w:szCs w:val="22"/>
+        </w:rPr>
+      </w:pPr>
+      <w:r>
+        <w:rPr>
+          <w:color w:val="000000" w:themeColor="text1"/>
+          <w:sz w:val="22"/>
+          <w:szCs w:val="22"/>
+        </w:rPr>
+        <w:t xml:space="preserve">Write a query that lists all of the indexes in the Sakila schema. Include the table names. </w:t>
+      </w:r>
+    </w:p>
+    <w:p>
+      <w:pPr>
+        <w:rPr>
+          <w:b/>
+          <w:bCs/>
+          <w:color w:val="4472C4" w:themeColor="accent1"/>
+        </w:rPr>
+      </w:pPr>
+      <w:r>
+        <w:rPr>
+          <w:b/>
+          <w:bCs/>
+          <w:color w:val="4472C4" w:themeColor="accent1"/>
+        </w:rPr>
+        <w:t xml:space="preserve">SELECT DISTINCT </w:t>
+      </w:r>
+      <w:proofErr w:type="spellStart"/>
+      <w:r>
+        <w:rPr>
+          <w:b/>
+          <w:bCs/>
+          <w:color w:val="4472C4" w:themeColor="accent1"/>
+        </w:rPr>
+        <w:t>table_name</w:t>
+      </w:r>
+      <w:proofErr w:type="spellEnd"/>
+      <w:r>
+        <w:rPr>
+          <w:b/>
+          <w:bCs/>
+          <w:color w:val="4472C4" w:themeColor="accent1"/>
+        </w:rPr>
+        <w:t xml:space="preserve">, </w:t>
+      </w:r>
+      <w:proofErr w:type="spellStart"/>
+      <w:r>
+        <w:rPr>
+          <w:b/>
+          <w:bCs/>
+          <w:color w:val="4472C4" w:themeColor="accent1"/>
+        </w:rPr>
+        <w:t>index_name</w:t>
+      </w:r>
+      <w:proofErr w:type="spellEnd"/>
+      <w:r>
+        <w:rPr>
+          <w:b/>
+          <w:bCs/>
+          <w:color w:val="4472C4" w:themeColor="accent1"/>
+        </w:rPr>
+        <w:t xml:space="preserve">    </w:t>
+      </w:r>
+    </w:p>
+    <w:p>
+      <w:pPr>
+        <w:rPr>
+          <w:b/>
+          <w:bCs/>
+          <w:color w:val="4472C4" w:themeColor="accent1"/>
+        </w:rPr>
+      </w:pPr>
+      <w:r>
+        <w:rPr>
+          <w:b/>
+          <w:bCs/>
+          <w:color w:val="4472C4" w:themeColor="accent1"/>
+        </w:rPr>
+        <w:t xml:space="preserve">FROM </w:t>
+      </w:r>
+      <w:proofErr w:type="spellStart"/>
+      <w:r>
+        <w:rPr>
+          <w:b/>
+          <w:bCs/>
+          <w:color w:val="4472C4" w:themeColor="accent1"/>
+        </w:rPr>
+        <w:t>information_</w:t>
+      </w:r>
+      <w:proofErr w:type="gramStart"/>
+      <w:r>
+        <w:rPr>
+          <w:b/>
+          <w:bCs/>
+          <w:color w:val="4472C4" w:themeColor="accent1"/>
+        </w:rPr>
+        <w:t>schema.statistics</w:t>
+      </w:r>
+      <w:proofErr w:type="spellEnd"/>
+      <w:proofErr w:type="gramEnd"/>
+      <w:r>
+        <w:rPr>
+          <w:b/>
+          <w:bCs/>
+          <w:color w:val="4472C4" w:themeColor="accent1"/>
+        </w:rPr>
+        <w:t xml:space="preserve">   </w:t>
+      </w:r>
+    </w:p>
+    <w:p>
+      <w:pPr>
+        <w:rPr>
+          <w:b/>
+          <w:bCs/>
+          <w:color w:val="4472C4" w:themeColor="accent1"/>
+        </w:rPr>
+      </w:pPr>
+      <w:r>
+        <w:rPr>
+          <w:b/>
+          <w:bCs/>
+          <w:color w:val="4472C4" w:themeColor="accent1"/>
+        </w:rPr>
+        <w:t xml:space="preserve">WHERE </w:t>
+      </w:r>
+      <w:proofErr w:type="spellStart"/>
+      <w:r>
+        <w:rPr>
+          <w:b/>
+          <w:bCs/>
+          <w:color w:val="4472C4" w:themeColor="accent1"/>
+        </w:rPr>
+        <w:t>table_schema</w:t>
+      </w:r>
+      <w:proofErr w:type="spellEnd"/>
+      <w:r>
+        <w:rPr>
+          <w:b/>
+          <w:bCs/>
+          <w:color w:val="4472C4" w:themeColor="accent1"/>
+        </w:rPr>
+        <w:t xml:space="preserve"> = '</w:t>
+      </w:r>
+      <w:proofErr w:type="spellStart"/>
+      <w:r>
+        <w:rPr>
+          <w:b/>
+          <w:bCs/>
+          <w:color w:val="4472C4" w:themeColor="accent1"/>
+        </w:rPr>
+        <w:t>sakila</w:t>
+      </w:r>
+      <w:proofErr w:type="spellEnd"/>
+      <w:r>
+        <w:rPr>
+          <w:b/>
+          <w:bCs/>
+          <w:color w:val="4472C4" w:themeColor="accent1"/>
+        </w:rPr>
+        <w:t>';</w:t>
+      </w:r>
+    </w:p>
+    <w:p>
+      <w:pPr>
+        <w:rPr>
+          <w:b/>
+          <w:bCs/>
+          <w:color w:val="4472C4" w:themeColor="accent1"/>
+        </w:rPr>
+      </w:pPr>
+    </w:p>
+    <w:p>
+      <w:pPr>
+        <w:rPr>
+          <w:color w:val="4472C4" w:themeColor="accent1"/>
           <w:sz w:val="22"/>
           <w:szCs w:val="22"/>
         </w:rPr>

</xml_diff>